<commit_message>
atualiza;áo de guia para pessoas transgeneros
</commit_message>
<xml_diff>
--- a/Guia Completo.docx
+++ b/Guia Completo.docx
@@ -1078,12 +1078,2989 @@
     </w:p>
     <w:p>
       <w:pPr>
-        <w:rPr>
+        <w:spacing w:after="200" w:line="276" w:lineRule="auto"/>
+        <w:rPr>
+          <w:rFonts w:eastAsiaTheme="minorEastAsia" w:cs="Times New Roman"/>
+          <w:lang w:val="pt-BR"/>
+        </w:rPr>
+      </w:pPr>
+    </w:p>
+    <w:p>
+      <w:pPr>
+        <w:pStyle w:val="Ttulo1"/>
+        <w:rPr>
+          <w:rFonts w:asciiTheme="majorHAnsi" w:eastAsia="Arial" w:hAnsiTheme="majorHAnsi" w:cstheme="majorHAnsi"/>
+          <w:b w:val="0"/>
+          <w:sz w:val="22"/>
+          <w:szCs w:val="22"/>
+          <w:lang w:val="pt-BR"/>
+        </w:rPr>
+      </w:pPr>
+      <w:r>
+        <w:rPr>
+          <w:rFonts w:asciiTheme="majorHAnsi" w:eastAsia="Arial" w:hAnsiTheme="majorHAnsi" w:cstheme="majorHAnsi"/>
+          <w:b w:val="0"/>
+          <w:sz w:val="22"/>
+          <w:szCs w:val="22"/>
+          <w:lang w:val="pt-BR"/>
+        </w:rPr>
+        <w:t>Identidade de Gênero e Direitos Fundamentais</w:t>
+      </w:r>
+    </w:p>
+    <w:p>
+      <w:pPr>
+        <w:pStyle w:val="Ttulo2"/>
+        <w:rPr>
+          <w:rFonts w:asciiTheme="majorHAnsi" w:eastAsia="Arial" w:hAnsiTheme="majorHAnsi" w:cstheme="majorHAnsi"/>
+          <w:b w:val="0"/>
+          <w:sz w:val="22"/>
+          <w:szCs w:val="22"/>
+          <w:lang w:val="pt-BR"/>
+        </w:rPr>
+      </w:pPr>
+      <w:r>
+        <w:rPr>
+          <w:rFonts w:asciiTheme="majorHAnsi" w:eastAsia="Arial" w:hAnsiTheme="majorHAnsi" w:cstheme="majorHAnsi"/>
+          <w:b w:val="0"/>
+          <w:sz w:val="22"/>
+          <w:szCs w:val="22"/>
+          <w:lang w:val="pt-BR"/>
+        </w:rPr>
+        <w:t xml:space="preserve">Quem são mulheres </w:t>
+      </w:r>
+      <w:proofErr w:type="spellStart"/>
+      <w:r>
+        <w:rPr>
+          <w:rFonts w:asciiTheme="majorHAnsi" w:eastAsia="Arial" w:hAnsiTheme="majorHAnsi" w:cstheme="majorHAnsi"/>
+          <w:b w:val="0"/>
+          <w:sz w:val="22"/>
+          <w:szCs w:val="22"/>
+          <w:lang w:val="pt-BR"/>
+        </w:rPr>
+        <w:t>trans</w:t>
+      </w:r>
+      <w:proofErr w:type="spellEnd"/>
+      <w:r>
+        <w:rPr>
+          <w:rFonts w:asciiTheme="majorHAnsi" w:eastAsia="Arial" w:hAnsiTheme="majorHAnsi" w:cstheme="majorHAnsi"/>
+          <w:b w:val="0"/>
+          <w:sz w:val="22"/>
+          <w:szCs w:val="22"/>
+          <w:lang w:val="pt-BR"/>
+        </w:rPr>
+        <w:t xml:space="preserve"> e travestis</w:t>
+      </w:r>
+    </w:p>
+    <w:p>
+      <w:pPr>
+        <w:spacing w:after="120"/>
+        <w:rPr>
+          <w:rFonts w:asciiTheme="majorHAnsi" w:eastAsia="Arial" w:hAnsiTheme="majorHAnsi" w:cstheme="majorHAnsi"/>
+          <w:lang w:val="pt-BR"/>
+        </w:rPr>
+      </w:pPr>
+      <w:r>
+        <w:rPr>
+          <w:rFonts w:asciiTheme="majorHAnsi" w:hAnsiTheme="majorHAnsi" w:cstheme="majorHAnsi"/>
+          <w:lang w:val="pt-BR"/>
+        </w:rPr>
+        <w:t xml:space="preserve">Mulher </w:t>
+      </w:r>
+      <w:proofErr w:type="spellStart"/>
+      <w:r>
+        <w:rPr>
+          <w:rFonts w:asciiTheme="majorHAnsi" w:hAnsiTheme="majorHAnsi" w:cstheme="majorHAnsi"/>
+          <w:lang w:val="pt-BR"/>
+        </w:rPr>
+        <w:t>trans</w:t>
+      </w:r>
+      <w:proofErr w:type="spellEnd"/>
+      <w:r>
+        <w:rPr>
+          <w:rFonts w:asciiTheme="majorHAnsi" w:hAnsiTheme="majorHAnsi" w:cstheme="majorHAnsi"/>
+          <w:lang w:val="pt-BR"/>
+        </w:rPr>
+        <w:t xml:space="preserve"> é toda pessoa que foi designada masculino ao </w:t>
+      </w:r>
+      <w:proofErr w:type="gramStart"/>
+      <w:r>
+        <w:rPr>
+          <w:rFonts w:asciiTheme="majorHAnsi" w:hAnsiTheme="majorHAnsi" w:cstheme="majorHAnsi"/>
+          <w:lang w:val="pt-BR"/>
+        </w:rPr>
+        <w:t>nascer</w:t>
+      </w:r>
+      <w:proofErr w:type="gramEnd"/>
+      <w:r>
+        <w:rPr>
+          <w:rFonts w:asciiTheme="majorHAnsi" w:hAnsiTheme="majorHAnsi" w:cstheme="majorHAnsi"/>
+          <w:lang w:val="pt-BR"/>
+        </w:rPr>
+        <w:t xml:space="preserve"> mas se identifica com o gênero feminino. Travesti é uma identidade própria, reconhecida juridicamente, com plenos direitos. O uso do nome social e o respeito à identidade de gênero são direitos garantidos, não privilégios.</w:t>
+      </w:r>
+    </w:p>
+    <w:p>
+      <w:pPr>
+        <w:pStyle w:val="Ttulo2"/>
+        <w:rPr>
+          <w:rFonts w:asciiTheme="majorHAnsi" w:eastAsia="Arial" w:hAnsiTheme="majorHAnsi" w:cstheme="majorHAnsi"/>
+          <w:b w:val="0"/>
+          <w:sz w:val="22"/>
+          <w:szCs w:val="22"/>
+          <w:lang w:val="pt-BR"/>
+        </w:rPr>
+      </w:pPr>
+      <w:r>
+        <w:rPr>
+          <w:rFonts w:asciiTheme="majorHAnsi" w:eastAsia="Arial" w:hAnsiTheme="majorHAnsi" w:cstheme="majorHAnsi"/>
+          <w:b w:val="0"/>
+          <w:sz w:val="22"/>
+          <w:szCs w:val="22"/>
+          <w:lang w:val="pt-BR"/>
+        </w:rPr>
+        <w:t>Nome Social</w:t>
+      </w:r>
+    </w:p>
+    <w:p>
+      <w:pPr>
+        <w:spacing w:after="120"/>
+        <w:rPr>
+          <w:rFonts w:asciiTheme="majorHAnsi" w:eastAsia="Arial" w:hAnsiTheme="majorHAnsi" w:cstheme="majorHAnsi"/>
+          <w:lang w:val="pt-BR"/>
+        </w:rPr>
+      </w:pPr>
+      <w:r>
+        <w:rPr>
+          <w:rFonts w:asciiTheme="majorHAnsi" w:hAnsiTheme="majorHAnsi" w:cstheme="majorHAnsi"/>
+          <w:lang w:val="pt-BR"/>
+        </w:rPr>
+        <w:lastRenderedPageBreak/>
+        <w:t>O Decreto Federal 8.727/2016 garante o direito ao uso do nome social em todos os órgãos públicos federais. Isso inclui atendimentos na Defensoria Pública, hospitais do SUS, escolas públicas, INSS e demais serviços do governo.</w:t>
+      </w:r>
+    </w:p>
+    <w:p>
+      <w:pPr>
+        <w:spacing w:after="120"/>
+        <w:rPr>
+          <w:rFonts w:asciiTheme="majorHAnsi" w:hAnsiTheme="majorHAnsi" w:cstheme="majorHAnsi"/>
+          <w:lang w:val="pt-BR"/>
+        </w:rPr>
+      </w:pPr>
+      <w:r>
+        <w:rPr>
+          <w:rFonts w:asciiTheme="majorHAnsi" w:hAnsiTheme="majorHAnsi" w:cstheme="majorHAnsi"/>
+          <w:lang w:val="pt-BR"/>
+        </w:rPr>
+        <w:t xml:space="preserve">Chamar uma mulher </w:t>
+      </w:r>
+      <w:proofErr w:type="spellStart"/>
+      <w:r>
+        <w:rPr>
+          <w:rFonts w:asciiTheme="majorHAnsi" w:hAnsiTheme="majorHAnsi" w:cstheme="majorHAnsi"/>
+          <w:lang w:val="pt-BR"/>
+        </w:rPr>
+        <w:t>trans</w:t>
+      </w:r>
+      <w:proofErr w:type="spellEnd"/>
+      <w:r>
+        <w:rPr>
+          <w:rFonts w:asciiTheme="majorHAnsi" w:hAnsiTheme="majorHAnsi" w:cstheme="majorHAnsi"/>
+          <w:lang w:val="pt-BR"/>
+        </w:rPr>
+        <w:t xml:space="preserve"> pelo nome de registro masculino de forma deliberada, especialmente para humilhá-la, é uma forma de violência psicológica e pode configurar crime de </w:t>
+      </w:r>
+      <w:proofErr w:type="spellStart"/>
+      <w:r>
+        <w:rPr>
+          <w:rFonts w:asciiTheme="majorHAnsi" w:hAnsiTheme="majorHAnsi" w:cstheme="majorHAnsi"/>
+          <w:lang w:val="pt-BR"/>
+        </w:rPr>
+        <w:t>LGBTfobia</w:t>
+      </w:r>
+      <w:proofErr w:type="spellEnd"/>
+      <w:r>
+        <w:rPr>
+          <w:rFonts w:asciiTheme="majorHAnsi" w:hAnsiTheme="majorHAnsi" w:cstheme="majorHAnsi"/>
+          <w:lang w:val="pt-BR"/>
+        </w:rPr>
+        <w:t>.</w:t>
+      </w:r>
+    </w:p>
+    <w:p>
+      <w:pPr>
+        <w:spacing w:after="80"/>
+        <w:rPr>
+          <w:rFonts w:asciiTheme="majorHAnsi" w:hAnsiTheme="majorHAnsi" w:cstheme="majorHAnsi"/>
+          <w:lang w:val="pt-BR"/>
+        </w:rPr>
+      </w:pPr>
+      <w:r>
+        <w:rPr>
+          <w:rFonts w:asciiTheme="majorHAnsi" w:hAnsiTheme="majorHAnsi" w:cstheme="majorHAnsi"/>
+          <w:lang w:val="pt-BR"/>
+        </w:rPr>
+        <w:t xml:space="preserve">A mulher </w:t>
+      </w:r>
+      <w:proofErr w:type="spellStart"/>
+      <w:r>
+        <w:rPr>
+          <w:rFonts w:asciiTheme="majorHAnsi" w:hAnsiTheme="majorHAnsi" w:cstheme="majorHAnsi"/>
+          <w:lang w:val="pt-BR"/>
+        </w:rPr>
+        <w:t>trans</w:t>
+      </w:r>
+      <w:proofErr w:type="spellEnd"/>
+      <w:r>
+        <w:rPr>
+          <w:rFonts w:asciiTheme="majorHAnsi" w:hAnsiTheme="majorHAnsi" w:cstheme="majorHAnsi"/>
+          <w:lang w:val="pt-BR"/>
+        </w:rPr>
+        <w:t xml:space="preserve"> pode exigir ser chamada pelo nome social em qualquer atendimento público.</w:t>
+      </w:r>
+    </w:p>
+    <w:p>
+      <w:pPr>
+        <w:spacing w:after="80"/>
+        <w:rPr>
+          <w:rFonts w:asciiTheme="majorHAnsi" w:hAnsiTheme="majorHAnsi" w:cstheme="majorHAnsi"/>
+          <w:lang w:val="pt-BR"/>
+        </w:rPr>
+      </w:pPr>
+      <w:r>
+        <w:rPr>
+          <w:rFonts w:asciiTheme="majorHAnsi" w:hAnsiTheme="majorHAnsi" w:cstheme="majorHAnsi"/>
+          <w:lang w:val="pt-BR"/>
+        </w:rPr>
+        <w:t>Servidores que se recusarem podem ser responsabilizados administrativamente.</w:t>
+      </w:r>
+    </w:p>
+    <w:p>
+      <w:pPr>
+        <w:spacing w:after="80"/>
+        <w:rPr>
+          <w:rFonts w:asciiTheme="majorHAnsi" w:hAnsiTheme="majorHAnsi" w:cstheme="majorHAnsi"/>
           <w:lang w:val="pt-BR"/>
         </w:rPr>
       </w:pPr>
       <w:bookmarkStart w:id="0" w:name="_GoBack"/>
       <w:bookmarkEnd w:id="0"/>
+      <w:r>
+        <w:rPr>
+          <w:rFonts w:asciiTheme="majorHAnsi" w:hAnsiTheme="majorHAnsi" w:cstheme="majorHAnsi"/>
+          <w:lang w:val="pt-BR"/>
+        </w:rPr>
+        <w:t>A Defensoria Pública pode acionar o órgão para garantir esse direito.</w:t>
+      </w:r>
+    </w:p>
+    <w:p>
+      <w:pPr>
+        <w:pStyle w:val="Ttulo2"/>
+        <w:rPr>
+          <w:rFonts w:asciiTheme="majorHAnsi" w:eastAsia="Arial" w:hAnsiTheme="majorHAnsi" w:cstheme="majorHAnsi"/>
+          <w:b w:val="0"/>
+          <w:sz w:val="22"/>
+          <w:szCs w:val="22"/>
+          <w:lang w:val="pt-BR"/>
+        </w:rPr>
+      </w:pPr>
+      <w:r>
+        <w:rPr>
+          <w:rFonts w:asciiTheme="majorHAnsi" w:eastAsia="Arial" w:hAnsiTheme="majorHAnsi" w:cstheme="majorHAnsi"/>
+          <w:b w:val="0"/>
+          <w:sz w:val="22"/>
+          <w:szCs w:val="22"/>
+          <w:lang w:val="pt-BR"/>
+        </w:rPr>
+        <w:t>Retificação de Registro Civil</w:t>
+      </w:r>
+    </w:p>
+    <w:p>
+      <w:pPr>
+        <w:spacing w:after="120"/>
+        <w:rPr>
+          <w:rFonts w:asciiTheme="majorHAnsi" w:eastAsia="Arial" w:hAnsiTheme="majorHAnsi" w:cstheme="majorHAnsi"/>
+          <w:lang w:val="pt-BR"/>
+        </w:rPr>
+      </w:pPr>
+      <w:r>
+        <w:rPr>
+          <w:rFonts w:asciiTheme="majorHAnsi" w:hAnsiTheme="majorHAnsi" w:cstheme="majorHAnsi"/>
+          <w:lang w:val="pt-BR"/>
+        </w:rPr>
+        <w:t xml:space="preserve">Desde 2018, o Provimento 73 do CNJ permite a alteração do nome e gênero no registro civil diretamente em cartório, sem necessidade de cirurgia ou laudo médico. É um direito de qualquer pessoa </w:t>
+      </w:r>
+      <w:proofErr w:type="spellStart"/>
+      <w:r>
+        <w:rPr>
+          <w:rFonts w:asciiTheme="majorHAnsi" w:hAnsiTheme="majorHAnsi" w:cstheme="majorHAnsi"/>
+          <w:lang w:val="pt-BR"/>
+        </w:rPr>
+        <w:t>trans</w:t>
+      </w:r>
+      <w:proofErr w:type="spellEnd"/>
+      <w:r>
+        <w:rPr>
+          <w:rFonts w:asciiTheme="majorHAnsi" w:hAnsiTheme="majorHAnsi" w:cstheme="majorHAnsi"/>
+          <w:lang w:val="pt-BR"/>
+        </w:rPr>
+        <w:t xml:space="preserve"> maior de 18 anos (ou menor com assistência dos responsáveis).</w:t>
+      </w:r>
+    </w:p>
+    <w:p>
+      <w:pPr>
+        <w:spacing w:after="80"/>
+        <w:rPr>
+          <w:rFonts w:asciiTheme="majorHAnsi" w:hAnsiTheme="majorHAnsi" w:cstheme="majorHAnsi"/>
+          <w:lang w:val="pt-BR"/>
+        </w:rPr>
+      </w:pPr>
+      <w:r>
+        <w:rPr>
+          <w:rFonts w:asciiTheme="majorHAnsi" w:hAnsiTheme="majorHAnsi" w:cstheme="majorHAnsi"/>
+          <w:lang w:val="pt-BR"/>
+        </w:rPr>
+        <w:t>Basta comparecer a um cartório de Registro Civil com RG e CPF.</w:t>
+      </w:r>
+    </w:p>
+    <w:p>
+      <w:pPr>
+        <w:spacing w:after="80"/>
+        <w:rPr>
+          <w:rFonts w:asciiTheme="majorHAnsi" w:hAnsiTheme="majorHAnsi" w:cstheme="majorHAnsi"/>
+          <w:lang w:val="pt-BR"/>
+        </w:rPr>
+      </w:pPr>
+      <w:r>
+        <w:rPr>
+          <w:rFonts w:asciiTheme="majorHAnsi" w:hAnsiTheme="majorHAnsi" w:cstheme="majorHAnsi"/>
+          <w:lang w:val="pt-BR"/>
+        </w:rPr>
+        <w:t>O procedimento é gratuito para pessoas de baixa renda.</w:t>
+      </w:r>
+    </w:p>
+    <w:p>
+      <w:pPr>
+        <w:spacing w:after="80"/>
+        <w:rPr>
+          <w:rFonts w:asciiTheme="majorHAnsi" w:hAnsiTheme="majorHAnsi" w:cstheme="majorHAnsi"/>
+          <w:lang w:val="pt-BR"/>
+        </w:rPr>
+      </w:pPr>
+      <w:r>
+        <w:rPr>
+          <w:rFonts w:asciiTheme="majorHAnsi" w:hAnsiTheme="majorHAnsi" w:cstheme="majorHAnsi"/>
+          <w:lang w:val="pt-BR"/>
+        </w:rPr>
+        <w:t>A Defensoria pode auxiliar caso o cartório se recuse a realizar o procedimento.</w:t>
+      </w:r>
+    </w:p>
+    <w:p>
+      <w:pPr>
+        <w:spacing w:after="80"/>
+        <w:rPr>
+          <w:rFonts w:asciiTheme="majorHAnsi" w:hAnsiTheme="majorHAnsi" w:cstheme="majorHAnsi"/>
+          <w:lang w:val="pt-BR"/>
+        </w:rPr>
+      </w:pPr>
+      <w:r>
+        <w:rPr>
+          <w:rFonts w:asciiTheme="majorHAnsi" w:hAnsiTheme="majorHAnsi" w:cstheme="majorHAnsi"/>
+          <w:lang w:val="pt-BR"/>
+        </w:rPr>
+        <w:t>Após a retificação, o nome antigo não aparece nos documentos públicos.</w:t>
+      </w:r>
+    </w:p>
+    <w:p>
+      <w:pPr>
+        <w:pStyle w:val="Ttulo1"/>
+        <w:rPr>
+          <w:rFonts w:asciiTheme="majorHAnsi" w:eastAsia="Arial" w:hAnsiTheme="majorHAnsi" w:cstheme="majorHAnsi"/>
+          <w:b w:val="0"/>
+          <w:sz w:val="22"/>
+          <w:szCs w:val="22"/>
+          <w:lang w:val="pt-BR"/>
+        </w:rPr>
+      </w:pPr>
+      <w:r>
+        <w:rPr>
+          <w:rFonts w:asciiTheme="majorHAnsi" w:eastAsia="Arial" w:hAnsiTheme="majorHAnsi" w:cstheme="majorHAnsi"/>
+          <w:b w:val="0"/>
+          <w:sz w:val="22"/>
+          <w:szCs w:val="22"/>
+          <w:lang w:val="pt-BR"/>
+        </w:rPr>
+        <w:t xml:space="preserve"> Violência Doméstica contra Mulheres </w:t>
+      </w:r>
+      <w:proofErr w:type="spellStart"/>
+      <w:r>
+        <w:rPr>
+          <w:rFonts w:asciiTheme="majorHAnsi" w:eastAsia="Arial" w:hAnsiTheme="majorHAnsi" w:cstheme="majorHAnsi"/>
+          <w:b w:val="0"/>
+          <w:sz w:val="22"/>
+          <w:szCs w:val="22"/>
+          <w:lang w:val="pt-BR"/>
+        </w:rPr>
+        <w:t>Trans</w:t>
+      </w:r>
+      <w:proofErr w:type="spellEnd"/>
+    </w:p>
+    <w:p>
+      <w:pPr>
+        <w:pStyle w:val="Ttulo2"/>
+        <w:rPr>
+          <w:rFonts w:asciiTheme="majorHAnsi" w:eastAsia="Arial" w:hAnsiTheme="majorHAnsi" w:cstheme="majorHAnsi"/>
+          <w:b w:val="0"/>
+          <w:sz w:val="22"/>
+          <w:szCs w:val="22"/>
+          <w:lang w:val="pt-BR"/>
+        </w:rPr>
+      </w:pPr>
+      <w:r>
+        <w:rPr>
+          <w:rFonts w:asciiTheme="majorHAnsi" w:eastAsia="Arial" w:hAnsiTheme="majorHAnsi" w:cstheme="majorHAnsi"/>
+          <w:b w:val="0"/>
+          <w:sz w:val="22"/>
+          <w:szCs w:val="22"/>
+          <w:lang w:val="pt-BR"/>
+        </w:rPr>
+        <w:t xml:space="preserve"> A Lei Maria da Penha protege mulheres </w:t>
+      </w:r>
+      <w:proofErr w:type="spellStart"/>
+      <w:r>
+        <w:rPr>
+          <w:rFonts w:asciiTheme="majorHAnsi" w:eastAsia="Arial" w:hAnsiTheme="majorHAnsi" w:cstheme="majorHAnsi"/>
+          <w:b w:val="0"/>
+          <w:sz w:val="22"/>
+          <w:szCs w:val="22"/>
+          <w:lang w:val="pt-BR"/>
+        </w:rPr>
+        <w:t>trans</w:t>
+      </w:r>
+      <w:proofErr w:type="spellEnd"/>
+    </w:p>
+    <w:p>
+      <w:pPr>
+        <w:spacing w:after="120"/>
+        <w:rPr>
+          <w:rFonts w:asciiTheme="majorHAnsi" w:eastAsia="Arial" w:hAnsiTheme="majorHAnsi" w:cstheme="majorHAnsi"/>
+          <w:lang w:val="pt-BR"/>
+        </w:rPr>
+      </w:pPr>
+      <w:r>
+        <w:rPr>
+          <w:rFonts w:asciiTheme="majorHAnsi" w:hAnsiTheme="majorHAnsi" w:cstheme="majorHAnsi"/>
+          <w:lang w:val="pt-BR"/>
+        </w:rPr>
+        <w:t xml:space="preserve">O Superior Tribunal de Justiça (STJ) consolidou em 2022 o entendimento de que a Lei Maria da Penha (Lei 11.340/2006) se aplica às mulheres </w:t>
+      </w:r>
+      <w:proofErr w:type="spellStart"/>
+      <w:r>
+        <w:rPr>
+          <w:rFonts w:asciiTheme="majorHAnsi" w:hAnsiTheme="majorHAnsi" w:cstheme="majorHAnsi"/>
+          <w:lang w:val="pt-BR"/>
+        </w:rPr>
+        <w:t>trans</w:t>
+      </w:r>
+      <w:proofErr w:type="spellEnd"/>
+      <w:r>
+        <w:rPr>
+          <w:rFonts w:asciiTheme="majorHAnsi" w:hAnsiTheme="majorHAnsi" w:cstheme="majorHAnsi"/>
+          <w:lang w:val="pt-BR"/>
+        </w:rPr>
+        <w:t xml:space="preserve"> e travestis em situação de violência doméstica e familiar. O critério é a identidade de gênero feminina, não o gênero biológico.</w:t>
+      </w:r>
+    </w:p>
+    <w:p>
+      <w:pPr>
+        <w:spacing w:after="120"/>
+        <w:rPr>
+          <w:rFonts w:asciiTheme="majorHAnsi" w:hAnsiTheme="majorHAnsi" w:cstheme="majorHAnsi"/>
+          <w:lang w:val="pt-BR"/>
+        </w:rPr>
+      </w:pPr>
+      <w:r>
+        <w:rPr>
+          <w:rFonts w:asciiTheme="majorHAnsi" w:hAnsiTheme="majorHAnsi" w:cstheme="majorHAnsi"/>
+          <w:lang w:val="pt-BR"/>
+        </w:rPr>
+        <w:t xml:space="preserve">Isso significa que todas as medidas protetivas, o processo judicial especial e os direitos da vítima previstos na Lei Maria da Penha são aplicáveis quando a vítima é uma mulher </w:t>
+      </w:r>
+      <w:proofErr w:type="spellStart"/>
+      <w:r>
+        <w:rPr>
+          <w:rFonts w:asciiTheme="majorHAnsi" w:hAnsiTheme="majorHAnsi" w:cstheme="majorHAnsi"/>
+          <w:lang w:val="pt-BR"/>
+        </w:rPr>
+        <w:t>trans</w:t>
+      </w:r>
+      <w:proofErr w:type="spellEnd"/>
+      <w:r>
+        <w:rPr>
+          <w:rFonts w:asciiTheme="majorHAnsi" w:hAnsiTheme="majorHAnsi" w:cstheme="majorHAnsi"/>
+          <w:lang w:val="pt-BR"/>
+        </w:rPr>
+        <w:t xml:space="preserve"> ou travesti.</w:t>
+      </w:r>
+    </w:p>
+    <w:p>
+      <w:pPr>
+        <w:pStyle w:val="Ttulo2"/>
+        <w:rPr>
+          <w:rFonts w:asciiTheme="majorHAnsi" w:eastAsia="Arial" w:hAnsiTheme="majorHAnsi" w:cstheme="majorHAnsi"/>
+          <w:b w:val="0"/>
+          <w:sz w:val="22"/>
+          <w:szCs w:val="22"/>
+          <w:lang w:val="pt-BR"/>
+        </w:rPr>
+      </w:pPr>
+      <w:r>
+        <w:rPr>
+          <w:rFonts w:asciiTheme="majorHAnsi" w:eastAsia="Arial" w:hAnsiTheme="majorHAnsi" w:cstheme="majorHAnsi"/>
+          <w:b w:val="0"/>
+          <w:sz w:val="22"/>
+          <w:szCs w:val="22"/>
+          <w:lang w:val="pt-BR"/>
+        </w:rPr>
+        <w:t xml:space="preserve"> O que é violência doméstica </w:t>
+      </w:r>
+      <w:proofErr w:type="spellStart"/>
+      <w:r>
+        <w:rPr>
+          <w:rFonts w:asciiTheme="majorHAnsi" w:eastAsia="Arial" w:hAnsiTheme="majorHAnsi" w:cstheme="majorHAnsi"/>
+          <w:b w:val="0"/>
+          <w:sz w:val="22"/>
+          <w:szCs w:val="22"/>
+          <w:lang w:val="pt-BR"/>
+        </w:rPr>
+        <w:t>transfobóbica</w:t>
+      </w:r>
+      <w:proofErr w:type="spellEnd"/>
+    </w:p>
+    <w:p>
+      <w:pPr>
+        <w:spacing w:after="120"/>
+        <w:rPr>
+          <w:rFonts w:asciiTheme="majorHAnsi" w:eastAsia="Arial" w:hAnsiTheme="majorHAnsi" w:cstheme="majorHAnsi"/>
+        </w:rPr>
+      </w:pPr>
+      <w:r>
+        <w:rPr>
+          <w:rFonts w:asciiTheme="majorHAnsi" w:hAnsiTheme="majorHAnsi" w:cstheme="majorHAnsi"/>
+          <w:lang w:val="pt-BR"/>
+        </w:rPr>
+        <w:t xml:space="preserve">A violência doméstica contra mulheres </w:t>
+      </w:r>
+      <w:proofErr w:type="spellStart"/>
+      <w:r>
+        <w:rPr>
+          <w:rFonts w:asciiTheme="majorHAnsi" w:hAnsiTheme="majorHAnsi" w:cstheme="majorHAnsi"/>
+          <w:lang w:val="pt-BR"/>
+        </w:rPr>
+        <w:t>trans</w:t>
+      </w:r>
+      <w:proofErr w:type="spellEnd"/>
+      <w:r>
+        <w:rPr>
+          <w:rFonts w:asciiTheme="majorHAnsi" w:hAnsiTheme="majorHAnsi" w:cstheme="majorHAnsi"/>
+          <w:lang w:val="pt-BR"/>
+        </w:rPr>
+        <w:t xml:space="preserve"> muitas vezes combina as formas previstas na Lei Maria da Penha com o componente de transfobia. </w:t>
+      </w:r>
+      <w:proofErr w:type="spellStart"/>
+      <w:r>
+        <w:rPr>
+          <w:rFonts w:asciiTheme="majorHAnsi" w:hAnsiTheme="majorHAnsi" w:cstheme="majorHAnsi"/>
+        </w:rPr>
+        <w:t>Exemplos</w:t>
+      </w:r>
+      <w:proofErr w:type="spellEnd"/>
+      <w:r>
+        <w:rPr>
+          <w:rFonts w:asciiTheme="majorHAnsi" w:hAnsiTheme="majorHAnsi" w:cstheme="majorHAnsi"/>
+        </w:rPr>
+        <w:t>:</w:t>
+      </w:r>
+    </w:p>
+    <w:p>
+      <w:pPr>
+        <w:spacing w:after="80"/>
+        <w:rPr>
+          <w:rFonts w:asciiTheme="majorHAnsi" w:hAnsiTheme="majorHAnsi" w:cstheme="majorHAnsi"/>
+          <w:lang w:val="pt-BR"/>
+        </w:rPr>
+      </w:pPr>
+      <w:r>
+        <w:rPr>
+          <w:rFonts w:asciiTheme="majorHAnsi" w:hAnsiTheme="majorHAnsi" w:cstheme="majorHAnsi"/>
+          <w:lang w:val="pt-BR"/>
+        </w:rPr>
+        <w:t xml:space="preserve">Humilhação baseada na identidade </w:t>
+      </w:r>
+      <w:proofErr w:type="spellStart"/>
+      <w:r>
+        <w:rPr>
+          <w:rFonts w:asciiTheme="majorHAnsi" w:hAnsiTheme="majorHAnsi" w:cstheme="majorHAnsi"/>
+          <w:lang w:val="pt-BR"/>
+        </w:rPr>
+        <w:t>trans</w:t>
+      </w:r>
+      <w:proofErr w:type="spellEnd"/>
+      <w:r>
+        <w:rPr>
+          <w:rFonts w:asciiTheme="majorHAnsi" w:hAnsiTheme="majorHAnsi" w:cstheme="majorHAnsi"/>
+          <w:lang w:val="pt-BR"/>
+        </w:rPr>
+        <w:t>: 'você nunca vai ser uma mulher de verdade', 'nenhum homem de verdade ficaria com você'.</w:t>
+      </w:r>
+    </w:p>
+    <w:p>
+      <w:pPr>
+        <w:spacing w:after="80"/>
+        <w:rPr>
+          <w:rFonts w:asciiTheme="majorHAnsi" w:hAnsiTheme="majorHAnsi" w:cstheme="majorHAnsi"/>
+          <w:lang w:val="pt-BR"/>
+        </w:rPr>
+      </w:pPr>
+      <w:r>
+        <w:rPr>
+          <w:rFonts w:asciiTheme="majorHAnsi" w:hAnsiTheme="majorHAnsi" w:cstheme="majorHAnsi"/>
+          <w:lang w:val="pt-BR"/>
+        </w:rPr>
+        <w:t>Forçar o uso do nome de registro masculino como forma de dominação e humilhação.</w:t>
+      </w:r>
+    </w:p>
+    <w:p>
+      <w:pPr>
+        <w:spacing w:after="80"/>
+        <w:rPr>
+          <w:rFonts w:asciiTheme="majorHAnsi" w:hAnsiTheme="majorHAnsi" w:cstheme="majorHAnsi"/>
+          <w:lang w:val="pt-BR"/>
+        </w:rPr>
+      </w:pPr>
+      <w:r>
+        <w:rPr>
+          <w:rFonts w:asciiTheme="majorHAnsi" w:hAnsiTheme="majorHAnsi" w:cstheme="majorHAnsi"/>
+          <w:lang w:val="pt-BR"/>
+        </w:rPr>
+        <w:t xml:space="preserve">Ameaças de expor a identidade </w:t>
+      </w:r>
+      <w:proofErr w:type="spellStart"/>
+      <w:r>
+        <w:rPr>
+          <w:rFonts w:asciiTheme="majorHAnsi" w:hAnsiTheme="majorHAnsi" w:cstheme="majorHAnsi"/>
+          <w:lang w:val="pt-BR"/>
+        </w:rPr>
+        <w:t>trans</w:t>
+      </w:r>
+      <w:proofErr w:type="spellEnd"/>
+      <w:r>
+        <w:rPr>
+          <w:rFonts w:asciiTheme="majorHAnsi" w:hAnsiTheme="majorHAnsi" w:cstheme="majorHAnsi"/>
+          <w:lang w:val="pt-BR"/>
+        </w:rPr>
+        <w:t xml:space="preserve"> para familiares, empregadores ou comunidade (</w:t>
+      </w:r>
+      <w:proofErr w:type="spellStart"/>
+      <w:r>
+        <w:rPr>
+          <w:rFonts w:asciiTheme="majorHAnsi" w:hAnsiTheme="majorHAnsi" w:cstheme="majorHAnsi"/>
+          <w:lang w:val="pt-BR"/>
+        </w:rPr>
+        <w:t>outing</w:t>
+      </w:r>
+      <w:proofErr w:type="spellEnd"/>
+      <w:r>
+        <w:rPr>
+          <w:rFonts w:asciiTheme="majorHAnsi" w:hAnsiTheme="majorHAnsi" w:cstheme="majorHAnsi"/>
+          <w:lang w:val="pt-BR"/>
+        </w:rPr>
+        <w:t xml:space="preserve"> forçado).</w:t>
+      </w:r>
+    </w:p>
+    <w:p>
+      <w:pPr>
+        <w:spacing w:after="80"/>
+        <w:rPr>
+          <w:rFonts w:asciiTheme="majorHAnsi" w:hAnsiTheme="majorHAnsi" w:cstheme="majorHAnsi"/>
+          <w:lang w:val="pt-BR"/>
+        </w:rPr>
+      </w:pPr>
+      <w:r>
+        <w:rPr>
+          <w:rFonts w:asciiTheme="majorHAnsi" w:hAnsiTheme="majorHAnsi" w:cstheme="majorHAnsi"/>
+          <w:lang w:val="pt-BR"/>
+        </w:rPr>
+        <w:t>Controle do acesso a medicação hormonal como forma de ameaça ou punição.</w:t>
+      </w:r>
+    </w:p>
+    <w:p>
+      <w:pPr>
+        <w:spacing w:after="80"/>
+        <w:rPr>
+          <w:rFonts w:asciiTheme="majorHAnsi" w:hAnsiTheme="majorHAnsi" w:cstheme="majorHAnsi"/>
+          <w:lang w:val="pt-BR"/>
+        </w:rPr>
+      </w:pPr>
+      <w:r>
+        <w:rPr>
+          <w:rFonts w:asciiTheme="majorHAnsi" w:hAnsiTheme="majorHAnsi" w:cstheme="majorHAnsi"/>
+          <w:lang w:val="pt-BR"/>
+        </w:rPr>
+        <w:t xml:space="preserve">Violência física com motivação </w:t>
+      </w:r>
+      <w:proofErr w:type="spellStart"/>
+      <w:r>
+        <w:rPr>
+          <w:rFonts w:asciiTheme="majorHAnsi" w:hAnsiTheme="majorHAnsi" w:cstheme="majorHAnsi"/>
+          <w:lang w:val="pt-BR"/>
+        </w:rPr>
+        <w:t>transfobíca</w:t>
+      </w:r>
+      <w:proofErr w:type="spellEnd"/>
+      <w:r>
+        <w:rPr>
+          <w:rFonts w:asciiTheme="majorHAnsi" w:hAnsiTheme="majorHAnsi" w:cstheme="majorHAnsi"/>
+          <w:lang w:val="pt-BR"/>
+        </w:rPr>
+        <w:t>.</w:t>
+      </w:r>
+    </w:p>
+    <w:p>
+      <w:pPr>
+        <w:spacing w:after="80"/>
+        <w:rPr>
+          <w:rFonts w:asciiTheme="majorHAnsi" w:hAnsiTheme="majorHAnsi" w:cstheme="majorHAnsi"/>
+          <w:lang w:val="pt-BR"/>
+        </w:rPr>
+      </w:pPr>
+      <w:r>
+        <w:rPr>
+          <w:rFonts w:asciiTheme="majorHAnsi" w:hAnsiTheme="majorHAnsi" w:cstheme="majorHAnsi"/>
+          <w:lang w:val="pt-BR"/>
+        </w:rPr>
+        <w:lastRenderedPageBreak/>
+        <w:t xml:space="preserve">Isolar a mulher </w:t>
+      </w:r>
+      <w:proofErr w:type="spellStart"/>
+      <w:r>
+        <w:rPr>
+          <w:rFonts w:asciiTheme="majorHAnsi" w:hAnsiTheme="majorHAnsi" w:cstheme="majorHAnsi"/>
+          <w:lang w:val="pt-BR"/>
+        </w:rPr>
+        <w:t>trans</w:t>
+      </w:r>
+      <w:proofErr w:type="spellEnd"/>
+      <w:r>
+        <w:rPr>
+          <w:rFonts w:asciiTheme="majorHAnsi" w:hAnsiTheme="majorHAnsi" w:cstheme="majorHAnsi"/>
+          <w:lang w:val="pt-BR"/>
+        </w:rPr>
+        <w:t xml:space="preserve"> de sua rede de apoio LGBTQIA+.</w:t>
+      </w:r>
+    </w:p>
+    <w:p>
+      <w:pPr>
+        <w:pStyle w:val="Ttulo2"/>
+        <w:rPr>
+          <w:rFonts w:asciiTheme="majorHAnsi" w:eastAsia="Arial" w:hAnsiTheme="majorHAnsi" w:cstheme="majorHAnsi"/>
+          <w:b w:val="0"/>
+          <w:sz w:val="22"/>
+          <w:szCs w:val="22"/>
+          <w:lang w:val="pt-BR"/>
+        </w:rPr>
+      </w:pPr>
+      <w:r>
+        <w:rPr>
+          <w:rFonts w:asciiTheme="majorHAnsi" w:eastAsia="Arial" w:hAnsiTheme="majorHAnsi" w:cstheme="majorHAnsi"/>
+          <w:b w:val="0"/>
+          <w:sz w:val="22"/>
+          <w:szCs w:val="22"/>
+          <w:lang w:val="pt-BR"/>
+        </w:rPr>
+        <w:t>Medidas Protetivas de Urgência</w:t>
+      </w:r>
+    </w:p>
+    <w:p>
+      <w:pPr>
+        <w:spacing w:after="120"/>
+        <w:rPr>
+          <w:rFonts w:asciiTheme="majorHAnsi" w:eastAsia="Arial" w:hAnsiTheme="majorHAnsi" w:cstheme="majorHAnsi"/>
+          <w:lang w:val="pt-BR"/>
+        </w:rPr>
+      </w:pPr>
+      <w:r>
+        <w:rPr>
+          <w:rFonts w:asciiTheme="majorHAnsi" w:hAnsiTheme="majorHAnsi" w:cstheme="majorHAnsi"/>
+          <w:lang w:val="pt-BR"/>
+        </w:rPr>
+        <w:t>As medidas protetivas da Lei Maria da Penha são aplicáveis imediatamente para mulheres trans. A mulher pode solicitar na delegacia ou diretamente à Defensoria Pública:</w:t>
+      </w:r>
+    </w:p>
+    <w:p>
+      <w:pPr>
+        <w:spacing w:after="80"/>
+        <w:rPr>
+          <w:rFonts w:asciiTheme="majorHAnsi" w:hAnsiTheme="majorHAnsi" w:cstheme="majorHAnsi"/>
+          <w:lang w:val="pt-BR"/>
+        </w:rPr>
+      </w:pPr>
+      <w:r>
+        <w:rPr>
+          <w:rFonts w:asciiTheme="majorHAnsi" w:hAnsiTheme="majorHAnsi" w:cstheme="majorHAnsi"/>
+          <w:lang w:val="pt-BR"/>
+        </w:rPr>
+        <w:t>Afastamento do agressor do lar, mesmo que seja o dono do imóvel.</w:t>
+      </w:r>
+    </w:p>
+    <w:p>
+      <w:pPr>
+        <w:spacing w:after="80"/>
+        <w:rPr>
+          <w:rFonts w:asciiTheme="majorHAnsi" w:hAnsiTheme="majorHAnsi" w:cstheme="majorHAnsi"/>
+          <w:lang w:val="pt-BR"/>
+        </w:rPr>
+      </w:pPr>
+      <w:r>
+        <w:rPr>
+          <w:rFonts w:asciiTheme="majorHAnsi" w:hAnsiTheme="majorHAnsi" w:cstheme="majorHAnsi"/>
+          <w:lang w:val="pt-BR"/>
+        </w:rPr>
+        <w:t>Proibição de contato por qualquer meio.</w:t>
+      </w:r>
+    </w:p>
+    <w:p>
+      <w:pPr>
+        <w:spacing w:after="80"/>
+        <w:rPr>
+          <w:rFonts w:asciiTheme="majorHAnsi" w:hAnsiTheme="majorHAnsi" w:cstheme="majorHAnsi"/>
+          <w:lang w:val="pt-BR"/>
+        </w:rPr>
+      </w:pPr>
+      <w:r>
+        <w:rPr>
+          <w:rFonts w:asciiTheme="majorHAnsi" w:hAnsiTheme="majorHAnsi" w:cstheme="majorHAnsi"/>
+          <w:lang w:val="pt-BR"/>
+        </w:rPr>
+        <w:t>Proibição de aproximação (distância mínima definida pelo juiz).</w:t>
+      </w:r>
+    </w:p>
+    <w:p>
+      <w:pPr>
+        <w:spacing w:after="80"/>
+        <w:rPr>
+          <w:rFonts w:asciiTheme="majorHAnsi" w:hAnsiTheme="majorHAnsi" w:cstheme="majorHAnsi"/>
+          <w:lang w:val="pt-BR"/>
+        </w:rPr>
+      </w:pPr>
+      <w:r>
+        <w:rPr>
+          <w:rFonts w:asciiTheme="majorHAnsi" w:hAnsiTheme="majorHAnsi" w:cstheme="majorHAnsi"/>
+          <w:lang w:val="pt-BR"/>
+        </w:rPr>
+        <w:t>Suspensão do porte de armas do agressor.</w:t>
+      </w:r>
+    </w:p>
+    <w:p>
+      <w:pPr>
+        <w:spacing w:after="80"/>
+        <w:rPr>
+          <w:rFonts w:asciiTheme="majorHAnsi" w:hAnsiTheme="majorHAnsi" w:cstheme="majorHAnsi"/>
+          <w:lang w:val="pt-BR"/>
+        </w:rPr>
+      </w:pPr>
+      <w:r>
+        <w:rPr>
+          <w:rFonts w:asciiTheme="majorHAnsi" w:hAnsiTheme="majorHAnsi" w:cstheme="majorHAnsi"/>
+          <w:lang w:val="pt-BR"/>
+        </w:rPr>
+        <w:t>Prestação de alimentos provisórios se houver dependência econômica.</w:t>
+      </w:r>
+    </w:p>
+    <w:p>
+      <w:pPr>
+        <w:spacing w:after="120"/>
+        <w:rPr>
+          <w:rFonts w:asciiTheme="majorHAnsi" w:hAnsiTheme="majorHAnsi" w:cstheme="majorHAnsi"/>
+          <w:lang w:val="pt-BR"/>
+        </w:rPr>
+      </w:pPr>
+      <w:r>
+        <w:rPr>
+          <w:rFonts w:asciiTheme="majorHAnsi" w:hAnsiTheme="majorHAnsi" w:cstheme="majorHAnsi"/>
+          <w:lang w:val="pt-BR"/>
+        </w:rPr>
+        <w:t>Não é necessário ter boletim de ocorrência para solicitar medidas protetivas pela Defensoria.</w:t>
+      </w:r>
+    </w:p>
+    <w:p>
+      <w:pPr>
+        <w:pStyle w:val="Ttulo1"/>
+        <w:rPr>
+          <w:rFonts w:asciiTheme="majorHAnsi" w:eastAsia="Arial" w:hAnsiTheme="majorHAnsi" w:cstheme="majorHAnsi"/>
+          <w:b w:val="0"/>
+          <w:sz w:val="22"/>
+          <w:szCs w:val="22"/>
+          <w:lang w:val="pt-BR"/>
+        </w:rPr>
+      </w:pPr>
+      <w:r>
+        <w:rPr>
+          <w:rFonts w:asciiTheme="majorHAnsi" w:eastAsia="Arial" w:hAnsiTheme="majorHAnsi" w:cstheme="majorHAnsi"/>
+          <w:b w:val="0"/>
+          <w:sz w:val="22"/>
+          <w:szCs w:val="22"/>
+          <w:lang w:val="pt-BR"/>
+        </w:rPr>
+        <w:t xml:space="preserve">Violência Psicológica </w:t>
+      </w:r>
+      <w:proofErr w:type="spellStart"/>
+      <w:r>
+        <w:rPr>
+          <w:rFonts w:asciiTheme="majorHAnsi" w:eastAsia="Arial" w:hAnsiTheme="majorHAnsi" w:cstheme="majorHAnsi"/>
+          <w:b w:val="0"/>
+          <w:sz w:val="22"/>
+          <w:szCs w:val="22"/>
+          <w:lang w:val="pt-BR"/>
+        </w:rPr>
+        <w:t>Transfobíca</w:t>
+      </w:r>
+      <w:proofErr w:type="spellEnd"/>
+    </w:p>
+    <w:p>
+      <w:pPr>
+        <w:pStyle w:val="Ttulo2"/>
+        <w:rPr>
+          <w:rFonts w:asciiTheme="majorHAnsi" w:eastAsia="Arial" w:hAnsiTheme="majorHAnsi" w:cstheme="majorHAnsi"/>
+          <w:b w:val="0"/>
+          <w:sz w:val="22"/>
+          <w:szCs w:val="22"/>
+          <w:lang w:val="pt-BR"/>
+        </w:rPr>
+      </w:pPr>
+      <w:r>
+        <w:rPr>
+          <w:rFonts w:asciiTheme="majorHAnsi" w:eastAsia="Arial" w:hAnsiTheme="majorHAnsi" w:cstheme="majorHAnsi"/>
+          <w:b w:val="0"/>
+          <w:sz w:val="22"/>
+          <w:szCs w:val="22"/>
+          <w:lang w:val="pt-BR"/>
+        </w:rPr>
+        <w:t>O que configura violência psicológica</w:t>
+      </w:r>
+    </w:p>
+    <w:p>
+      <w:pPr>
+        <w:spacing w:after="120"/>
+        <w:rPr>
+          <w:rFonts w:asciiTheme="majorHAnsi" w:eastAsia="Arial" w:hAnsiTheme="majorHAnsi" w:cstheme="majorHAnsi"/>
+          <w:lang w:val="pt-BR"/>
+        </w:rPr>
+      </w:pPr>
+      <w:r>
+        <w:rPr>
+          <w:rFonts w:asciiTheme="majorHAnsi" w:hAnsiTheme="majorHAnsi" w:cstheme="majorHAnsi"/>
+          <w:lang w:val="pt-BR"/>
+        </w:rPr>
+        <w:t xml:space="preserve">A Lei Maria da Penha define violência psicológica como qualquer conduta que cause </w:t>
+      </w:r>
+      <w:proofErr w:type="spellStart"/>
+      <w:r>
+        <w:rPr>
+          <w:rFonts w:asciiTheme="majorHAnsi" w:hAnsiTheme="majorHAnsi" w:cstheme="majorHAnsi"/>
+          <w:lang w:val="pt-BR"/>
+        </w:rPr>
+        <w:t>dano</w:t>
+      </w:r>
+      <w:proofErr w:type="spellEnd"/>
+      <w:r>
+        <w:rPr>
+          <w:rFonts w:asciiTheme="majorHAnsi" w:hAnsiTheme="majorHAnsi" w:cstheme="majorHAnsi"/>
+          <w:lang w:val="pt-BR"/>
+        </w:rPr>
+        <w:t xml:space="preserve"> emocional, diminua a autoestima, prejudique o desenvolvimento ou vise degradar ou controlar a vítima. Quando direcionada à identidade </w:t>
+      </w:r>
+      <w:proofErr w:type="spellStart"/>
+      <w:r>
+        <w:rPr>
+          <w:rFonts w:asciiTheme="majorHAnsi" w:hAnsiTheme="majorHAnsi" w:cstheme="majorHAnsi"/>
+          <w:lang w:val="pt-BR"/>
+        </w:rPr>
+        <w:t>trans</w:t>
+      </w:r>
+      <w:proofErr w:type="spellEnd"/>
+      <w:r>
+        <w:rPr>
+          <w:rFonts w:asciiTheme="majorHAnsi" w:hAnsiTheme="majorHAnsi" w:cstheme="majorHAnsi"/>
+          <w:lang w:val="pt-BR"/>
+        </w:rPr>
+        <w:t xml:space="preserve"> da mulher, essa violência é ainda mais grave.</w:t>
+      </w:r>
+    </w:p>
+    <w:p>
+      <w:pPr>
+        <w:spacing w:after="80"/>
+        <w:rPr>
+          <w:rFonts w:asciiTheme="majorHAnsi" w:hAnsiTheme="majorHAnsi" w:cstheme="majorHAnsi"/>
+          <w:lang w:val="pt-BR"/>
+        </w:rPr>
+      </w:pPr>
+      <w:r>
+        <w:rPr>
+          <w:rFonts w:asciiTheme="majorHAnsi" w:hAnsiTheme="majorHAnsi" w:cstheme="majorHAnsi"/>
+          <w:lang w:val="pt-BR"/>
+        </w:rPr>
+        <w:t>Frases que questionam a identidade de gênero: 'você é um homem', 'isso é doença'.</w:t>
+      </w:r>
+    </w:p>
+    <w:p>
+      <w:pPr>
+        <w:spacing w:after="80"/>
+        <w:rPr>
+          <w:rFonts w:asciiTheme="majorHAnsi" w:hAnsiTheme="majorHAnsi" w:cstheme="majorHAnsi"/>
+          <w:lang w:val="pt-BR"/>
+        </w:rPr>
+      </w:pPr>
+      <w:r>
+        <w:rPr>
+          <w:rFonts w:asciiTheme="majorHAnsi" w:hAnsiTheme="majorHAnsi" w:cstheme="majorHAnsi"/>
+          <w:lang w:val="pt-BR"/>
+        </w:rPr>
+        <w:t xml:space="preserve">Humilhação sobre o corpo </w:t>
+      </w:r>
+      <w:proofErr w:type="spellStart"/>
+      <w:r>
+        <w:rPr>
+          <w:rFonts w:asciiTheme="majorHAnsi" w:hAnsiTheme="majorHAnsi" w:cstheme="majorHAnsi"/>
+          <w:lang w:val="pt-BR"/>
+        </w:rPr>
+        <w:t>trans</w:t>
+      </w:r>
+      <w:proofErr w:type="spellEnd"/>
+      <w:r>
+        <w:rPr>
+          <w:rFonts w:asciiTheme="majorHAnsi" w:hAnsiTheme="majorHAnsi" w:cstheme="majorHAnsi"/>
+          <w:lang w:val="pt-BR"/>
+        </w:rPr>
+        <w:t xml:space="preserve">: comentários depreciativos sobre cirurgias, seios, </w:t>
+      </w:r>
+      <w:proofErr w:type="spellStart"/>
+      <w:r>
+        <w:rPr>
+          <w:rFonts w:asciiTheme="majorHAnsi" w:hAnsiTheme="majorHAnsi" w:cstheme="majorHAnsi"/>
+          <w:lang w:val="pt-BR"/>
+        </w:rPr>
+        <w:t>genitalia</w:t>
+      </w:r>
+      <w:proofErr w:type="spellEnd"/>
+      <w:r>
+        <w:rPr>
+          <w:rFonts w:asciiTheme="majorHAnsi" w:hAnsiTheme="majorHAnsi" w:cstheme="majorHAnsi"/>
+          <w:lang w:val="pt-BR"/>
+        </w:rPr>
+        <w:t>.</w:t>
+      </w:r>
+    </w:p>
+    <w:p>
+      <w:pPr>
+        <w:spacing w:after="80"/>
+        <w:rPr>
+          <w:rFonts w:asciiTheme="majorHAnsi" w:hAnsiTheme="majorHAnsi" w:cstheme="majorHAnsi"/>
+          <w:lang w:val="pt-BR"/>
+        </w:rPr>
+      </w:pPr>
+      <w:r>
+        <w:rPr>
+          <w:rFonts w:asciiTheme="majorHAnsi" w:hAnsiTheme="majorHAnsi" w:cstheme="majorHAnsi"/>
+          <w:lang w:val="pt-BR"/>
+        </w:rPr>
+        <w:t>Dizer que a mulher nunca será 'uma mulher de verdade' ou 'suficiente'.</w:t>
+      </w:r>
+    </w:p>
+    <w:p>
+      <w:pPr>
+        <w:spacing w:after="80"/>
+        <w:rPr>
+          <w:rFonts w:asciiTheme="majorHAnsi" w:hAnsiTheme="majorHAnsi" w:cstheme="majorHAnsi"/>
+          <w:lang w:val="pt-BR"/>
+        </w:rPr>
+      </w:pPr>
+      <w:r>
+        <w:rPr>
+          <w:rFonts w:asciiTheme="majorHAnsi" w:hAnsiTheme="majorHAnsi" w:cstheme="majorHAnsi"/>
+          <w:lang w:val="pt-BR"/>
+        </w:rPr>
+        <w:t xml:space="preserve">Ridicularizar a identidade </w:t>
+      </w:r>
+      <w:proofErr w:type="spellStart"/>
+      <w:r>
+        <w:rPr>
+          <w:rFonts w:asciiTheme="majorHAnsi" w:hAnsiTheme="majorHAnsi" w:cstheme="majorHAnsi"/>
+          <w:lang w:val="pt-BR"/>
+        </w:rPr>
+        <w:t>trans</w:t>
+      </w:r>
+      <w:proofErr w:type="spellEnd"/>
+      <w:r>
+        <w:rPr>
+          <w:rFonts w:asciiTheme="majorHAnsi" w:hAnsiTheme="majorHAnsi" w:cstheme="majorHAnsi"/>
+          <w:lang w:val="pt-BR"/>
+        </w:rPr>
+        <w:t xml:space="preserve"> na frente de outras pessoas.</w:t>
+      </w:r>
+    </w:p>
+    <w:p>
+      <w:pPr>
+        <w:spacing w:after="80"/>
+        <w:rPr>
+          <w:rFonts w:asciiTheme="majorHAnsi" w:hAnsiTheme="majorHAnsi" w:cstheme="majorHAnsi"/>
+          <w:lang w:val="pt-BR"/>
+        </w:rPr>
+      </w:pPr>
+      <w:r>
+        <w:rPr>
+          <w:rFonts w:asciiTheme="majorHAnsi" w:hAnsiTheme="majorHAnsi" w:cstheme="majorHAnsi"/>
+          <w:lang w:val="pt-BR"/>
+        </w:rPr>
+        <w:t xml:space="preserve">Ameaçar revelar a condição </w:t>
+      </w:r>
+      <w:proofErr w:type="spellStart"/>
+      <w:r>
+        <w:rPr>
+          <w:rFonts w:asciiTheme="majorHAnsi" w:hAnsiTheme="majorHAnsi" w:cstheme="majorHAnsi"/>
+          <w:lang w:val="pt-BR"/>
+        </w:rPr>
+        <w:t>trans</w:t>
+      </w:r>
+      <w:proofErr w:type="spellEnd"/>
+      <w:r>
+        <w:rPr>
+          <w:rFonts w:asciiTheme="majorHAnsi" w:hAnsiTheme="majorHAnsi" w:cstheme="majorHAnsi"/>
+          <w:lang w:val="pt-BR"/>
+        </w:rPr>
+        <w:t xml:space="preserve"> para empregadores, família ou vizinhos.</w:t>
+      </w:r>
+    </w:p>
+    <w:p>
+      <w:pPr>
+        <w:spacing w:after="80"/>
+        <w:rPr>
+          <w:rFonts w:asciiTheme="majorHAnsi" w:hAnsiTheme="majorHAnsi" w:cstheme="majorHAnsi"/>
+          <w:lang w:val="pt-BR"/>
+        </w:rPr>
+      </w:pPr>
+      <w:r>
+        <w:rPr>
+          <w:rFonts w:asciiTheme="majorHAnsi" w:hAnsiTheme="majorHAnsi" w:cstheme="majorHAnsi"/>
+          <w:lang w:val="pt-BR"/>
+        </w:rPr>
+        <w:t>Proibir o uso de roupas, maquiagem ou expressões da identidade feminina.</w:t>
+      </w:r>
+    </w:p>
+    <w:p>
+      <w:pPr>
+        <w:pStyle w:val="Ttulo2"/>
+        <w:rPr>
+          <w:rFonts w:asciiTheme="majorHAnsi" w:eastAsia="Arial" w:hAnsiTheme="majorHAnsi" w:cstheme="majorHAnsi"/>
+          <w:b w:val="0"/>
+          <w:sz w:val="22"/>
+          <w:szCs w:val="22"/>
+          <w:lang w:val="pt-BR"/>
+        </w:rPr>
+      </w:pPr>
+      <w:r>
+        <w:rPr>
+          <w:rFonts w:asciiTheme="majorHAnsi" w:eastAsia="Arial" w:hAnsiTheme="majorHAnsi" w:cstheme="majorHAnsi"/>
+          <w:b w:val="0"/>
+          <w:sz w:val="22"/>
+          <w:szCs w:val="22"/>
+          <w:lang w:val="pt-BR"/>
+        </w:rPr>
+        <w:t>Provas e registro</w:t>
+      </w:r>
+    </w:p>
+    <w:p>
+      <w:pPr>
+        <w:spacing w:after="120"/>
+        <w:rPr>
+          <w:rFonts w:asciiTheme="majorHAnsi" w:eastAsia="Arial" w:hAnsiTheme="majorHAnsi" w:cstheme="majorHAnsi"/>
+          <w:lang w:val="pt-BR"/>
+        </w:rPr>
+      </w:pPr>
+      <w:r>
+        <w:rPr>
+          <w:rFonts w:asciiTheme="majorHAnsi" w:hAnsiTheme="majorHAnsi" w:cstheme="majorHAnsi"/>
+          <w:lang w:val="pt-BR"/>
+        </w:rPr>
+        <w:t>Para violência psicológica, é importante documentar mesmo sem marcas físicas:</w:t>
+      </w:r>
+    </w:p>
+    <w:p>
+      <w:pPr>
+        <w:spacing w:after="80"/>
+        <w:rPr>
+          <w:rFonts w:asciiTheme="majorHAnsi" w:hAnsiTheme="majorHAnsi" w:cstheme="majorHAnsi"/>
+          <w:lang w:val="pt-BR"/>
+        </w:rPr>
+      </w:pPr>
+      <w:r>
+        <w:rPr>
+          <w:rFonts w:asciiTheme="majorHAnsi" w:hAnsiTheme="majorHAnsi" w:cstheme="majorHAnsi"/>
+          <w:lang w:val="pt-BR"/>
+        </w:rPr>
+        <w:t>Guardar prints de mensagens, áudios e vídeos com humilhações.</w:t>
+      </w:r>
+    </w:p>
+    <w:p>
+      <w:pPr>
+        <w:spacing w:after="80"/>
+        <w:rPr>
+          <w:rFonts w:asciiTheme="majorHAnsi" w:hAnsiTheme="majorHAnsi" w:cstheme="majorHAnsi"/>
+          <w:lang w:val="pt-BR"/>
+        </w:rPr>
+      </w:pPr>
+      <w:r>
+        <w:rPr>
+          <w:rFonts w:asciiTheme="majorHAnsi" w:hAnsiTheme="majorHAnsi" w:cstheme="majorHAnsi"/>
+          <w:lang w:val="pt-BR"/>
+        </w:rPr>
+        <w:t>Registrar data, hora e contexto de episódios verbais.</w:t>
+      </w:r>
+    </w:p>
+    <w:p>
+      <w:pPr>
+        <w:spacing w:after="80"/>
+        <w:rPr>
+          <w:rFonts w:asciiTheme="majorHAnsi" w:hAnsiTheme="majorHAnsi" w:cstheme="majorHAnsi"/>
+          <w:lang w:val="pt-BR"/>
+        </w:rPr>
+      </w:pPr>
+      <w:r>
+        <w:rPr>
+          <w:rFonts w:asciiTheme="majorHAnsi" w:hAnsiTheme="majorHAnsi" w:cstheme="majorHAnsi"/>
+          <w:lang w:val="pt-BR"/>
+        </w:rPr>
+        <w:t>Testemunhas que tenham presenciado episódios de humilhação.</w:t>
+      </w:r>
+    </w:p>
+    <w:p>
+      <w:pPr>
+        <w:spacing w:after="80"/>
+        <w:rPr>
+          <w:rFonts w:asciiTheme="majorHAnsi" w:hAnsiTheme="majorHAnsi" w:cstheme="majorHAnsi"/>
+          <w:lang w:val="pt-BR"/>
+        </w:rPr>
+      </w:pPr>
+      <w:r>
+        <w:rPr>
+          <w:rFonts w:asciiTheme="majorHAnsi" w:hAnsiTheme="majorHAnsi" w:cstheme="majorHAnsi"/>
+          <w:lang w:val="pt-BR"/>
+        </w:rPr>
+        <w:t>Laudos psicológicos ou relatos de atendimento em saúde mental.</w:t>
+      </w:r>
+    </w:p>
+    <w:p>
+      <w:pPr>
+        <w:spacing w:after="120"/>
+        <w:rPr>
+          <w:rFonts w:asciiTheme="majorHAnsi" w:hAnsiTheme="majorHAnsi" w:cstheme="majorHAnsi"/>
+          <w:lang w:val="pt-BR"/>
+        </w:rPr>
+      </w:pPr>
+      <w:r>
+        <w:rPr>
+          <w:rFonts w:asciiTheme="majorHAnsi" w:hAnsiTheme="majorHAnsi" w:cstheme="majorHAnsi"/>
+          <w:lang w:val="pt-BR"/>
+        </w:rPr>
+        <w:t>A Defensoria Pública pode orientar sobre como preservar essas provas de forma correta.</w:t>
+      </w:r>
+    </w:p>
+    <w:p>
+      <w:pPr>
+        <w:pBdr>
+          <w:bottom w:val="single" w:sz="4" w:space="1" w:color="CCCCCC"/>
+        </w:pBdr>
+        <w:spacing w:before="200" w:after="200"/>
+        <w:rPr>
+          <w:rFonts w:asciiTheme="majorHAnsi" w:hAnsiTheme="majorHAnsi" w:cstheme="majorHAnsi"/>
+          <w:lang w:val="pt-BR"/>
+        </w:rPr>
+      </w:pPr>
+    </w:p>
+    <w:p>
+      <w:pPr>
+        <w:pStyle w:val="Ttulo1"/>
+        <w:rPr>
+          <w:rFonts w:asciiTheme="majorHAnsi" w:eastAsia="Arial" w:hAnsiTheme="majorHAnsi" w:cstheme="majorHAnsi"/>
+          <w:b w:val="0"/>
+          <w:sz w:val="22"/>
+          <w:szCs w:val="22"/>
+          <w:lang w:val="pt-BR"/>
+        </w:rPr>
+      </w:pPr>
+      <w:r>
+        <w:rPr>
+          <w:rFonts w:asciiTheme="majorHAnsi" w:eastAsia="Arial" w:hAnsiTheme="majorHAnsi" w:cstheme="majorHAnsi"/>
+          <w:b w:val="0"/>
+          <w:sz w:val="22"/>
+          <w:szCs w:val="22"/>
+          <w:lang w:val="pt-BR"/>
+        </w:rPr>
+        <w:t xml:space="preserve">Violência Moral contra Mulheres </w:t>
+      </w:r>
+      <w:proofErr w:type="spellStart"/>
+      <w:r>
+        <w:rPr>
+          <w:rFonts w:asciiTheme="majorHAnsi" w:eastAsia="Arial" w:hAnsiTheme="majorHAnsi" w:cstheme="majorHAnsi"/>
+          <w:b w:val="0"/>
+          <w:sz w:val="22"/>
+          <w:szCs w:val="22"/>
+          <w:lang w:val="pt-BR"/>
+        </w:rPr>
+        <w:t>Trans</w:t>
+      </w:r>
+      <w:proofErr w:type="spellEnd"/>
+    </w:p>
+    <w:p>
+      <w:pPr>
+        <w:pStyle w:val="Ttulo2"/>
+        <w:rPr>
+          <w:rFonts w:asciiTheme="majorHAnsi" w:eastAsia="Arial" w:hAnsiTheme="majorHAnsi" w:cstheme="majorHAnsi"/>
+          <w:b w:val="0"/>
+          <w:sz w:val="22"/>
+          <w:szCs w:val="22"/>
+          <w:lang w:val="pt-BR"/>
+        </w:rPr>
+      </w:pPr>
+      <w:r>
+        <w:rPr>
+          <w:rFonts w:asciiTheme="majorHAnsi" w:eastAsia="Arial" w:hAnsiTheme="majorHAnsi" w:cstheme="majorHAnsi"/>
+          <w:b w:val="0"/>
+          <w:sz w:val="22"/>
+          <w:szCs w:val="22"/>
+          <w:lang w:val="pt-BR"/>
+        </w:rPr>
+        <w:lastRenderedPageBreak/>
+        <w:t xml:space="preserve">Caluniar, difamar e injuriar com base na identidade </w:t>
+      </w:r>
+      <w:proofErr w:type="spellStart"/>
+      <w:r>
+        <w:rPr>
+          <w:rFonts w:asciiTheme="majorHAnsi" w:eastAsia="Arial" w:hAnsiTheme="majorHAnsi" w:cstheme="majorHAnsi"/>
+          <w:b w:val="0"/>
+          <w:sz w:val="22"/>
+          <w:szCs w:val="22"/>
+          <w:lang w:val="pt-BR"/>
+        </w:rPr>
+        <w:t>trans</w:t>
+      </w:r>
+      <w:proofErr w:type="spellEnd"/>
+    </w:p>
+    <w:p>
+      <w:pPr>
+        <w:spacing w:after="120"/>
+        <w:rPr>
+          <w:rFonts w:asciiTheme="majorHAnsi" w:eastAsia="Arial" w:hAnsiTheme="majorHAnsi" w:cstheme="majorHAnsi"/>
+        </w:rPr>
+      </w:pPr>
+      <w:r>
+        <w:rPr>
+          <w:rFonts w:asciiTheme="majorHAnsi" w:hAnsiTheme="majorHAnsi" w:cstheme="majorHAnsi"/>
+          <w:lang w:val="pt-BR"/>
+        </w:rPr>
+        <w:t xml:space="preserve">A violência moral inclui qualquer conduta que configure calúnia, difamação ou injuria a mulher. </w:t>
+      </w:r>
+      <w:r>
+        <w:rPr>
+          <w:rFonts w:asciiTheme="majorHAnsi" w:hAnsiTheme="majorHAnsi" w:cstheme="majorHAnsi"/>
+        </w:rPr>
+        <w:t xml:space="preserve">No contexto trans, </w:t>
+      </w:r>
+      <w:proofErr w:type="spellStart"/>
+      <w:r>
+        <w:rPr>
+          <w:rFonts w:asciiTheme="majorHAnsi" w:hAnsiTheme="majorHAnsi" w:cstheme="majorHAnsi"/>
+        </w:rPr>
+        <w:t>isso</w:t>
+      </w:r>
+      <w:proofErr w:type="spellEnd"/>
+      <w:r>
+        <w:rPr>
+          <w:rFonts w:asciiTheme="majorHAnsi" w:hAnsiTheme="majorHAnsi" w:cstheme="majorHAnsi"/>
+        </w:rPr>
+        <w:t xml:space="preserve"> </w:t>
+      </w:r>
+      <w:proofErr w:type="spellStart"/>
+      <w:r>
+        <w:rPr>
+          <w:rFonts w:asciiTheme="majorHAnsi" w:hAnsiTheme="majorHAnsi" w:cstheme="majorHAnsi"/>
+        </w:rPr>
+        <w:t>inclui</w:t>
+      </w:r>
+      <w:proofErr w:type="spellEnd"/>
+      <w:r>
+        <w:rPr>
+          <w:rFonts w:asciiTheme="majorHAnsi" w:hAnsiTheme="majorHAnsi" w:cstheme="majorHAnsi"/>
+        </w:rPr>
+        <w:t>:</w:t>
+      </w:r>
+    </w:p>
+    <w:p>
+      <w:pPr>
+        <w:spacing w:after="80"/>
+        <w:rPr>
+          <w:rFonts w:asciiTheme="majorHAnsi" w:hAnsiTheme="majorHAnsi" w:cstheme="majorHAnsi"/>
+          <w:lang w:val="pt-BR"/>
+        </w:rPr>
+      </w:pPr>
+      <w:r>
+        <w:rPr>
+          <w:rFonts w:asciiTheme="majorHAnsi" w:hAnsiTheme="majorHAnsi" w:cstheme="majorHAnsi"/>
+          <w:lang w:val="pt-BR"/>
+        </w:rPr>
+        <w:t xml:space="preserve">Espalhar que a mulher é </w:t>
+      </w:r>
+      <w:proofErr w:type="spellStart"/>
+      <w:r>
+        <w:rPr>
+          <w:rFonts w:asciiTheme="majorHAnsi" w:hAnsiTheme="majorHAnsi" w:cstheme="majorHAnsi"/>
+          <w:lang w:val="pt-BR"/>
+        </w:rPr>
+        <w:t>trans</w:t>
+      </w:r>
+      <w:proofErr w:type="spellEnd"/>
+      <w:r>
+        <w:rPr>
+          <w:rFonts w:asciiTheme="majorHAnsi" w:hAnsiTheme="majorHAnsi" w:cstheme="majorHAnsi"/>
+          <w:lang w:val="pt-BR"/>
+        </w:rPr>
+        <w:t xml:space="preserve"> para pessoas da comunidade, família ou trabalho sem consentimento (</w:t>
+      </w:r>
+      <w:proofErr w:type="spellStart"/>
+      <w:r>
+        <w:rPr>
+          <w:rFonts w:asciiTheme="majorHAnsi" w:hAnsiTheme="majorHAnsi" w:cstheme="majorHAnsi"/>
+          <w:lang w:val="pt-BR"/>
+        </w:rPr>
+        <w:t>outing</w:t>
+      </w:r>
+      <w:proofErr w:type="spellEnd"/>
+      <w:r>
+        <w:rPr>
+          <w:rFonts w:asciiTheme="majorHAnsi" w:hAnsiTheme="majorHAnsi" w:cstheme="majorHAnsi"/>
+          <w:lang w:val="pt-BR"/>
+        </w:rPr>
+        <w:t>).</w:t>
+      </w:r>
+    </w:p>
+    <w:p>
+      <w:pPr>
+        <w:spacing w:after="80"/>
+        <w:rPr>
+          <w:rFonts w:asciiTheme="majorHAnsi" w:hAnsiTheme="majorHAnsi" w:cstheme="majorHAnsi"/>
+          <w:lang w:val="pt-BR"/>
+        </w:rPr>
+      </w:pPr>
+      <w:r>
+        <w:rPr>
+          <w:rFonts w:asciiTheme="majorHAnsi" w:hAnsiTheme="majorHAnsi" w:cstheme="majorHAnsi"/>
+          <w:lang w:val="pt-BR"/>
+        </w:rPr>
+        <w:t xml:space="preserve">Usar a condição </w:t>
+      </w:r>
+      <w:proofErr w:type="spellStart"/>
+      <w:r>
+        <w:rPr>
+          <w:rFonts w:asciiTheme="majorHAnsi" w:hAnsiTheme="majorHAnsi" w:cstheme="majorHAnsi"/>
+          <w:lang w:val="pt-BR"/>
+        </w:rPr>
+        <w:t>trans</w:t>
+      </w:r>
+      <w:proofErr w:type="spellEnd"/>
+      <w:r>
+        <w:rPr>
+          <w:rFonts w:asciiTheme="majorHAnsi" w:hAnsiTheme="majorHAnsi" w:cstheme="majorHAnsi"/>
+          <w:lang w:val="pt-BR"/>
+        </w:rPr>
+        <w:t xml:space="preserve"> para desqualificá-la como mãe, parceira ou profissional.</w:t>
+      </w:r>
+    </w:p>
+    <w:p>
+      <w:pPr>
+        <w:spacing w:after="80"/>
+        <w:rPr>
+          <w:rFonts w:asciiTheme="majorHAnsi" w:hAnsiTheme="majorHAnsi" w:cstheme="majorHAnsi"/>
+          <w:lang w:val="pt-BR"/>
+        </w:rPr>
+      </w:pPr>
+      <w:r>
+        <w:rPr>
+          <w:rFonts w:asciiTheme="majorHAnsi" w:hAnsiTheme="majorHAnsi" w:cstheme="majorHAnsi"/>
+          <w:lang w:val="pt-BR"/>
+        </w:rPr>
+        <w:t>Compartilhar imagens, documentos ou informações sobre o gênero de registro sem autorização.</w:t>
+      </w:r>
+    </w:p>
+    <w:p>
+      <w:pPr>
+        <w:spacing w:after="80"/>
+        <w:rPr>
+          <w:rFonts w:asciiTheme="majorHAnsi" w:hAnsiTheme="majorHAnsi" w:cstheme="majorHAnsi"/>
+          <w:lang w:val="pt-BR"/>
+        </w:rPr>
+      </w:pPr>
+      <w:r>
+        <w:rPr>
+          <w:rFonts w:asciiTheme="majorHAnsi" w:hAnsiTheme="majorHAnsi" w:cstheme="majorHAnsi"/>
+          <w:lang w:val="pt-BR"/>
+        </w:rPr>
+        <w:t>Fazer circular boatos sobre o corpo ou a vida sexual da mulher trans.</w:t>
+      </w:r>
+    </w:p>
+    <w:p>
+      <w:pPr>
+        <w:pStyle w:val="Ttulo2"/>
+        <w:rPr>
+          <w:rFonts w:asciiTheme="majorHAnsi" w:eastAsia="Arial" w:hAnsiTheme="majorHAnsi" w:cstheme="majorHAnsi"/>
+          <w:b w:val="0"/>
+          <w:sz w:val="22"/>
+          <w:szCs w:val="22"/>
+          <w:lang w:val="pt-BR"/>
+        </w:rPr>
+      </w:pPr>
+      <w:proofErr w:type="spellStart"/>
+      <w:r>
+        <w:rPr>
+          <w:rFonts w:asciiTheme="majorHAnsi" w:eastAsia="Arial" w:hAnsiTheme="majorHAnsi" w:cstheme="majorHAnsi"/>
+          <w:b w:val="0"/>
+          <w:sz w:val="22"/>
+          <w:szCs w:val="22"/>
+          <w:lang w:val="pt-BR"/>
+        </w:rPr>
+        <w:t>LGBTfobia</w:t>
+      </w:r>
+      <w:proofErr w:type="spellEnd"/>
+      <w:r>
+        <w:rPr>
+          <w:rFonts w:asciiTheme="majorHAnsi" w:eastAsia="Arial" w:hAnsiTheme="majorHAnsi" w:cstheme="majorHAnsi"/>
+          <w:b w:val="0"/>
+          <w:sz w:val="22"/>
+          <w:szCs w:val="22"/>
+          <w:lang w:val="pt-BR"/>
+        </w:rPr>
+        <w:t xml:space="preserve"> como crime</w:t>
+      </w:r>
+    </w:p>
+    <w:p>
+      <w:pPr>
+        <w:spacing w:after="120"/>
+        <w:rPr>
+          <w:rFonts w:asciiTheme="majorHAnsi" w:eastAsia="Arial" w:hAnsiTheme="majorHAnsi" w:cstheme="majorHAnsi"/>
+          <w:lang w:val="pt-BR"/>
+        </w:rPr>
+      </w:pPr>
+      <w:r>
+        <w:rPr>
+          <w:rFonts w:asciiTheme="majorHAnsi" w:hAnsiTheme="majorHAnsi" w:cstheme="majorHAnsi"/>
+          <w:lang w:val="pt-BR"/>
+        </w:rPr>
+        <w:t xml:space="preserve">O STF decidiu em 2019 (ADO 26) que a </w:t>
+      </w:r>
+      <w:proofErr w:type="spellStart"/>
+      <w:r>
+        <w:rPr>
+          <w:rFonts w:asciiTheme="majorHAnsi" w:hAnsiTheme="majorHAnsi" w:cstheme="majorHAnsi"/>
+          <w:lang w:val="pt-BR"/>
+        </w:rPr>
+        <w:t>homotransfobia</w:t>
+      </w:r>
+      <w:proofErr w:type="spellEnd"/>
+      <w:r>
+        <w:rPr>
+          <w:rFonts w:asciiTheme="majorHAnsi" w:hAnsiTheme="majorHAnsi" w:cstheme="majorHAnsi"/>
+          <w:lang w:val="pt-BR"/>
+        </w:rPr>
+        <w:t xml:space="preserve"> é equiparada ao crime de racismo, sendo imprescritível e </w:t>
+      </w:r>
+      <w:proofErr w:type="spellStart"/>
+      <w:r>
+        <w:rPr>
+          <w:rFonts w:asciiTheme="majorHAnsi" w:hAnsiTheme="majorHAnsi" w:cstheme="majorHAnsi"/>
+          <w:lang w:val="pt-BR"/>
+        </w:rPr>
+        <w:t>inafiánçável</w:t>
+      </w:r>
+      <w:proofErr w:type="spellEnd"/>
+      <w:r>
+        <w:rPr>
+          <w:rFonts w:asciiTheme="majorHAnsi" w:hAnsiTheme="majorHAnsi" w:cstheme="majorHAnsi"/>
+          <w:lang w:val="pt-BR"/>
+        </w:rPr>
+        <w:t>. O Disque 100 recebe denúncias de violações de direitos humanos contra pessoas LGBTQIA+, incluindo mulheres trans.</w:t>
+      </w:r>
+    </w:p>
+    <w:p>
+      <w:pPr>
+        <w:spacing w:after="120"/>
+        <w:rPr>
+          <w:rFonts w:asciiTheme="majorHAnsi" w:hAnsiTheme="majorHAnsi" w:cstheme="majorHAnsi"/>
+          <w:lang w:val="pt-BR"/>
+        </w:rPr>
+      </w:pPr>
+      <w:r>
+        <w:rPr>
+          <w:rFonts w:asciiTheme="majorHAnsi" w:hAnsiTheme="majorHAnsi" w:cstheme="majorHAnsi"/>
+          <w:bCs/>
+          <w:lang w:val="pt-BR"/>
+        </w:rPr>
+        <w:t xml:space="preserve">Canal de denúncia: </w:t>
+      </w:r>
+      <w:r>
+        <w:rPr>
+          <w:rFonts w:asciiTheme="majorHAnsi" w:hAnsiTheme="majorHAnsi" w:cstheme="majorHAnsi"/>
+          <w:lang w:val="pt-BR"/>
+        </w:rPr>
+        <w:t>Disque 100 (funciona 24h, inclusive para relatos anônimos).</w:t>
+      </w:r>
+    </w:p>
+    <w:p>
+      <w:pPr>
+        <w:pBdr>
+          <w:bottom w:val="single" w:sz="4" w:space="1" w:color="CCCCCC"/>
+        </w:pBdr>
+        <w:spacing w:before="200" w:after="200"/>
+        <w:rPr>
+          <w:rFonts w:asciiTheme="majorHAnsi" w:hAnsiTheme="majorHAnsi" w:cstheme="majorHAnsi"/>
+          <w:lang w:val="pt-BR"/>
+        </w:rPr>
+      </w:pPr>
+    </w:p>
+    <w:p>
+      <w:pPr>
+        <w:pStyle w:val="Ttulo1"/>
+        <w:rPr>
+          <w:rFonts w:asciiTheme="majorHAnsi" w:eastAsia="Arial" w:hAnsiTheme="majorHAnsi" w:cstheme="majorHAnsi"/>
+          <w:b w:val="0"/>
+          <w:sz w:val="22"/>
+          <w:szCs w:val="22"/>
+          <w:lang w:val="pt-BR"/>
+        </w:rPr>
+      </w:pPr>
+      <w:r>
+        <w:rPr>
+          <w:rFonts w:asciiTheme="majorHAnsi" w:eastAsia="Arial" w:hAnsiTheme="majorHAnsi" w:cstheme="majorHAnsi"/>
+          <w:b w:val="0"/>
+          <w:sz w:val="22"/>
+          <w:szCs w:val="22"/>
+          <w:lang w:val="pt-BR"/>
+        </w:rPr>
+        <w:t>Violência Patrimonial</w:t>
+      </w:r>
+    </w:p>
+    <w:p>
+      <w:pPr>
+        <w:pStyle w:val="Ttulo2"/>
+        <w:rPr>
+          <w:rFonts w:asciiTheme="majorHAnsi" w:eastAsia="Arial" w:hAnsiTheme="majorHAnsi" w:cstheme="majorHAnsi"/>
+          <w:b w:val="0"/>
+          <w:sz w:val="22"/>
+          <w:szCs w:val="22"/>
+          <w:lang w:val="pt-BR"/>
+        </w:rPr>
+      </w:pPr>
+      <w:r>
+        <w:rPr>
+          <w:rFonts w:asciiTheme="majorHAnsi" w:eastAsia="Arial" w:hAnsiTheme="majorHAnsi" w:cstheme="majorHAnsi"/>
+          <w:b w:val="0"/>
+          <w:sz w:val="22"/>
+          <w:szCs w:val="22"/>
+          <w:lang w:val="pt-BR"/>
+        </w:rPr>
+        <w:t>Controle econômico e dependência</w:t>
+      </w:r>
+    </w:p>
+    <w:p>
+      <w:pPr>
+        <w:spacing w:after="120"/>
+        <w:rPr>
+          <w:rFonts w:asciiTheme="majorHAnsi" w:eastAsia="Arial" w:hAnsiTheme="majorHAnsi" w:cstheme="majorHAnsi"/>
+          <w:lang w:val="pt-BR"/>
+        </w:rPr>
+      </w:pPr>
+      <w:r>
+        <w:rPr>
+          <w:rFonts w:asciiTheme="majorHAnsi" w:hAnsiTheme="majorHAnsi" w:cstheme="majorHAnsi"/>
+          <w:lang w:val="pt-BR"/>
+        </w:rPr>
+        <w:t xml:space="preserve">Mulheres </w:t>
+      </w:r>
+      <w:proofErr w:type="spellStart"/>
+      <w:r>
+        <w:rPr>
+          <w:rFonts w:asciiTheme="majorHAnsi" w:hAnsiTheme="majorHAnsi" w:cstheme="majorHAnsi"/>
+          <w:lang w:val="pt-BR"/>
+        </w:rPr>
+        <w:t>trans</w:t>
+      </w:r>
+      <w:proofErr w:type="spellEnd"/>
+      <w:r>
+        <w:rPr>
+          <w:rFonts w:asciiTheme="majorHAnsi" w:hAnsiTheme="majorHAnsi" w:cstheme="majorHAnsi"/>
+          <w:lang w:val="pt-BR"/>
+        </w:rPr>
+        <w:t xml:space="preserve"> frequentemente enfrentam barreiras no mercado de trabalho formal devido à discriminação, o que pode criar dependência econômica do parceiro ou familiar agressor. Isso é um fator de vulnerabilidade adicional que a rede de proteção deve considerar.</w:t>
+      </w:r>
+    </w:p>
+    <w:p>
+      <w:pPr>
+        <w:spacing w:after="80"/>
+        <w:rPr>
+          <w:rFonts w:asciiTheme="majorHAnsi" w:hAnsiTheme="majorHAnsi" w:cstheme="majorHAnsi"/>
+          <w:lang w:val="pt-BR"/>
+        </w:rPr>
+      </w:pPr>
+      <w:r>
+        <w:rPr>
+          <w:rFonts w:asciiTheme="majorHAnsi" w:hAnsiTheme="majorHAnsi" w:cstheme="majorHAnsi"/>
+          <w:lang w:val="pt-BR"/>
+        </w:rPr>
+        <w:t>Impedir o acesso da mulher a dinheiro próprio ou conta bancária.</w:t>
+      </w:r>
+    </w:p>
+    <w:p>
+      <w:pPr>
+        <w:spacing w:after="80"/>
+        <w:rPr>
+          <w:rFonts w:asciiTheme="majorHAnsi" w:hAnsiTheme="majorHAnsi" w:cstheme="majorHAnsi"/>
+          <w:lang w:val="pt-BR"/>
+        </w:rPr>
+      </w:pPr>
+      <w:r>
+        <w:rPr>
+          <w:rFonts w:asciiTheme="majorHAnsi" w:hAnsiTheme="majorHAnsi" w:cstheme="majorHAnsi"/>
+          <w:lang w:val="pt-BR"/>
+        </w:rPr>
+        <w:t>Destruir documentos de identidade, especialmente aqueles com o nome social retificado.</w:t>
+      </w:r>
+    </w:p>
+    <w:p>
+      <w:pPr>
+        <w:spacing w:after="80"/>
+        <w:rPr>
+          <w:rFonts w:asciiTheme="majorHAnsi" w:hAnsiTheme="majorHAnsi" w:cstheme="majorHAnsi"/>
+          <w:lang w:val="pt-BR"/>
+        </w:rPr>
+      </w:pPr>
+      <w:r>
+        <w:rPr>
+          <w:rFonts w:asciiTheme="majorHAnsi" w:hAnsiTheme="majorHAnsi" w:cstheme="majorHAnsi"/>
+          <w:lang w:val="pt-BR"/>
+        </w:rPr>
+        <w:t>Usar a dependência econômica como ameaça para manter controle.</w:t>
+      </w:r>
+    </w:p>
+    <w:p>
+      <w:pPr>
+        <w:spacing w:after="80"/>
+        <w:rPr>
+          <w:rFonts w:asciiTheme="majorHAnsi" w:hAnsiTheme="majorHAnsi" w:cstheme="majorHAnsi"/>
+          <w:lang w:val="pt-BR"/>
+        </w:rPr>
+      </w:pPr>
+      <w:r>
+        <w:rPr>
+          <w:rFonts w:asciiTheme="majorHAnsi" w:hAnsiTheme="majorHAnsi" w:cstheme="majorHAnsi"/>
+          <w:lang w:val="pt-BR"/>
+        </w:rPr>
+        <w:t>Reter ou destruir medicação hormonal adquirida pela mulher.</w:t>
+      </w:r>
+    </w:p>
+    <w:p>
+      <w:pPr>
+        <w:pStyle w:val="Ttulo2"/>
+        <w:rPr>
+          <w:rFonts w:asciiTheme="majorHAnsi" w:eastAsia="Arial" w:hAnsiTheme="majorHAnsi" w:cstheme="majorHAnsi"/>
+          <w:b w:val="0"/>
+          <w:sz w:val="22"/>
+          <w:szCs w:val="22"/>
+          <w:lang w:val="pt-BR"/>
+        </w:rPr>
+      </w:pPr>
+      <w:r>
+        <w:rPr>
+          <w:rFonts w:asciiTheme="majorHAnsi" w:eastAsia="Arial" w:hAnsiTheme="majorHAnsi" w:cstheme="majorHAnsi"/>
+          <w:b w:val="0"/>
+          <w:sz w:val="22"/>
+          <w:szCs w:val="22"/>
+          <w:lang w:val="pt-BR"/>
+        </w:rPr>
+        <w:t>Direitos econômicos e assistência</w:t>
+      </w:r>
+    </w:p>
+    <w:p>
+      <w:pPr>
+        <w:spacing w:after="120"/>
+        <w:rPr>
+          <w:rFonts w:asciiTheme="majorHAnsi" w:eastAsia="Arial" w:hAnsiTheme="majorHAnsi" w:cstheme="majorHAnsi"/>
+          <w:lang w:val="pt-BR"/>
+        </w:rPr>
+      </w:pPr>
+      <w:r>
+        <w:rPr>
+          <w:rFonts w:asciiTheme="majorHAnsi" w:hAnsiTheme="majorHAnsi" w:cstheme="majorHAnsi"/>
+          <w:lang w:val="pt-BR"/>
+        </w:rPr>
+        <w:t xml:space="preserve">A mulher </w:t>
+      </w:r>
+      <w:proofErr w:type="spellStart"/>
+      <w:r>
+        <w:rPr>
+          <w:rFonts w:asciiTheme="majorHAnsi" w:hAnsiTheme="majorHAnsi" w:cstheme="majorHAnsi"/>
+          <w:lang w:val="pt-BR"/>
+        </w:rPr>
+        <w:t>trans</w:t>
+      </w:r>
+      <w:proofErr w:type="spellEnd"/>
+      <w:r>
+        <w:rPr>
+          <w:rFonts w:asciiTheme="majorHAnsi" w:hAnsiTheme="majorHAnsi" w:cstheme="majorHAnsi"/>
+          <w:lang w:val="pt-BR"/>
+        </w:rPr>
+        <w:t xml:space="preserve"> tem direito a:</w:t>
+      </w:r>
+    </w:p>
+    <w:p>
+      <w:pPr>
+        <w:spacing w:after="80"/>
+        <w:rPr>
+          <w:rFonts w:asciiTheme="majorHAnsi" w:hAnsiTheme="majorHAnsi" w:cstheme="majorHAnsi"/>
+          <w:lang w:val="pt-BR"/>
+        </w:rPr>
+      </w:pPr>
+      <w:r>
+        <w:rPr>
+          <w:rFonts w:asciiTheme="majorHAnsi" w:hAnsiTheme="majorHAnsi" w:cstheme="majorHAnsi"/>
+          <w:lang w:val="pt-BR"/>
+        </w:rPr>
+        <w:t>Solicitar alimentos provisórios em medida protetiva se houver dependência econômica.</w:t>
+      </w:r>
+    </w:p>
+    <w:p>
+      <w:pPr>
+        <w:spacing w:after="80"/>
+        <w:rPr>
+          <w:rFonts w:asciiTheme="majorHAnsi" w:hAnsiTheme="majorHAnsi" w:cstheme="majorHAnsi"/>
+          <w:lang w:val="pt-BR"/>
+        </w:rPr>
+      </w:pPr>
+      <w:r>
+        <w:rPr>
+          <w:rFonts w:asciiTheme="majorHAnsi" w:hAnsiTheme="majorHAnsi" w:cstheme="majorHAnsi"/>
+          <w:lang w:val="pt-BR"/>
+        </w:rPr>
+        <w:t>Acesso a programas sociais sem discriminação por identidade de gênero.</w:t>
+      </w:r>
+    </w:p>
+    <w:p>
+      <w:pPr>
+        <w:spacing w:after="80"/>
+        <w:rPr>
+          <w:rFonts w:asciiTheme="majorHAnsi" w:hAnsiTheme="majorHAnsi" w:cstheme="majorHAnsi"/>
+          <w:lang w:val="pt-BR"/>
+        </w:rPr>
+      </w:pPr>
+      <w:r>
+        <w:rPr>
+          <w:rFonts w:asciiTheme="majorHAnsi" w:hAnsiTheme="majorHAnsi" w:cstheme="majorHAnsi"/>
+          <w:lang w:val="pt-BR"/>
+        </w:rPr>
+        <w:t>Orientação da Defensoria sobre partilha de bens em caso de separação.</w:t>
+      </w:r>
+    </w:p>
+    <w:p>
+      <w:pPr>
+        <w:spacing w:after="80"/>
+        <w:rPr>
+          <w:rFonts w:asciiTheme="majorHAnsi" w:hAnsiTheme="majorHAnsi" w:cstheme="majorHAnsi"/>
+          <w:lang w:val="pt-BR"/>
+        </w:rPr>
+      </w:pPr>
+      <w:r>
+        <w:rPr>
+          <w:rFonts w:asciiTheme="majorHAnsi" w:hAnsiTheme="majorHAnsi" w:cstheme="majorHAnsi"/>
+          <w:lang w:val="pt-BR"/>
+        </w:rPr>
+        <w:t xml:space="preserve">Inclusão no </w:t>
+      </w:r>
+      <w:proofErr w:type="spellStart"/>
+      <w:r>
+        <w:rPr>
+          <w:rFonts w:asciiTheme="majorHAnsi" w:hAnsiTheme="majorHAnsi" w:cstheme="majorHAnsi"/>
+          <w:lang w:val="pt-BR"/>
+        </w:rPr>
+        <w:t>CadUnico</w:t>
+      </w:r>
+      <w:proofErr w:type="spellEnd"/>
+      <w:r>
+        <w:rPr>
+          <w:rFonts w:asciiTheme="majorHAnsi" w:hAnsiTheme="majorHAnsi" w:cstheme="majorHAnsi"/>
+          <w:lang w:val="pt-BR"/>
+        </w:rPr>
+        <w:t xml:space="preserve"> pelo nome social para acesso a benefícios sociais.</w:t>
+      </w:r>
+    </w:p>
+    <w:p>
+      <w:pPr>
+        <w:pStyle w:val="Ttulo1"/>
+        <w:rPr>
+          <w:rFonts w:asciiTheme="majorHAnsi" w:eastAsia="Arial" w:hAnsiTheme="majorHAnsi" w:cstheme="majorHAnsi"/>
+          <w:b w:val="0"/>
+          <w:sz w:val="22"/>
+          <w:szCs w:val="22"/>
+          <w:lang w:val="pt-BR"/>
+        </w:rPr>
+      </w:pPr>
+      <w:r>
+        <w:rPr>
+          <w:rFonts w:asciiTheme="majorHAnsi" w:eastAsia="Arial" w:hAnsiTheme="majorHAnsi" w:cstheme="majorHAnsi"/>
+          <w:b w:val="0"/>
+          <w:sz w:val="22"/>
+          <w:szCs w:val="22"/>
+          <w:lang w:val="pt-BR"/>
+        </w:rPr>
+        <w:t>Violência Sexual</w:t>
+      </w:r>
+    </w:p>
+    <w:p>
+      <w:pPr>
+        <w:pStyle w:val="Ttulo2"/>
+        <w:rPr>
+          <w:rFonts w:asciiTheme="majorHAnsi" w:eastAsia="Arial" w:hAnsiTheme="majorHAnsi" w:cstheme="majorHAnsi"/>
+          <w:b w:val="0"/>
+          <w:sz w:val="22"/>
+          <w:szCs w:val="22"/>
+          <w:lang w:val="pt-BR"/>
+        </w:rPr>
+      </w:pPr>
+      <w:r>
+        <w:rPr>
+          <w:rFonts w:asciiTheme="majorHAnsi" w:eastAsia="Arial" w:hAnsiTheme="majorHAnsi" w:cstheme="majorHAnsi"/>
+          <w:b w:val="0"/>
+          <w:sz w:val="22"/>
+          <w:szCs w:val="22"/>
+          <w:lang w:val="pt-BR"/>
+        </w:rPr>
+        <w:lastRenderedPageBreak/>
+        <w:t xml:space="preserve">Violência sexual no contexto </w:t>
+      </w:r>
+      <w:proofErr w:type="spellStart"/>
+      <w:r>
+        <w:rPr>
+          <w:rFonts w:asciiTheme="majorHAnsi" w:eastAsia="Arial" w:hAnsiTheme="majorHAnsi" w:cstheme="majorHAnsi"/>
+          <w:b w:val="0"/>
+          <w:sz w:val="22"/>
+          <w:szCs w:val="22"/>
+          <w:lang w:val="pt-BR"/>
+        </w:rPr>
+        <w:t>trans</w:t>
+      </w:r>
+      <w:proofErr w:type="spellEnd"/>
+    </w:p>
+    <w:p>
+      <w:pPr>
+        <w:spacing w:after="120"/>
+        <w:rPr>
+          <w:rFonts w:asciiTheme="majorHAnsi" w:eastAsia="Arial" w:hAnsiTheme="majorHAnsi" w:cstheme="majorHAnsi"/>
+        </w:rPr>
+      </w:pPr>
+      <w:r>
+        <w:rPr>
+          <w:rFonts w:asciiTheme="majorHAnsi" w:hAnsiTheme="majorHAnsi" w:cstheme="majorHAnsi"/>
+          <w:lang w:val="pt-BR"/>
+        </w:rPr>
+        <w:t xml:space="preserve">Mulheres </w:t>
+      </w:r>
+      <w:proofErr w:type="spellStart"/>
+      <w:r>
+        <w:rPr>
+          <w:rFonts w:asciiTheme="majorHAnsi" w:hAnsiTheme="majorHAnsi" w:cstheme="majorHAnsi"/>
+          <w:lang w:val="pt-BR"/>
+        </w:rPr>
+        <w:t>trans</w:t>
+      </w:r>
+      <w:proofErr w:type="spellEnd"/>
+      <w:r>
+        <w:rPr>
+          <w:rFonts w:asciiTheme="majorHAnsi" w:hAnsiTheme="majorHAnsi" w:cstheme="majorHAnsi"/>
+          <w:lang w:val="pt-BR"/>
+        </w:rPr>
+        <w:t xml:space="preserve"> são vítimas de violência sexual dentro e fora do lar. </w:t>
+      </w:r>
+      <w:r>
+        <w:rPr>
+          <w:rFonts w:asciiTheme="majorHAnsi" w:hAnsiTheme="majorHAnsi" w:cstheme="majorHAnsi"/>
+        </w:rPr>
+        <w:t xml:space="preserve">No contexto doméstico, </w:t>
+      </w:r>
+      <w:proofErr w:type="spellStart"/>
+      <w:r>
+        <w:rPr>
+          <w:rFonts w:asciiTheme="majorHAnsi" w:hAnsiTheme="majorHAnsi" w:cstheme="majorHAnsi"/>
+        </w:rPr>
+        <w:t>são</w:t>
+      </w:r>
+      <w:proofErr w:type="spellEnd"/>
+      <w:r>
+        <w:rPr>
+          <w:rFonts w:asciiTheme="majorHAnsi" w:hAnsiTheme="majorHAnsi" w:cstheme="majorHAnsi"/>
+        </w:rPr>
+        <w:t xml:space="preserve"> formas de </w:t>
+      </w:r>
+      <w:proofErr w:type="spellStart"/>
+      <w:r>
+        <w:rPr>
+          <w:rFonts w:asciiTheme="majorHAnsi" w:hAnsiTheme="majorHAnsi" w:cstheme="majorHAnsi"/>
+        </w:rPr>
+        <w:t>violência</w:t>
+      </w:r>
+      <w:proofErr w:type="spellEnd"/>
+      <w:r>
+        <w:rPr>
+          <w:rFonts w:asciiTheme="majorHAnsi" w:hAnsiTheme="majorHAnsi" w:cstheme="majorHAnsi"/>
+        </w:rPr>
+        <w:t xml:space="preserve"> sexual:</w:t>
+      </w:r>
+    </w:p>
+    <w:p>
+      <w:pPr>
+        <w:spacing w:after="80"/>
+        <w:rPr>
+          <w:rFonts w:asciiTheme="majorHAnsi" w:hAnsiTheme="majorHAnsi" w:cstheme="majorHAnsi"/>
+          <w:lang w:val="pt-BR"/>
+        </w:rPr>
+      </w:pPr>
+      <w:r>
+        <w:rPr>
+          <w:rFonts w:asciiTheme="majorHAnsi" w:hAnsiTheme="majorHAnsi" w:cstheme="majorHAnsi"/>
+          <w:lang w:val="pt-BR"/>
+        </w:rPr>
+        <w:t xml:space="preserve">Forçar práticas sexuais não consentidas, inclusive associadas à </w:t>
+      </w:r>
+      <w:proofErr w:type="spellStart"/>
+      <w:r>
+        <w:rPr>
+          <w:rFonts w:asciiTheme="majorHAnsi" w:hAnsiTheme="majorHAnsi" w:cstheme="majorHAnsi"/>
+          <w:lang w:val="pt-BR"/>
+        </w:rPr>
+        <w:t>fetichização</w:t>
+      </w:r>
+      <w:proofErr w:type="spellEnd"/>
+      <w:r>
+        <w:rPr>
+          <w:rFonts w:asciiTheme="majorHAnsi" w:hAnsiTheme="majorHAnsi" w:cstheme="majorHAnsi"/>
+          <w:lang w:val="pt-BR"/>
+        </w:rPr>
+        <w:t xml:space="preserve"> do corpo trans.</w:t>
+      </w:r>
+    </w:p>
+    <w:p>
+      <w:pPr>
+        <w:spacing w:after="80"/>
+        <w:rPr>
+          <w:rFonts w:asciiTheme="majorHAnsi" w:hAnsiTheme="majorHAnsi" w:cstheme="majorHAnsi"/>
+          <w:lang w:val="pt-BR"/>
+        </w:rPr>
+      </w:pPr>
+      <w:r>
+        <w:rPr>
+          <w:rFonts w:asciiTheme="majorHAnsi" w:hAnsiTheme="majorHAnsi" w:cstheme="majorHAnsi"/>
+          <w:lang w:val="pt-BR"/>
+        </w:rPr>
+        <w:t>Ameaçar divulgar imagens íntimas caso a mulher não ceda a exigências sexuais (</w:t>
+      </w:r>
+      <w:proofErr w:type="spellStart"/>
+      <w:r>
+        <w:rPr>
+          <w:rFonts w:asciiTheme="majorHAnsi" w:hAnsiTheme="majorHAnsi" w:cstheme="majorHAnsi"/>
+          <w:lang w:val="pt-BR"/>
+        </w:rPr>
+        <w:t>revenge</w:t>
+      </w:r>
+      <w:proofErr w:type="spellEnd"/>
+      <w:r>
+        <w:rPr>
+          <w:rFonts w:asciiTheme="majorHAnsi" w:hAnsiTheme="majorHAnsi" w:cstheme="majorHAnsi"/>
+          <w:lang w:val="pt-BR"/>
+        </w:rPr>
+        <w:t xml:space="preserve"> </w:t>
+      </w:r>
+      <w:proofErr w:type="spellStart"/>
+      <w:r>
+        <w:rPr>
+          <w:rFonts w:asciiTheme="majorHAnsi" w:hAnsiTheme="majorHAnsi" w:cstheme="majorHAnsi"/>
+          <w:lang w:val="pt-BR"/>
+        </w:rPr>
+        <w:t>porn</w:t>
+      </w:r>
+      <w:proofErr w:type="spellEnd"/>
+      <w:r>
+        <w:rPr>
+          <w:rFonts w:asciiTheme="majorHAnsi" w:hAnsiTheme="majorHAnsi" w:cstheme="majorHAnsi"/>
+          <w:lang w:val="pt-BR"/>
+        </w:rPr>
+        <w:t xml:space="preserve"> / </w:t>
+      </w:r>
+      <w:proofErr w:type="spellStart"/>
+      <w:r>
+        <w:rPr>
+          <w:rFonts w:asciiTheme="majorHAnsi" w:hAnsiTheme="majorHAnsi" w:cstheme="majorHAnsi"/>
+          <w:lang w:val="pt-BR"/>
+        </w:rPr>
+        <w:t>sextorsão</w:t>
+      </w:r>
+      <w:proofErr w:type="spellEnd"/>
+      <w:r>
+        <w:rPr>
+          <w:rFonts w:asciiTheme="majorHAnsi" w:hAnsiTheme="majorHAnsi" w:cstheme="majorHAnsi"/>
+          <w:lang w:val="pt-BR"/>
+        </w:rPr>
+        <w:t>).</w:t>
+      </w:r>
+    </w:p>
+    <w:p>
+      <w:pPr>
+        <w:spacing w:after="80"/>
+        <w:rPr>
+          <w:rFonts w:asciiTheme="majorHAnsi" w:hAnsiTheme="majorHAnsi" w:cstheme="majorHAnsi"/>
+          <w:lang w:val="pt-BR"/>
+        </w:rPr>
+      </w:pPr>
+      <w:r>
+        <w:rPr>
+          <w:rFonts w:asciiTheme="majorHAnsi" w:hAnsiTheme="majorHAnsi" w:cstheme="majorHAnsi"/>
+          <w:lang w:val="pt-BR"/>
+        </w:rPr>
+        <w:t xml:space="preserve">Coagir a práticas sexuais usando a ameaça de </w:t>
+      </w:r>
+      <w:proofErr w:type="spellStart"/>
+      <w:r>
+        <w:rPr>
+          <w:rFonts w:asciiTheme="majorHAnsi" w:hAnsiTheme="majorHAnsi" w:cstheme="majorHAnsi"/>
+          <w:lang w:val="pt-BR"/>
+        </w:rPr>
+        <w:t>outing</w:t>
+      </w:r>
+      <w:proofErr w:type="spellEnd"/>
+      <w:r>
+        <w:rPr>
+          <w:rFonts w:asciiTheme="majorHAnsi" w:hAnsiTheme="majorHAnsi" w:cstheme="majorHAnsi"/>
+          <w:lang w:val="pt-BR"/>
+        </w:rPr>
+        <w:t xml:space="preserve"> como instrumento.</w:t>
+      </w:r>
+    </w:p>
+    <w:p>
+      <w:pPr>
+        <w:pStyle w:val="Ttulo2"/>
+        <w:rPr>
+          <w:rFonts w:asciiTheme="majorHAnsi" w:eastAsia="Arial" w:hAnsiTheme="majorHAnsi" w:cstheme="majorHAnsi"/>
+          <w:b w:val="0"/>
+          <w:sz w:val="22"/>
+          <w:szCs w:val="22"/>
+          <w:lang w:val="pt-BR"/>
+        </w:rPr>
+      </w:pPr>
+      <w:r>
+        <w:rPr>
+          <w:rFonts w:asciiTheme="majorHAnsi" w:eastAsia="Arial" w:hAnsiTheme="majorHAnsi" w:cstheme="majorHAnsi"/>
+          <w:b w:val="0"/>
+          <w:sz w:val="22"/>
+          <w:szCs w:val="22"/>
+          <w:lang w:val="pt-BR"/>
+        </w:rPr>
+        <w:t>Atendimento especializado</w:t>
+      </w:r>
+    </w:p>
+    <w:p>
+      <w:pPr>
+        <w:spacing w:after="120"/>
+        <w:rPr>
+          <w:rFonts w:asciiTheme="majorHAnsi" w:eastAsia="Arial" w:hAnsiTheme="majorHAnsi" w:cstheme="majorHAnsi"/>
+          <w:lang w:val="pt-BR"/>
+        </w:rPr>
+      </w:pPr>
+      <w:r>
+        <w:rPr>
+          <w:rFonts w:asciiTheme="majorHAnsi" w:hAnsiTheme="majorHAnsi" w:cstheme="majorHAnsi"/>
+          <w:lang w:val="pt-BR"/>
+        </w:rPr>
+        <w:t xml:space="preserve">A mulher </w:t>
+      </w:r>
+      <w:proofErr w:type="spellStart"/>
+      <w:r>
+        <w:rPr>
+          <w:rFonts w:asciiTheme="majorHAnsi" w:hAnsiTheme="majorHAnsi" w:cstheme="majorHAnsi"/>
+          <w:lang w:val="pt-BR"/>
+        </w:rPr>
+        <w:t>trans</w:t>
+      </w:r>
+      <w:proofErr w:type="spellEnd"/>
+      <w:r>
+        <w:rPr>
+          <w:rFonts w:asciiTheme="majorHAnsi" w:hAnsiTheme="majorHAnsi" w:cstheme="majorHAnsi"/>
+          <w:lang w:val="pt-BR"/>
+        </w:rPr>
+        <w:t xml:space="preserve"> vítima de violência sexual tem direito ao atendimento nos serviços de referência, incluindo profilaxia pós-exposição e atendimento médico pelo SUS, pelo nome social.</w:t>
+      </w:r>
+    </w:p>
+    <w:p>
+      <w:pPr>
+        <w:spacing w:after="120"/>
+        <w:rPr>
+          <w:rFonts w:asciiTheme="majorHAnsi" w:hAnsiTheme="majorHAnsi" w:cstheme="majorHAnsi"/>
+          <w:lang w:val="pt-BR"/>
+        </w:rPr>
+      </w:pPr>
+      <w:r>
+        <w:rPr>
+          <w:rFonts w:asciiTheme="majorHAnsi" w:hAnsiTheme="majorHAnsi" w:cstheme="majorHAnsi"/>
+          <w:lang w:val="pt-BR"/>
+        </w:rPr>
+        <w:t>A Defensoria pode acompanhar o caso e acionar o Ministério Público se o atendimento for negado por motivo de discriminação.</w:t>
+      </w:r>
+    </w:p>
+    <w:p>
+      <w:pPr>
+        <w:pBdr>
+          <w:bottom w:val="single" w:sz="4" w:space="1" w:color="CCCCCC"/>
+        </w:pBdr>
+        <w:spacing w:before="200" w:after="200"/>
+        <w:rPr>
+          <w:rFonts w:asciiTheme="majorHAnsi" w:hAnsiTheme="majorHAnsi" w:cstheme="majorHAnsi"/>
+          <w:lang w:val="pt-BR"/>
+        </w:rPr>
+      </w:pPr>
+    </w:p>
+    <w:p>
+      <w:pPr>
+        <w:pStyle w:val="Ttulo1"/>
+        <w:rPr>
+          <w:rFonts w:asciiTheme="majorHAnsi" w:eastAsia="Arial" w:hAnsiTheme="majorHAnsi" w:cstheme="majorHAnsi"/>
+          <w:b w:val="0"/>
+          <w:sz w:val="22"/>
+          <w:szCs w:val="22"/>
+          <w:lang w:val="pt-BR"/>
+        </w:rPr>
+      </w:pPr>
+      <w:proofErr w:type="spellStart"/>
+      <w:r>
+        <w:rPr>
+          <w:rFonts w:asciiTheme="majorHAnsi" w:eastAsia="Arial" w:hAnsiTheme="majorHAnsi" w:cstheme="majorHAnsi"/>
+          <w:b w:val="0"/>
+          <w:sz w:val="22"/>
+          <w:szCs w:val="22"/>
+          <w:lang w:val="pt-BR"/>
+        </w:rPr>
+        <w:t>Stalking</w:t>
+      </w:r>
+      <w:proofErr w:type="spellEnd"/>
+      <w:r>
+        <w:rPr>
+          <w:rFonts w:asciiTheme="majorHAnsi" w:eastAsia="Arial" w:hAnsiTheme="majorHAnsi" w:cstheme="majorHAnsi"/>
+          <w:b w:val="0"/>
+          <w:sz w:val="22"/>
+          <w:szCs w:val="22"/>
+          <w:lang w:val="pt-BR"/>
+        </w:rPr>
+        <w:t xml:space="preserve"> e Perseguição</w:t>
+      </w:r>
+    </w:p>
+    <w:p>
+      <w:pPr>
+        <w:pStyle w:val="Ttulo2"/>
+        <w:rPr>
+          <w:rFonts w:asciiTheme="majorHAnsi" w:eastAsia="Arial" w:hAnsiTheme="majorHAnsi" w:cstheme="majorHAnsi"/>
+          <w:b w:val="0"/>
+          <w:sz w:val="22"/>
+          <w:szCs w:val="22"/>
+          <w:lang w:val="pt-BR"/>
+        </w:rPr>
+      </w:pPr>
+      <w:r>
+        <w:rPr>
+          <w:rFonts w:asciiTheme="majorHAnsi" w:eastAsia="Arial" w:hAnsiTheme="majorHAnsi" w:cstheme="majorHAnsi"/>
+          <w:b w:val="0"/>
+          <w:sz w:val="22"/>
+          <w:szCs w:val="22"/>
+          <w:lang w:val="pt-BR"/>
+        </w:rPr>
+        <w:t xml:space="preserve">Perseguição contra mulheres </w:t>
+      </w:r>
+      <w:proofErr w:type="spellStart"/>
+      <w:r>
+        <w:rPr>
+          <w:rFonts w:asciiTheme="majorHAnsi" w:eastAsia="Arial" w:hAnsiTheme="majorHAnsi" w:cstheme="majorHAnsi"/>
+          <w:b w:val="0"/>
+          <w:sz w:val="22"/>
+          <w:szCs w:val="22"/>
+          <w:lang w:val="pt-BR"/>
+        </w:rPr>
+        <w:t>trans</w:t>
+      </w:r>
+      <w:proofErr w:type="spellEnd"/>
+    </w:p>
+    <w:p>
+      <w:pPr>
+        <w:spacing w:after="120"/>
+        <w:rPr>
+          <w:rFonts w:asciiTheme="majorHAnsi" w:eastAsia="Arial" w:hAnsiTheme="majorHAnsi" w:cstheme="majorHAnsi"/>
+        </w:rPr>
+      </w:pPr>
+      <w:r>
+        <w:rPr>
+          <w:rFonts w:asciiTheme="majorHAnsi" w:hAnsiTheme="majorHAnsi" w:cstheme="majorHAnsi"/>
+          <w:lang w:val="pt-BR"/>
+        </w:rPr>
+        <w:t>O crime de perseguição (</w:t>
+      </w:r>
+      <w:proofErr w:type="spellStart"/>
+      <w:r>
+        <w:rPr>
+          <w:rFonts w:asciiTheme="majorHAnsi" w:hAnsiTheme="majorHAnsi" w:cstheme="majorHAnsi"/>
+          <w:lang w:val="pt-BR"/>
+        </w:rPr>
+        <w:t>stalking</w:t>
+      </w:r>
+      <w:proofErr w:type="spellEnd"/>
+      <w:r>
+        <w:rPr>
+          <w:rFonts w:asciiTheme="majorHAnsi" w:hAnsiTheme="majorHAnsi" w:cstheme="majorHAnsi"/>
+          <w:lang w:val="pt-BR"/>
+        </w:rPr>
+        <w:t xml:space="preserve">), previsto no Art. 147-A do Código Penal, se aplica quando alguém persegue ou vigia reiteradamente a vítima. </w:t>
+      </w:r>
+      <w:r>
+        <w:rPr>
+          <w:rFonts w:asciiTheme="majorHAnsi" w:hAnsiTheme="majorHAnsi" w:cstheme="majorHAnsi"/>
+        </w:rPr>
+        <w:t>No contexto trans, pode incluir:</w:t>
+      </w:r>
+    </w:p>
+    <w:p>
+      <w:pPr>
+        <w:spacing w:after="80"/>
+        <w:rPr>
+          <w:rFonts w:asciiTheme="majorHAnsi" w:hAnsiTheme="majorHAnsi" w:cstheme="majorHAnsi"/>
+          <w:lang w:val="pt-BR"/>
+        </w:rPr>
+      </w:pPr>
+      <w:r>
+        <w:rPr>
+          <w:rFonts w:asciiTheme="majorHAnsi" w:hAnsiTheme="majorHAnsi" w:cstheme="majorHAnsi"/>
+          <w:lang w:val="pt-BR"/>
+        </w:rPr>
+        <w:t xml:space="preserve">Vigiar os locais frequentados pela mulher </w:t>
+      </w:r>
+      <w:proofErr w:type="spellStart"/>
+      <w:r>
+        <w:rPr>
+          <w:rFonts w:asciiTheme="majorHAnsi" w:hAnsiTheme="majorHAnsi" w:cstheme="majorHAnsi"/>
+          <w:lang w:val="pt-BR"/>
+        </w:rPr>
+        <w:t>trans</w:t>
+      </w:r>
+      <w:proofErr w:type="spellEnd"/>
+      <w:r>
+        <w:rPr>
+          <w:rFonts w:asciiTheme="majorHAnsi" w:hAnsiTheme="majorHAnsi" w:cstheme="majorHAnsi"/>
+          <w:lang w:val="pt-BR"/>
+        </w:rPr>
+        <w:t>, especialmente espaços LGBTQIA+.</w:t>
+      </w:r>
+    </w:p>
+    <w:p>
+      <w:pPr>
+        <w:spacing w:after="80"/>
+        <w:rPr>
+          <w:rFonts w:asciiTheme="majorHAnsi" w:hAnsiTheme="majorHAnsi" w:cstheme="majorHAnsi"/>
+          <w:lang w:val="pt-BR"/>
+        </w:rPr>
+      </w:pPr>
+      <w:r>
+        <w:rPr>
+          <w:rFonts w:asciiTheme="majorHAnsi" w:hAnsiTheme="majorHAnsi" w:cstheme="majorHAnsi"/>
+          <w:lang w:val="pt-BR"/>
+        </w:rPr>
+        <w:t>Monitorar redes sociais ou perfis online com identidade feminina.</w:t>
+      </w:r>
+    </w:p>
+    <w:p>
+      <w:pPr>
+        <w:spacing w:after="80"/>
+        <w:rPr>
+          <w:rFonts w:asciiTheme="majorHAnsi" w:hAnsiTheme="majorHAnsi" w:cstheme="majorHAnsi"/>
+          <w:lang w:val="pt-BR"/>
+        </w:rPr>
+      </w:pPr>
+      <w:r>
+        <w:rPr>
+          <w:rFonts w:asciiTheme="majorHAnsi" w:hAnsiTheme="majorHAnsi" w:cstheme="majorHAnsi"/>
+          <w:lang w:val="pt-BR"/>
+        </w:rPr>
+        <w:t xml:space="preserve">Ameaçar expor publicamente a identidade </w:t>
+      </w:r>
+      <w:proofErr w:type="spellStart"/>
+      <w:r>
+        <w:rPr>
+          <w:rFonts w:asciiTheme="majorHAnsi" w:hAnsiTheme="majorHAnsi" w:cstheme="majorHAnsi"/>
+          <w:lang w:val="pt-BR"/>
+        </w:rPr>
+        <w:t>trans</w:t>
+      </w:r>
+      <w:proofErr w:type="spellEnd"/>
+      <w:r>
+        <w:rPr>
+          <w:rFonts w:asciiTheme="majorHAnsi" w:hAnsiTheme="majorHAnsi" w:cstheme="majorHAnsi"/>
+          <w:lang w:val="pt-BR"/>
+        </w:rPr>
+        <w:t xml:space="preserve"> em locais frequentados.</w:t>
+      </w:r>
+    </w:p>
+    <w:p>
+      <w:pPr>
+        <w:spacing w:after="80"/>
+        <w:rPr>
+          <w:rFonts w:asciiTheme="majorHAnsi" w:hAnsiTheme="majorHAnsi" w:cstheme="majorHAnsi"/>
+          <w:lang w:val="pt-BR"/>
+        </w:rPr>
+      </w:pPr>
+      <w:proofErr w:type="spellStart"/>
+      <w:r>
+        <w:rPr>
+          <w:rFonts w:asciiTheme="majorHAnsi" w:hAnsiTheme="majorHAnsi" w:cstheme="majorHAnsi"/>
+          <w:lang w:val="pt-BR"/>
+        </w:rPr>
+        <w:t>Contactar</w:t>
+      </w:r>
+      <w:proofErr w:type="spellEnd"/>
+      <w:r>
+        <w:rPr>
+          <w:rFonts w:asciiTheme="majorHAnsi" w:hAnsiTheme="majorHAnsi" w:cstheme="majorHAnsi"/>
+          <w:lang w:val="pt-BR"/>
+        </w:rPr>
+        <w:t xml:space="preserve"> continuamente a mulher após separação com ameaças relacionadas à sua identidade.</w:t>
+      </w:r>
+    </w:p>
+    <w:p>
+      <w:pPr>
+        <w:pStyle w:val="Ttulo2"/>
+        <w:rPr>
+          <w:rFonts w:asciiTheme="majorHAnsi" w:eastAsia="Arial" w:hAnsiTheme="majorHAnsi" w:cstheme="majorHAnsi"/>
+          <w:b w:val="0"/>
+          <w:sz w:val="22"/>
+          <w:szCs w:val="22"/>
+        </w:rPr>
+      </w:pPr>
+      <w:r>
+        <w:rPr>
+          <w:rFonts w:asciiTheme="majorHAnsi" w:eastAsia="Arial" w:hAnsiTheme="majorHAnsi" w:cstheme="majorHAnsi"/>
+          <w:b w:val="0"/>
+          <w:sz w:val="22"/>
+          <w:szCs w:val="22"/>
+        </w:rPr>
+        <w:t xml:space="preserve">Como </w:t>
+      </w:r>
+      <w:proofErr w:type="spellStart"/>
+      <w:r>
+        <w:rPr>
+          <w:rFonts w:asciiTheme="majorHAnsi" w:eastAsia="Arial" w:hAnsiTheme="majorHAnsi" w:cstheme="majorHAnsi"/>
+          <w:b w:val="0"/>
+          <w:sz w:val="22"/>
+          <w:szCs w:val="22"/>
+        </w:rPr>
+        <w:t>agir</w:t>
+      </w:r>
+      <w:proofErr w:type="spellEnd"/>
+    </w:p>
+    <w:p>
+      <w:pPr>
+        <w:spacing w:after="80"/>
+        <w:rPr>
+          <w:rFonts w:asciiTheme="majorHAnsi" w:eastAsia="Arial" w:hAnsiTheme="majorHAnsi" w:cstheme="majorHAnsi"/>
+          <w:lang w:val="pt-BR"/>
+        </w:rPr>
+      </w:pPr>
+      <w:r>
+        <w:rPr>
+          <w:rFonts w:asciiTheme="majorHAnsi" w:hAnsiTheme="majorHAnsi" w:cstheme="majorHAnsi"/>
+          <w:lang w:val="pt-BR"/>
+        </w:rPr>
+        <w:t>Registrar boletim de ocorrência descrevendo os episódios com datas.</w:t>
+      </w:r>
+    </w:p>
+    <w:p>
+      <w:pPr>
+        <w:spacing w:after="80"/>
+        <w:rPr>
+          <w:rFonts w:asciiTheme="majorHAnsi" w:hAnsiTheme="majorHAnsi" w:cstheme="majorHAnsi"/>
+          <w:lang w:val="pt-BR"/>
+        </w:rPr>
+      </w:pPr>
+      <w:r>
+        <w:rPr>
+          <w:rFonts w:asciiTheme="majorHAnsi" w:hAnsiTheme="majorHAnsi" w:cstheme="majorHAnsi"/>
+          <w:lang w:val="pt-BR"/>
+        </w:rPr>
+        <w:t>Guardar provas digitais: prints de mensagens, e-mails, chamadas.</w:t>
+      </w:r>
+    </w:p>
+    <w:p>
+      <w:pPr>
+        <w:spacing w:after="80"/>
+        <w:rPr>
+          <w:rFonts w:asciiTheme="majorHAnsi" w:hAnsiTheme="majorHAnsi" w:cstheme="majorHAnsi"/>
+          <w:lang w:val="pt-BR"/>
+        </w:rPr>
+      </w:pPr>
+      <w:r>
+        <w:rPr>
+          <w:rFonts w:asciiTheme="majorHAnsi" w:hAnsiTheme="majorHAnsi" w:cstheme="majorHAnsi"/>
+          <w:lang w:val="pt-BR"/>
+        </w:rPr>
+        <w:t>Solicitar medida protetiva de proibição de aproximação e contato.</w:t>
+      </w:r>
+    </w:p>
+    <w:p>
+      <w:pPr>
+        <w:spacing w:after="80"/>
+        <w:rPr>
+          <w:rFonts w:asciiTheme="majorHAnsi" w:hAnsiTheme="majorHAnsi" w:cstheme="majorHAnsi"/>
+          <w:lang w:val="pt-BR"/>
+        </w:rPr>
+      </w:pPr>
+      <w:r>
+        <w:rPr>
+          <w:rFonts w:asciiTheme="majorHAnsi" w:hAnsiTheme="majorHAnsi" w:cstheme="majorHAnsi"/>
+          <w:lang w:val="pt-BR"/>
+        </w:rPr>
+        <w:t>Comunicar à Defensoria Pública para acompanhamento jurídico.</w:t>
+      </w:r>
+    </w:p>
+    <w:p>
+      <w:pPr>
+        <w:pBdr>
+          <w:bottom w:val="single" w:sz="4" w:space="1" w:color="CCCCCC"/>
+        </w:pBdr>
+        <w:spacing w:before="200" w:after="200"/>
+        <w:rPr>
+          <w:rFonts w:asciiTheme="majorHAnsi" w:hAnsiTheme="majorHAnsi" w:cstheme="majorHAnsi"/>
+          <w:lang w:val="pt-BR"/>
+        </w:rPr>
+      </w:pPr>
+    </w:p>
+    <w:p>
+      <w:pPr>
+        <w:pStyle w:val="Ttulo1"/>
+        <w:rPr>
+          <w:rFonts w:asciiTheme="majorHAnsi" w:eastAsia="Arial" w:hAnsiTheme="majorHAnsi" w:cstheme="majorHAnsi"/>
+          <w:b w:val="0"/>
+          <w:sz w:val="22"/>
+          <w:szCs w:val="22"/>
+          <w:lang w:val="pt-BR"/>
+        </w:rPr>
+      </w:pPr>
+      <w:r>
+        <w:rPr>
+          <w:rFonts w:asciiTheme="majorHAnsi" w:eastAsia="Arial" w:hAnsiTheme="majorHAnsi" w:cstheme="majorHAnsi"/>
+          <w:b w:val="0"/>
+          <w:sz w:val="22"/>
+          <w:szCs w:val="22"/>
+          <w:lang w:val="pt-BR"/>
+        </w:rPr>
+        <w:t>Canais de Atendimento e Rede de Proteção</w:t>
+      </w:r>
+    </w:p>
+    <w:p>
+      <w:pPr>
+        <w:pStyle w:val="Ttulo2"/>
+        <w:rPr>
+          <w:rFonts w:asciiTheme="majorHAnsi" w:eastAsia="Arial" w:hAnsiTheme="majorHAnsi" w:cstheme="majorHAnsi"/>
+          <w:b w:val="0"/>
+          <w:sz w:val="22"/>
+          <w:szCs w:val="22"/>
+          <w:lang w:val="pt-BR"/>
+        </w:rPr>
+      </w:pPr>
+      <w:r>
+        <w:rPr>
+          <w:rFonts w:asciiTheme="majorHAnsi" w:eastAsia="Arial" w:hAnsiTheme="majorHAnsi" w:cstheme="majorHAnsi"/>
+          <w:b w:val="0"/>
+          <w:sz w:val="22"/>
+          <w:szCs w:val="22"/>
+          <w:lang w:val="pt-BR"/>
+        </w:rPr>
+        <w:t>Canais de emergência e denúncia</w:t>
+      </w:r>
+    </w:p>
+    <w:p>
+      <w:pPr>
+        <w:spacing w:after="120"/>
+        <w:rPr>
+          <w:rFonts w:asciiTheme="majorHAnsi" w:eastAsia="Arial" w:hAnsiTheme="majorHAnsi" w:cstheme="majorHAnsi"/>
+          <w:lang w:val="pt-BR"/>
+        </w:rPr>
+      </w:pPr>
+      <w:r>
+        <w:rPr>
+          <w:rFonts w:asciiTheme="majorHAnsi" w:hAnsiTheme="majorHAnsi" w:cstheme="majorHAnsi"/>
+          <w:bCs/>
+          <w:lang w:val="pt-BR"/>
+        </w:rPr>
+        <w:lastRenderedPageBreak/>
+        <w:t xml:space="preserve">190: </w:t>
+      </w:r>
+      <w:r>
+        <w:rPr>
+          <w:rFonts w:asciiTheme="majorHAnsi" w:hAnsiTheme="majorHAnsi" w:cstheme="majorHAnsi"/>
+          <w:lang w:val="pt-BR"/>
+        </w:rPr>
+        <w:t xml:space="preserve">Polícia Militar - </w:t>
+      </w:r>
+      <w:proofErr w:type="spellStart"/>
+      <w:r>
+        <w:rPr>
+          <w:rFonts w:asciiTheme="majorHAnsi" w:hAnsiTheme="majorHAnsi" w:cstheme="majorHAnsi"/>
+          <w:lang w:val="pt-BR"/>
+        </w:rPr>
+        <w:t>emergênncias</w:t>
+      </w:r>
+      <w:proofErr w:type="spellEnd"/>
+      <w:r>
+        <w:rPr>
+          <w:rFonts w:asciiTheme="majorHAnsi" w:hAnsiTheme="majorHAnsi" w:cstheme="majorHAnsi"/>
+          <w:lang w:val="pt-BR"/>
+        </w:rPr>
+        <w:t xml:space="preserve"> imediatas.</w:t>
+      </w:r>
+    </w:p>
+    <w:p>
+      <w:pPr>
+        <w:spacing w:after="120"/>
+        <w:rPr>
+          <w:rFonts w:asciiTheme="majorHAnsi" w:hAnsiTheme="majorHAnsi" w:cstheme="majorHAnsi"/>
+          <w:lang w:val="pt-BR"/>
+        </w:rPr>
+      </w:pPr>
+      <w:r>
+        <w:rPr>
+          <w:rFonts w:asciiTheme="majorHAnsi" w:hAnsiTheme="majorHAnsi" w:cstheme="majorHAnsi"/>
+          <w:bCs/>
+          <w:lang w:val="pt-BR"/>
+        </w:rPr>
+        <w:t xml:space="preserve">180: </w:t>
+      </w:r>
+      <w:r>
+        <w:rPr>
+          <w:rFonts w:asciiTheme="majorHAnsi" w:hAnsiTheme="majorHAnsi" w:cstheme="majorHAnsi"/>
+          <w:lang w:val="pt-BR"/>
+        </w:rPr>
+        <w:t>Central de Atendimento à Mulher - orientação e denúncia (funciona 24h).</w:t>
+      </w:r>
+    </w:p>
+    <w:p>
+      <w:pPr>
+        <w:spacing w:after="120"/>
+        <w:rPr>
+          <w:rFonts w:asciiTheme="majorHAnsi" w:hAnsiTheme="majorHAnsi" w:cstheme="majorHAnsi"/>
+          <w:lang w:val="pt-BR"/>
+        </w:rPr>
+      </w:pPr>
+      <w:r>
+        <w:rPr>
+          <w:rFonts w:asciiTheme="majorHAnsi" w:hAnsiTheme="majorHAnsi" w:cstheme="majorHAnsi"/>
+          <w:bCs/>
+          <w:lang w:val="pt-BR"/>
+        </w:rPr>
+        <w:t xml:space="preserve">Disque 100: </w:t>
+      </w:r>
+      <w:r>
+        <w:rPr>
+          <w:rFonts w:asciiTheme="majorHAnsi" w:hAnsiTheme="majorHAnsi" w:cstheme="majorHAnsi"/>
+          <w:lang w:val="pt-BR"/>
+        </w:rPr>
+        <w:t xml:space="preserve">Direitos Humanos - violações contra pessoas LGBTQIA+ e grupos </w:t>
+      </w:r>
+      <w:proofErr w:type="spellStart"/>
+      <w:r>
+        <w:rPr>
+          <w:rFonts w:asciiTheme="majorHAnsi" w:hAnsiTheme="majorHAnsi" w:cstheme="majorHAnsi"/>
+          <w:lang w:val="pt-BR"/>
+        </w:rPr>
+        <w:t>vulnerabilizados</w:t>
+      </w:r>
+      <w:proofErr w:type="spellEnd"/>
+      <w:r>
+        <w:rPr>
+          <w:rFonts w:asciiTheme="majorHAnsi" w:hAnsiTheme="majorHAnsi" w:cstheme="majorHAnsi"/>
+          <w:lang w:val="pt-BR"/>
+        </w:rPr>
+        <w:t>.</w:t>
+      </w:r>
+    </w:p>
+    <w:p>
+      <w:pPr>
+        <w:spacing w:after="120"/>
+        <w:rPr>
+          <w:rFonts w:asciiTheme="majorHAnsi" w:hAnsiTheme="majorHAnsi" w:cstheme="majorHAnsi"/>
+          <w:lang w:val="pt-BR"/>
+        </w:rPr>
+      </w:pPr>
+      <w:r>
+        <w:rPr>
+          <w:rFonts w:asciiTheme="majorHAnsi" w:hAnsiTheme="majorHAnsi" w:cstheme="majorHAnsi"/>
+          <w:bCs/>
+          <w:lang w:val="pt-BR"/>
+        </w:rPr>
+        <w:t xml:space="preserve">197: </w:t>
+      </w:r>
+      <w:r>
+        <w:rPr>
+          <w:rFonts w:asciiTheme="majorHAnsi" w:hAnsiTheme="majorHAnsi" w:cstheme="majorHAnsi"/>
+          <w:lang w:val="pt-BR"/>
+        </w:rPr>
+        <w:t>Polícia Civil - denúncias gerais.</w:t>
+      </w:r>
+    </w:p>
+    <w:p>
+      <w:pPr>
+        <w:pStyle w:val="Ttulo2"/>
+        <w:rPr>
+          <w:rFonts w:asciiTheme="majorHAnsi" w:eastAsia="Arial" w:hAnsiTheme="majorHAnsi" w:cstheme="majorHAnsi"/>
+          <w:b w:val="0"/>
+          <w:sz w:val="22"/>
+          <w:szCs w:val="22"/>
+          <w:lang w:val="pt-BR"/>
+        </w:rPr>
+      </w:pPr>
+      <w:r>
+        <w:rPr>
+          <w:rFonts w:asciiTheme="majorHAnsi" w:eastAsia="Arial" w:hAnsiTheme="majorHAnsi" w:cstheme="majorHAnsi"/>
+          <w:b w:val="0"/>
+          <w:sz w:val="22"/>
+          <w:szCs w:val="22"/>
+          <w:lang w:val="pt-BR"/>
+        </w:rPr>
+        <w:t xml:space="preserve"> Atendimento na Defensoria Pública do Pará</w:t>
+      </w:r>
+    </w:p>
+    <w:p>
+      <w:pPr>
+        <w:spacing w:after="120"/>
+        <w:rPr>
+          <w:rFonts w:asciiTheme="majorHAnsi" w:eastAsia="Arial" w:hAnsiTheme="majorHAnsi" w:cstheme="majorHAnsi"/>
+          <w:lang w:val="pt-BR"/>
+        </w:rPr>
+      </w:pPr>
+      <w:r>
+        <w:rPr>
+          <w:rFonts w:asciiTheme="majorHAnsi" w:hAnsiTheme="majorHAnsi" w:cstheme="majorHAnsi"/>
+          <w:lang w:val="pt-BR"/>
+        </w:rPr>
+        <w:t xml:space="preserve">A mulher </w:t>
+      </w:r>
+      <w:proofErr w:type="spellStart"/>
+      <w:r>
+        <w:rPr>
+          <w:rFonts w:asciiTheme="majorHAnsi" w:hAnsiTheme="majorHAnsi" w:cstheme="majorHAnsi"/>
+          <w:lang w:val="pt-BR"/>
+        </w:rPr>
+        <w:t>trans</w:t>
+      </w:r>
+      <w:proofErr w:type="spellEnd"/>
+      <w:r>
+        <w:rPr>
+          <w:rFonts w:asciiTheme="majorHAnsi" w:hAnsiTheme="majorHAnsi" w:cstheme="majorHAnsi"/>
+          <w:lang w:val="pt-BR"/>
+        </w:rPr>
+        <w:t xml:space="preserve"> pode buscar atendimento na Defensoria Pública sem precisar decidir sobre denunciar imediatamente. O atendimento é gratuito, sigiloso e realizado pelo nome social.</w:t>
+      </w:r>
+    </w:p>
+    <w:p>
+      <w:pPr>
+        <w:spacing w:after="80"/>
+        <w:rPr>
+          <w:rFonts w:asciiTheme="majorHAnsi" w:hAnsiTheme="majorHAnsi" w:cstheme="majorHAnsi"/>
+          <w:lang w:val="pt-BR"/>
+        </w:rPr>
+      </w:pPr>
+      <w:r>
+        <w:rPr>
+          <w:rFonts w:asciiTheme="majorHAnsi" w:hAnsiTheme="majorHAnsi" w:cstheme="majorHAnsi"/>
+          <w:lang w:val="pt-BR"/>
+        </w:rPr>
+        <w:t>Não é necessário ter boletim de ocorrência para o primeiro atendimento.</w:t>
+      </w:r>
+    </w:p>
+    <w:p>
+      <w:pPr>
+        <w:spacing w:after="80"/>
+        <w:rPr>
+          <w:rFonts w:asciiTheme="majorHAnsi" w:hAnsiTheme="majorHAnsi" w:cstheme="majorHAnsi"/>
+          <w:lang w:val="pt-BR"/>
+        </w:rPr>
+      </w:pPr>
+      <w:r>
+        <w:rPr>
+          <w:rFonts w:asciiTheme="majorHAnsi" w:hAnsiTheme="majorHAnsi" w:cstheme="majorHAnsi"/>
+          <w:lang w:val="pt-BR"/>
+        </w:rPr>
+        <w:t>A Defensoria pode solicitar medidas protetivas diretamente ao juízo.</w:t>
+      </w:r>
+    </w:p>
+    <w:p>
+      <w:pPr>
+        <w:spacing w:after="80"/>
+        <w:rPr>
+          <w:rFonts w:asciiTheme="majorHAnsi" w:hAnsiTheme="majorHAnsi" w:cstheme="majorHAnsi"/>
+          <w:lang w:val="pt-BR"/>
+        </w:rPr>
+      </w:pPr>
+      <w:r>
+        <w:rPr>
+          <w:rFonts w:asciiTheme="majorHAnsi" w:hAnsiTheme="majorHAnsi" w:cstheme="majorHAnsi"/>
+          <w:lang w:val="pt-BR"/>
+        </w:rPr>
+        <w:t>O atendimento pode ser presencial ou por telefone/aplicativo dependendo da unidade.</w:t>
+      </w:r>
+    </w:p>
+    <w:p>
+      <w:pPr>
+        <w:pStyle w:val="Ttulo2"/>
+        <w:rPr>
+          <w:rFonts w:asciiTheme="majorHAnsi" w:eastAsia="Arial" w:hAnsiTheme="majorHAnsi" w:cstheme="majorHAnsi"/>
+          <w:b w:val="0"/>
+          <w:sz w:val="22"/>
+          <w:szCs w:val="22"/>
+          <w:lang w:val="pt-BR"/>
+        </w:rPr>
+      </w:pPr>
+      <w:r>
+        <w:rPr>
+          <w:rFonts w:asciiTheme="majorHAnsi" w:eastAsia="Arial" w:hAnsiTheme="majorHAnsi" w:cstheme="majorHAnsi"/>
+          <w:b w:val="0"/>
+          <w:sz w:val="22"/>
+          <w:szCs w:val="22"/>
+          <w:lang w:val="pt-BR"/>
+        </w:rPr>
+        <w:t xml:space="preserve">Atendimento </w:t>
+      </w:r>
+      <w:proofErr w:type="spellStart"/>
+      <w:r>
+        <w:rPr>
+          <w:rFonts w:asciiTheme="majorHAnsi" w:eastAsia="Arial" w:hAnsiTheme="majorHAnsi" w:cstheme="majorHAnsi"/>
+          <w:b w:val="0"/>
+          <w:sz w:val="22"/>
+          <w:szCs w:val="22"/>
+          <w:lang w:val="pt-BR"/>
+        </w:rPr>
+        <w:t>trans-específico</w:t>
+      </w:r>
+      <w:proofErr w:type="spellEnd"/>
+    </w:p>
+    <w:p>
+      <w:pPr>
+        <w:spacing w:after="120"/>
+        <w:rPr>
+          <w:rFonts w:asciiTheme="majorHAnsi" w:eastAsia="Arial" w:hAnsiTheme="majorHAnsi" w:cstheme="majorHAnsi"/>
+          <w:lang w:val="pt-BR"/>
+        </w:rPr>
+      </w:pPr>
+      <w:r>
+        <w:rPr>
+          <w:rFonts w:asciiTheme="majorHAnsi" w:hAnsiTheme="majorHAnsi" w:cstheme="majorHAnsi"/>
+          <w:lang w:val="pt-BR"/>
+        </w:rPr>
+        <w:t>Caso a mulher encontre resistência ou discriminação em qualquer serviço público de atendimento, pode acionar a Defensoria Pública para garantir seu direito ao atendimento pelo nome social e sem discriminação.</w:t>
+      </w:r>
+    </w:p>
+    <w:p>
+      <w:pPr>
+        <w:spacing w:before="300" w:after="100"/>
+        <w:rPr>
+          <w:rFonts w:asciiTheme="majorHAnsi" w:hAnsiTheme="majorHAnsi" w:cstheme="majorHAnsi"/>
+          <w:lang w:val="pt-BR"/>
+        </w:rPr>
+      </w:pPr>
+      <w:r>
+        <w:rPr>
+          <w:rFonts w:asciiTheme="majorHAnsi" w:hAnsiTheme="majorHAnsi" w:cstheme="majorHAnsi"/>
+          <w:bCs/>
+          <w:color w:val="444444"/>
+          <w:lang w:val="pt-BR"/>
+        </w:rPr>
+        <w:t>Nota sobre esta base de conhecimento</w:t>
+      </w:r>
+    </w:p>
+    <w:p>
+      <w:pPr>
+        <w:spacing w:after="120"/>
+        <w:rPr>
+          <w:rFonts w:asciiTheme="majorHAnsi" w:hAnsiTheme="majorHAnsi" w:cstheme="majorHAnsi"/>
+          <w:lang w:val="pt-BR"/>
+        </w:rPr>
+      </w:pPr>
+      <w:r>
+        <w:rPr>
+          <w:rFonts w:asciiTheme="majorHAnsi" w:hAnsiTheme="majorHAnsi" w:cstheme="majorHAnsi"/>
+          <w:lang w:val="pt-BR"/>
+        </w:rPr>
+        <w:t xml:space="preserve">Este documento integra a base RAG da </w:t>
+      </w:r>
+      <w:r>
+        <w:rPr>
+          <w:rFonts w:asciiTheme="majorHAnsi" w:hAnsiTheme="majorHAnsi" w:cstheme="majorHAnsi"/>
+          <w:lang w:val="pt-BR"/>
+        </w:rPr>
+        <w:t>Manuela</w:t>
+      </w:r>
+      <w:r>
+        <w:rPr>
+          <w:rFonts w:asciiTheme="majorHAnsi" w:hAnsiTheme="majorHAnsi" w:cstheme="majorHAnsi"/>
+          <w:lang w:val="pt-BR"/>
+        </w:rPr>
+        <w:t xml:space="preserve"> e deve ser atualizado sempre que houver novas decisões judiciais ou legislação relevante sobre direitos de pessoas </w:t>
+      </w:r>
+      <w:proofErr w:type="spellStart"/>
+      <w:r>
+        <w:rPr>
+          <w:rFonts w:asciiTheme="majorHAnsi" w:hAnsiTheme="majorHAnsi" w:cstheme="majorHAnsi"/>
+          <w:lang w:val="pt-BR"/>
+        </w:rPr>
+        <w:t>trans</w:t>
+      </w:r>
+      <w:proofErr w:type="spellEnd"/>
+      <w:r>
+        <w:rPr>
+          <w:rFonts w:asciiTheme="majorHAnsi" w:hAnsiTheme="majorHAnsi" w:cstheme="majorHAnsi"/>
+          <w:lang w:val="pt-BR"/>
+        </w:rPr>
+        <w:t xml:space="preserve"> no Brasil. Fontes principais: Lei 11.340/2006, Decreto 8.727/2016, Provimento CNJ 73/2018, STF ADO 26/2019, STJ HC 715.451/SP.</w:t>
+      </w:r>
+    </w:p>
+    <w:p>
+      <w:pPr>
+        <w:spacing w:after="200" w:line="276" w:lineRule="auto"/>
+        <w:rPr>
+          <w:rFonts w:eastAsiaTheme="minorEastAsia" w:cs="Times New Roman"/>
+          <w:lang w:val="pt-BR"/>
+        </w:rPr>
+      </w:pPr>
+    </w:p>
+    <w:p>
+      <w:pPr>
+        <w:rPr>
+          <w:lang w:val="pt-BR"/>
+        </w:rPr>
+      </w:pPr>
     </w:p>
     <w:sectPr>
       <w:pgSz w:w="12240" w:h="15840"/>
@@ -1509,6 +4486,84 @@
     </w:lvl>
   </w:abstractNum>
   <w:abstractNum w:abstractNumId="3" w15:restartNumberingAfterBreak="0">
+    <w:nsid w:val="4BA6767C"/>
+    <w:multiLevelType w:val="hybridMultilevel"/>
+    <w:tmpl w:val="80ACC7E4"/>
+    <w:lvl w:ilvl="0" w:tplc="F0744AD8">
+      <w:start w:val="1"/>
+      <w:numFmt w:val="bullet"/>
+      <w:lvlText w:val="•"/>
+      <w:lvlJc w:val="left"/>
+      <w:pPr>
+        <w:ind w:left="720" w:hanging="360"/>
+      </w:pPr>
+    </w:lvl>
+    <w:lvl w:ilvl="1" w:tplc="CA90A03E">
+      <w:numFmt w:val="decimal"/>
+      <w:lvlText w:val=""/>
+      <w:lvlJc w:val="left"/>
+      <w:pPr>
+        <w:ind w:left="0" w:firstLine="0"/>
+      </w:pPr>
+    </w:lvl>
+    <w:lvl w:ilvl="2" w:tplc="19F40DC2">
+      <w:numFmt w:val="decimal"/>
+      <w:lvlText w:val=""/>
+      <w:lvlJc w:val="left"/>
+      <w:pPr>
+        <w:ind w:left="0" w:firstLine="0"/>
+      </w:pPr>
+    </w:lvl>
+    <w:lvl w:ilvl="3" w:tplc="17184AF2">
+      <w:numFmt w:val="decimal"/>
+      <w:lvlText w:val=""/>
+      <w:lvlJc w:val="left"/>
+      <w:pPr>
+        <w:ind w:left="0" w:firstLine="0"/>
+      </w:pPr>
+    </w:lvl>
+    <w:lvl w:ilvl="4" w:tplc="93C0B0A0">
+      <w:numFmt w:val="decimal"/>
+      <w:lvlText w:val=""/>
+      <w:lvlJc w:val="left"/>
+      <w:pPr>
+        <w:ind w:left="0" w:firstLine="0"/>
+      </w:pPr>
+    </w:lvl>
+    <w:lvl w:ilvl="5" w:tplc="9BF0D628">
+      <w:numFmt w:val="decimal"/>
+      <w:lvlText w:val=""/>
+      <w:lvlJc w:val="left"/>
+      <w:pPr>
+        <w:ind w:left="0" w:firstLine="0"/>
+      </w:pPr>
+    </w:lvl>
+    <w:lvl w:ilvl="6" w:tplc="4F1A0AA8">
+      <w:numFmt w:val="decimal"/>
+      <w:lvlText w:val=""/>
+      <w:lvlJc w:val="left"/>
+      <w:pPr>
+        <w:ind w:left="0" w:firstLine="0"/>
+      </w:pPr>
+    </w:lvl>
+    <w:lvl w:ilvl="7" w:tplc="48AC3A7E">
+      <w:numFmt w:val="decimal"/>
+      <w:lvlText w:val=""/>
+      <w:lvlJc w:val="left"/>
+      <w:pPr>
+        <w:ind w:left="0" w:firstLine="0"/>
+      </w:pPr>
+    </w:lvl>
+    <w:lvl w:ilvl="8" w:tplc="516C0E5A">
+      <w:numFmt w:val="decimal"/>
+      <w:lvlText w:val=""/>
+      <w:lvlJc w:val="left"/>
+      <w:pPr>
+        <w:ind w:left="0" w:firstLine="0"/>
+      </w:pPr>
+    </w:lvl>
+  </w:abstractNum>
+  <w:abstractNum w:abstractNumId="4" w15:restartNumberingAfterBreak="0">
     <w:nsid w:val="6D837CD2"/>
     <w:multiLevelType w:val="multilevel"/>
     <w:tmpl w:val="A1FA9E9A"/>
@@ -1621,7 +4676,7 @@
       </w:pPr>
     </w:lvl>
   </w:abstractNum>
-  <w:abstractNum w:abstractNumId="4" w15:restartNumberingAfterBreak="0">
+  <w:abstractNum w:abstractNumId="5" w15:restartNumberingAfterBreak="0">
     <w:nsid w:val="72D114DA"/>
     <w:multiLevelType w:val="multilevel"/>
     <w:tmpl w:val="3DB2658E"/>
@@ -1735,7 +4790,7 @@
     </w:lvl>
   </w:abstractNum>
   <w:num w:numId="1">
-    <w:abstractNumId w:val="4"/>
+    <w:abstractNumId w:val="5"/>
   </w:num>
   <w:num w:numId="2">
     <w:abstractNumId w:val="1"/>
@@ -1744,10 +4799,22 @@
     <w:abstractNumId w:val="2"/>
   </w:num>
   <w:num w:numId="4">
-    <w:abstractNumId w:val="3"/>
+    <w:abstractNumId w:val="4"/>
   </w:num>
   <w:num w:numId="5">
     <w:abstractNumId w:val="0"/>
+  </w:num>
+  <w:num w:numId="6">
+    <w:abstractNumId w:val="3"/>
+    <w:lvlOverride w:ilvl="0"/>
+    <w:lvlOverride w:ilvl="1"/>
+    <w:lvlOverride w:ilvl="2"/>
+    <w:lvlOverride w:ilvl="3"/>
+    <w:lvlOverride w:ilvl="4"/>
+    <w:lvlOverride w:ilvl="5"/>
+    <w:lvlOverride w:ilvl="6"/>
+    <w:lvlOverride w:ilvl="7"/>
+    <w:lvlOverride w:ilvl="8"/>
   </w:num>
 </w:numbering>
 </file>
@@ -1949,7 +5016,7 @@
     <w:lsdException w:name="Medium Shading 2 Accent 1" w:uiPriority="64"/>
     <w:lsdException w:name="Medium List 1 Accent 1" w:uiPriority="65"/>
     <w:lsdException w:name="Revision" w:semiHidden="1"/>
-    <w:lsdException w:name="List Paragraph" w:uiPriority="34" w:qFormat="1"/>
+    <w:lsdException w:name="List Paragraph" w:uiPriority="0" w:qFormat="1"/>
     <w:lsdException w:name="Quote" w:uiPriority="29" w:qFormat="1"/>
     <w:lsdException w:name="Intense Quote" w:uiPriority="30" w:qFormat="1"/>
     <w:lsdException w:name="Medium List 2 Accent 1" w:uiPriority="66"/>
@@ -2342,6 +5409,18 @@
       <w:szCs w:val="18"/>
     </w:rPr>
   </w:style>
+  <w:style w:type="paragraph" w:styleId="PargrafodaLista">
+    <w:name w:val="List Paragraph"/>
+    <w:qFormat/>
+    <w:rsid w:val="00677B44"/>
+    <w:pPr>
+      <w:spacing w:after="0" w:line="240" w:lineRule="auto"/>
+    </w:pPr>
+    <w:rPr>
+      <w:rFonts w:ascii="Arial" w:eastAsia="Arial" w:hAnsi="Arial" w:cs="Arial"/>
+      <w:lang w:eastAsia="es-ES"/>
+    </w:rPr>
+  </w:style>
 </w:styles>
 </file>
 

</xml_diff>

<commit_message>
feat: update dataset with new entries and categories; add debug script for chunk analysis and error handling
</commit_message>
<xml_diff>
--- a/Guia Completo.docx
+++ b/Guia Completo.docx
@@ -1342,8 +1342,6 @@
           <w:lang w:val="pt-BR"/>
         </w:rPr>
       </w:pPr>
-      <w:bookmarkStart w:id="0" w:name="_GoBack"/>
-      <w:bookmarkEnd w:id="0"/>
       <w:r>
         <w:rPr>
           <w:rFonts w:asciiTheme="majorHAnsi" w:hAnsiTheme="majorHAnsi" w:cstheme="majorHAnsi"/>
@@ -1641,6 +1639,7 @@
         <w:spacing w:after="120"/>
         <w:rPr>
           <w:rFonts w:asciiTheme="majorHAnsi" w:eastAsia="Arial" w:hAnsiTheme="majorHAnsi" w:cstheme="majorHAnsi"/>
+          <w:lang w:val="pt-BR"/>
         </w:rPr>
       </w:pPr>
       <w:r>
@@ -1666,19 +1665,12 @@
         </w:rPr>
         <w:t xml:space="preserve"> muitas vezes combina as formas previstas na Lei Maria da Penha com o componente de transfobia. </w:t>
       </w:r>
-      <w:proofErr w:type="spellStart"/>
-      <w:r>
-        <w:rPr>
-          <w:rFonts w:asciiTheme="majorHAnsi" w:hAnsiTheme="majorHAnsi" w:cstheme="majorHAnsi"/>
-        </w:rPr>
-        <w:t>Exemplos</w:t>
-      </w:r>
-      <w:proofErr w:type="spellEnd"/>
-      <w:r>
-        <w:rPr>
-          <w:rFonts w:asciiTheme="majorHAnsi" w:hAnsiTheme="majorHAnsi" w:cstheme="majorHAnsi"/>
-        </w:rPr>
-        <w:t>:</w:t>
+      <w:r>
+        <w:rPr>
+          <w:rFonts w:asciiTheme="majorHAnsi" w:hAnsiTheme="majorHAnsi" w:cstheme="majorHAnsi"/>
+          <w:lang w:val="pt-BR"/>
+        </w:rPr>
+        <w:t>Exemplos:</w:t>
       </w:r>
     </w:p>
     <w:p>
@@ -2460,6 +2452,7 @@
         <w:spacing w:after="120"/>
         <w:rPr>
           <w:rFonts w:asciiTheme="majorHAnsi" w:eastAsia="Arial" w:hAnsiTheme="majorHAnsi" w:cstheme="majorHAnsi"/>
+          <w:lang w:val="pt-BR"/>
         </w:rPr>
       </w:pPr>
       <w:r>
@@ -2472,36 +2465,25 @@
       <w:r>
         <w:rPr>
           <w:rFonts w:asciiTheme="majorHAnsi" w:hAnsiTheme="majorHAnsi" w:cstheme="majorHAnsi"/>
-        </w:rPr>
-        <w:t xml:space="preserve">No contexto trans, </w:t>
-      </w:r>
-      <w:proofErr w:type="spellStart"/>
-      <w:r>
-        <w:rPr>
-          <w:rFonts w:asciiTheme="majorHAnsi" w:hAnsiTheme="majorHAnsi" w:cstheme="majorHAnsi"/>
-        </w:rPr>
-        <w:t>isso</w:t>
-      </w:r>
-      <w:proofErr w:type="spellEnd"/>
-      <w:r>
-        <w:rPr>
-          <w:rFonts w:asciiTheme="majorHAnsi" w:hAnsiTheme="majorHAnsi" w:cstheme="majorHAnsi"/>
-        </w:rPr>
-        <w:t xml:space="preserve"> </w:t>
-      </w:r>
-      <w:proofErr w:type="spellStart"/>
-      <w:r>
-        <w:rPr>
-          <w:rFonts w:asciiTheme="majorHAnsi" w:hAnsiTheme="majorHAnsi" w:cstheme="majorHAnsi"/>
-        </w:rPr>
-        <w:t>inclui</w:t>
-      </w:r>
-      <w:proofErr w:type="spellEnd"/>
-      <w:r>
-        <w:rPr>
-          <w:rFonts w:asciiTheme="majorHAnsi" w:hAnsiTheme="majorHAnsi" w:cstheme="majorHAnsi"/>
-        </w:rPr>
-        <w:t>:</w:t>
+          <w:lang w:val="pt-BR"/>
+        </w:rPr>
+        <w:t xml:space="preserve">No contexto </w:t>
+      </w:r>
+      <w:proofErr w:type="spellStart"/>
+      <w:r>
+        <w:rPr>
+          <w:rFonts w:asciiTheme="majorHAnsi" w:hAnsiTheme="majorHAnsi" w:cstheme="majorHAnsi"/>
+          <w:lang w:val="pt-BR"/>
+        </w:rPr>
+        <w:t>trans</w:t>
+      </w:r>
+      <w:proofErr w:type="spellEnd"/>
+      <w:r>
+        <w:rPr>
+          <w:rFonts w:asciiTheme="majorHAnsi" w:hAnsiTheme="majorHAnsi" w:cstheme="majorHAnsi"/>
+          <w:lang w:val="pt-BR"/>
+        </w:rPr>
+        <w:t>, isso inclui:</w:t>
       </w:r>
     </w:p>
     <w:p>
@@ -3070,6 +3052,7 @@
         <w:spacing w:after="120"/>
         <w:rPr>
           <w:rFonts w:asciiTheme="majorHAnsi" w:eastAsia="Arial" w:hAnsiTheme="majorHAnsi" w:cstheme="majorHAnsi"/>
+          <w:lang w:val="pt-BR"/>
         </w:rPr>
       </w:pPr>
       <w:r>
@@ -3098,36 +3081,9 @@
       <w:r>
         <w:rPr>
           <w:rFonts w:asciiTheme="majorHAnsi" w:hAnsiTheme="majorHAnsi" w:cstheme="majorHAnsi"/>
-        </w:rPr>
-        <w:t xml:space="preserve">No contexto doméstico, </w:t>
-      </w:r>
-      <w:proofErr w:type="spellStart"/>
-      <w:r>
-        <w:rPr>
-          <w:rFonts w:asciiTheme="majorHAnsi" w:hAnsiTheme="majorHAnsi" w:cstheme="majorHAnsi"/>
-        </w:rPr>
-        <w:t>são</w:t>
-      </w:r>
-      <w:proofErr w:type="spellEnd"/>
-      <w:r>
-        <w:rPr>
-          <w:rFonts w:asciiTheme="majorHAnsi" w:hAnsiTheme="majorHAnsi" w:cstheme="majorHAnsi"/>
-        </w:rPr>
-        <w:t xml:space="preserve"> formas de </w:t>
-      </w:r>
-      <w:proofErr w:type="spellStart"/>
-      <w:r>
-        <w:rPr>
-          <w:rFonts w:asciiTheme="majorHAnsi" w:hAnsiTheme="majorHAnsi" w:cstheme="majorHAnsi"/>
-        </w:rPr>
-        <w:t>violência</w:t>
-      </w:r>
-      <w:proofErr w:type="spellEnd"/>
-      <w:r>
-        <w:rPr>
-          <w:rFonts w:asciiTheme="majorHAnsi" w:hAnsiTheme="majorHAnsi" w:cstheme="majorHAnsi"/>
-        </w:rPr>
-        <w:t xml:space="preserve"> sexual:</w:t>
+          <w:lang w:val="pt-BR"/>
+        </w:rPr>
+        <w:t>No contexto doméstico, são formas de violência sexual:</w:t>
       </w:r>
     </w:p>
     <w:p>
@@ -3413,6 +3369,7 @@
         <w:spacing w:after="120"/>
         <w:rPr>
           <w:rFonts w:asciiTheme="majorHAnsi" w:eastAsia="Arial" w:hAnsiTheme="majorHAnsi" w:cstheme="majorHAnsi"/>
+          <w:lang w:val="pt-BR"/>
         </w:rPr>
       </w:pPr>
       <w:r>
@@ -3441,8 +3398,25 @@
       <w:r>
         <w:rPr>
           <w:rFonts w:asciiTheme="majorHAnsi" w:hAnsiTheme="majorHAnsi" w:cstheme="majorHAnsi"/>
-        </w:rPr>
-        <w:t>No contexto trans, pode incluir:</w:t>
+          <w:lang w:val="pt-BR"/>
+        </w:rPr>
+        <w:t xml:space="preserve">No contexto </w:t>
+      </w:r>
+      <w:proofErr w:type="spellStart"/>
+      <w:r>
+        <w:rPr>
+          <w:rFonts w:asciiTheme="majorHAnsi" w:hAnsiTheme="majorHAnsi" w:cstheme="majorHAnsi"/>
+          <w:lang w:val="pt-BR"/>
+        </w:rPr>
+        <w:t>trans</w:t>
+      </w:r>
+      <w:proofErr w:type="spellEnd"/>
+      <w:r>
+        <w:rPr>
+          <w:rFonts w:asciiTheme="majorHAnsi" w:hAnsiTheme="majorHAnsi" w:cstheme="majorHAnsi"/>
+          <w:lang w:val="pt-BR"/>
+        </w:rPr>
+        <w:t>, pode incluir:</w:t>
       </w:r>
     </w:p>
     <w:p>
@@ -3558,28 +3532,19 @@
           <w:b w:val="0"/>
           <w:sz w:val="22"/>
           <w:szCs w:val="22"/>
-        </w:rPr>
-      </w:pPr>
-      <w:r>
-        <w:rPr>
-          <w:rFonts w:asciiTheme="majorHAnsi" w:eastAsia="Arial" w:hAnsiTheme="majorHAnsi" w:cstheme="majorHAnsi"/>
-          <w:b w:val="0"/>
-          <w:sz w:val="22"/>
-          <w:szCs w:val="22"/>
-        </w:rPr>
-        <w:t xml:space="preserve">Como </w:t>
-      </w:r>
-      <w:proofErr w:type="spellStart"/>
-      <w:r>
-        <w:rPr>
-          <w:rFonts w:asciiTheme="majorHAnsi" w:eastAsia="Arial" w:hAnsiTheme="majorHAnsi" w:cstheme="majorHAnsi"/>
-          <w:b w:val="0"/>
-          <w:sz w:val="22"/>
-          <w:szCs w:val="22"/>
-        </w:rPr>
-        <w:t>agir</w:t>
-      </w:r>
-      <w:proofErr w:type="spellEnd"/>
+          <w:lang w:val="pt-BR"/>
+        </w:rPr>
+      </w:pPr>
+      <w:r>
+        <w:rPr>
+          <w:rFonts w:asciiTheme="majorHAnsi" w:eastAsia="Arial" w:hAnsiTheme="majorHAnsi" w:cstheme="majorHAnsi"/>
+          <w:b w:val="0"/>
+          <w:sz w:val="22"/>
+          <w:szCs w:val="22"/>
+          <w:lang w:val="pt-BR"/>
+        </w:rPr>
+        <w:t>Como agir</w:t>
+      </w:r>
     </w:p>
     <w:p>
       <w:pPr>
@@ -3984,20 +3949,48 @@
     </w:p>
     <w:p>
       <w:pPr>
-        <w:spacing w:before="300" w:after="100"/>
-        <w:rPr>
-          <w:rFonts w:asciiTheme="majorHAnsi" w:hAnsiTheme="majorHAnsi" w:cstheme="majorHAnsi"/>
-          <w:lang w:val="pt-BR"/>
-        </w:rPr>
-      </w:pPr>
-      <w:r>
-        <w:rPr>
-          <w:rFonts w:asciiTheme="majorHAnsi" w:hAnsiTheme="majorHAnsi" w:cstheme="majorHAnsi"/>
-          <w:bCs/>
-          <w:color w:val="444444"/>
-          <w:lang w:val="pt-BR"/>
-        </w:rPr>
-        <w:t>Nota sobre esta base de conhecimento</w:t>
+        <w:pStyle w:val="Ttulo1"/>
+        <w:rPr>
+          <w:rFonts w:asciiTheme="majorHAnsi" w:hAnsiTheme="majorHAnsi" w:cstheme="majorHAnsi"/>
+          <w:b w:val="0"/>
+          <w:sz w:val="22"/>
+          <w:szCs w:val="22"/>
+          <w:lang w:val="pt-BR"/>
+        </w:rPr>
+      </w:pPr>
+      <w:bookmarkStart w:id="0" w:name="_GoBack"/>
+      <w:bookmarkEnd w:id="0"/>
+      <w:r>
+        <w:rPr>
+          <w:rFonts w:asciiTheme="majorHAnsi" w:hAnsiTheme="majorHAnsi" w:cstheme="majorHAnsi"/>
+          <w:b w:val="0"/>
+          <w:sz w:val="22"/>
+          <w:szCs w:val="22"/>
+          <w:lang w:val="pt-BR"/>
+        </w:rPr>
+        <w:t>LEGISLAÇÃO</w:t>
+      </w:r>
+    </w:p>
+    <w:p>
+      <w:pPr>
+        <w:pStyle w:val="Ttulo2"/>
+        <w:rPr>
+          <w:rFonts w:asciiTheme="majorHAnsi" w:hAnsiTheme="majorHAnsi" w:cstheme="majorHAnsi"/>
+          <w:b w:val="0"/>
+          <w:sz w:val="22"/>
+          <w:szCs w:val="22"/>
+          <w:lang w:val="pt-BR"/>
+        </w:rPr>
+      </w:pPr>
+      <w:r>
+        <w:rPr>
+          <w:rFonts w:asciiTheme="majorHAnsi" w:hAnsiTheme="majorHAnsi" w:cstheme="majorHAnsi"/>
+          <w:b w:val="0"/>
+          <w:sz w:val="22"/>
+          <w:szCs w:val="22"/>
+          <w:lang w:val="pt-BR"/>
+        </w:rPr>
+        <w:t>Lei Maria da Penha — Lei 11.340/2006</w:t>
       </w:r>
     </w:p>
     <w:p>
@@ -4013,26 +4006,37 @@
           <w:rFonts w:asciiTheme="majorHAnsi" w:hAnsiTheme="majorHAnsi" w:cstheme="majorHAnsi"/>
           <w:lang w:val="pt-BR"/>
         </w:rPr>
-        <w:t xml:space="preserve">Este documento integra a base RAG da </w:t>
-      </w:r>
-      <w:r>
-        <w:rPr>
-          <w:rFonts w:asciiTheme="majorHAnsi" w:hAnsiTheme="majorHAnsi" w:cstheme="majorHAnsi"/>
-          <w:lang w:val="pt-BR"/>
-        </w:rPr>
-        <w:t>Manuela</w:t>
-      </w:r>
-      <w:r>
-        <w:rPr>
-          <w:rFonts w:asciiTheme="majorHAnsi" w:hAnsiTheme="majorHAnsi" w:cstheme="majorHAnsi"/>
-          <w:lang w:val="pt-BR"/>
-        </w:rPr>
-        <w:t xml:space="preserve"> e deve ser atualizado sempre que houver novas decisões judiciais ou legislação relevante sobre direitos de pessoas </w:t>
-      </w:r>
-      <w:proofErr w:type="spellStart"/>
-      <w:r>
-        <w:rPr>
-          <w:rFonts w:asciiTheme="majorHAnsi" w:hAnsiTheme="majorHAnsi" w:cstheme="majorHAnsi"/>
+        <w:t>A Lei Maria da Penha (Lei 11.340/2006) é a principal lei brasileira de proteção contra a violência doméstica e familiar contra a mulher. Em seu artigo 7º, define cinco formas de violência: física, psicológica, sexual, patrimonial e moral. A partir de 2026, com a Lei 15.384/2026, foi incluída também a violência vicária. A lei prevê medidas protetivas de urgência, afastamento do agressor do lar, proibição de aproximação e contato, restrição de visitas a filhos, e prisão preventiva quando há risco à integridade física ou psicológica da mulher. A Lei Maria da Penha também criou os Juizados de Violência Doméstica e Familiar contra a Mulher (JVDFM), com competência cível e criminal.</w:t>
+      </w:r>
+    </w:p>
+    <w:p>
+      <w:pPr>
+        <w:pStyle w:val="Ttulo2"/>
+        <w:rPr>
+          <w:rFonts w:asciiTheme="majorHAnsi" w:hAnsiTheme="majorHAnsi" w:cstheme="majorHAnsi"/>
+          <w:b w:val="0"/>
+          <w:sz w:val="22"/>
+          <w:szCs w:val="22"/>
+          <w:lang w:val="pt-BR"/>
+        </w:rPr>
+      </w:pPr>
+      <w:r>
+        <w:rPr>
+          <w:rFonts w:asciiTheme="majorHAnsi" w:hAnsiTheme="majorHAnsi" w:cstheme="majorHAnsi"/>
+          <w:b w:val="0"/>
+          <w:sz w:val="22"/>
+          <w:szCs w:val="22"/>
+          <w:lang w:val="pt-BR"/>
+        </w:rPr>
+        <w:t xml:space="preserve">Aplicação da Lei Maria da Penha a mulheres </w:t>
+      </w:r>
+      <w:proofErr w:type="spellStart"/>
+      <w:r>
+        <w:rPr>
+          <w:rFonts w:asciiTheme="majorHAnsi" w:hAnsiTheme="majorHAnsi" w:cstheme="majorHAnsi"/>
+          <w:b w:val="0"/>
+          <w:sz w:val="22"/>
+          <w:szCs w:val="22"/>
           <w:lang w:val="pt-BR"/>
         </w:rPr>
         <w:t>trans</w:t>
@@ -4041,10 +4045,2406 @@
       <w:r>
         <w:rPr>
           <w:rFonts w:asciiTheme="majorHAnsi" w:hAnsiTheme="majorHAnsi" w:cstheme="majorHAnsi"/>
-          <w:lang w:val="pt-BR"/>
-        </w:rPr>
-        <w:t xml:space="preserve"> no Brasil. Fontes principais: Lei 11.340/2006, Decreto 8.727/2016, Provimento CNJ 73/2018, STF ADO 26/2019, STJ HC 715.451/SP.</w:t>
-      </w:r>
+          <w:b w:val="0"/>
+          <w:sz w:val="22"/>
+          <w:szCs w:val="22"/>
+          <w:lang w:val="pt-BR"/>
+        </w:rPr>
+        <w:t xml:space="preserve"> — STJ </w:t>
+      </w:r>
+      <w:proofErr w:type="spellStart"/>
+      <w:r>
+        <w:rPr>
+          <w:rFonts w:asciiTheme="majorHAnsi" w:hAnsiTheme="majorHAnsi" w:cstheme="majorHAnsi"/>
+          <w:b w:val="0"/>
+          <w:sz w:val="22"/>
+          <w:szCs w:val="22"/>
+          <w:lang w:val="pt-BR"/>
+        </w:rPr>
+        <w:t>REsp</w:t>
+      </w:r>
+      <w:proofErr w:type="spellEnd"/>
+      <w:r>
+        <w:rPr>
+          <w:rFonts w:asciiTheme="majorHAnsi" w:hAnsiTheme="majorHAnsi" w:cstheme="majorHAnsi"/>
+          <w:b w:val="0"/>
+          <w:sz w:val="22"/>
+          <w:szCs w:val="22"/>
+          <w:lang w:val="pt-BR"/>
+        </w:rPr>
+        <w:t xml:space="preserve"> 1.977.124</w:t>
+      </w:r>
+    </w:p>
+    <w:p>
+      <w:pPr>
+        <w:spacing w:after="120"/>
+        <w:rPr>
+          <w:rFonts w:asciiTheme="majorHAnsi" w:hAnsiTheme="majorHAnsi" w:cstheme="majorHAnsi"/>
+          <w:lang w:val="pt-BR"/>
+        </w:rPr>
+      </w:pPr>
+      <w:r>
+        <w:rPr>
+          <w:rFonts w:asciiTheme="majorHAnsi" w:hAnsiTheme="majorHAnsi" w:cstheme="majorHAnsi"/>
+          <w:lang w:val="pt-BR"/>
+        </w:rPr>
+        <w:t xml:space="preserve">O Superior Tribunal de Justiça (STJ), no Recurso Especial 1.977.124/SP julgado em 2022, firmou entendimento de que a Lei Maria da Penha se aplica a mulheres </w:t>
+      </w:r>
+      <w:proofErr w:type="spellStart"/>
+      <w:r>
+        <w:rPr>
+          <w:rFonts w:asciiTheme="majorHAnsi" w:hAnsiTheme="majorHAnsi" w:cstheme="majorHAnsi"/>
+          <w:lang w:val="pt-BR"/>
+        </w:rPr>
+        <w:t>trans</w:t>
+      </w:r>
+      <w:proofErr w:type="spellEnd"/>
+      <w:r>
+        <w:rPr>
+          <w:rFonts w:asciiTheme="majorHAnsi" w:hAnsiTheme="majorHAnsi" w:cstheme="majorHAnsi"/>
+          <w:lang w:val="pt-BR"/>
+        </w:rPr>
+        <w:t xml:space="preserve">, travestis e mulheres transexuais em situação de violência doméstica e familiar. A decisão da Sexta Turma do STJ reconhece que a proteção da lei se estende a toda mulher, independentemente de sua identidade de gênero ou de retificação registral, pois o critério é o gênero feminino com o qual a pessoa se identifica e se apresenta socialmente. Esse precedente é vinculante para a rede de proteção e para a Defensoria Pública no atendimento de mulheres </w:t>
+      </w:r>
+      <w:proofErr w:type="spellStart"/>
+      <w:r>
+        <w:rPr>
+          <w:rFonts w:asciiTheme="majorHAnsi" w:hAnsiTheme="majorHAnsi" w:cstheme="majorHAnsi"/>
+          <w:lang w:val="pt-BR"/>
+        </w:rPr>
+        <w:t>trans</w:t>
+      </w:r>
+      <w:proofErr w:type="spellEnd"/>
+      <w:r>
+        <w:rPr>
+          <w:rFonts w:asciiTheme="majorHAnsi" w:hAnsiTheme="majorHAnsi" w:cstheme="majorHAnsi"/>
+          <w:lang w:val="pt-BR"/>
+        </w:rPr>
+        <w:t xml:space="preserve"> vítimas de violência doméstica.</w:t>
+      </w:r>
+    </w:p>
+    <w:p>
+      <w:pPr>
+        <w:pStyle w:val="Ttulo2"/>
+        <w:rPr>
+          <w:rFonts w:asciiTheme="majorHAnsi" w:hAnsiTheme="majorHAnsi" w:cstheme="majorHAnsi"/>
+          <w:b w:val="0"/>
+          <w:sz w:val="22"/>
+          <w:szCs w:val="22"/>
+          <w:lang w:val="pt-BR"/>
+        </w:rPr>
+      </w:pPr>
+      <w:r>
+        <w:rPr>
+          <w:rFonts w:asciiTheme="majorHAnsi" w:hAnsiTheme="majorHAnsi" w:cstheme="majorHAnsi"/>
+          <w:b w:val="0"/>
+          <w:sz w:val="22"/>
+          <w:szCs w:val="22"/>
+          <w:lang w:val="pt-BR"/>
+        </w:rPr>
+        <w:lastRenderedPageBreak/>
+        <w:t>Lei 14.188/2021 — Violência psicológica como crime autônomo</w:t>
+      </w:r>
+    </w:p>
+    <w:p>
+      <w:pPr>
+        <w:spacing w:after="120"/>
+        <w:rPr>
+          <w:rFonts w:asciiTheme="majorHAnsi" w:hAnsiTheme="majorHAnsi" w:cstheme="majorHAnsi"/>
+          <w:lang w:val="pt-BR"/>
+        </w:rPr>
+      </w:pPr>
+      <w:r>
+        <w:rPr>
+          <w:rFonts w:asciiTheme="majorHAnsi" w:hAnsiTheme="majorHAnsi" w:cstheme="majorHAnsi"/>
+          <w:lang w:val="pt-BR"/>
+        </w:rPr>
+        <w:t xml:space="preserve">A Lei 14.188/2021 alterou o Código Penal para tipificar a violência psicológica contra a mulher como crime autônomo, incluindo o artigo 147-B. A pena prevista é de reclusão de 6 meses a 2 anos, e multa, se a conduta não constituir crime mais grave. Considera-se violência psicológica qualquer conduta que cause </w:t>
+      </w:r>
+      <w:proofErr w:type="spellStart"/>
+      <w:r>
+        <w:rPr>
+          <w:rFonts w:asciiTheme="majorHAnsi" w:hAnsiTheme="majorHAnsi" w:cstheme="majorHAnsi"/>
+          <w:lang w:val="pt-BR"/>
+        </w:rPr>
+        <w:t>dano</w:t>
+      </w:r>
+      <w:proofErr w:type="spellEnd"/>
+      <w:r>
+        <w:rPr>
+          <w:rFonts w:asciiTheme="majorHAnsi" w:hAnsiTheme="majorHAnsi" w:cstheme="majorHAnsi"/>
+          <w:lang w:val="pt-BR"/>
+        </w:rPr>
+        <w:t xml:space="preserve"> emocional à mulher, prejudique e perturbe seu pleno desenvolvimento, ou que vise degradar ou controlar suas ações, comportamentos, crenças e decisões. Inclui ameaça, constrangimento, humilhação, manipulação, isolamento, vigilância constante, perseguição contumaz, insulto, chantagem, violação de intimidade, ridicularização, limitação do direito de ir e vir e qualquer outro meio que cause prejuízo à saúde psicológica e à autodeterminação. Para mulheres </w:t>
+      </w:r>
+      <w:proofErr w:type="spellStart"/>
+      <w:r>
+        <w:rPr>
+          <w:rFonts w:asciiTheme="majorHAnsi" w:hAnsiTheme="majorHAnsi" w:cstheme="majorHAnsi"/>
+          <w:lang w:val="pt-BR"/>
+        </w:rPr>
+        <w:t>trans</w:t>
+      </w:r>
+      <w:proofErr w:type="spellEnd"/>
+      <w:r>
+        <w:rPr>
+          <w:rFonts w:asciiTheme="majorHAnsi" w:hAnsiTheme="majorHAnsi" w:cstheme="majorHAnsi"/>
+          <w:lang w:val="pt-BR"/>
+        </w:rPr>
+        <w:t xml:space="preserve">, esse tipo penal abrange </w:t>
+      </w:r>
+      <w:proofErr w:type="spellStart"/>
+      <w:r>
+        <w:rPr>
+          <w:rFonts w:asciiTheme="majorHAnsi" w:hAnsiTheme="majorHAnsi" w:cstheme="majorHAnsi"/>
+          <w:lang w:val="pt-BR"/>
+        </w:rPr>
+        <w:t>deadnaming</w:t>
+      </w:r>
+      <w:proofErr w:type="spellEnd"/>
+      <w:r>
+        <w:rPr>
+          <w:rFonts w:asciiTheme="majorHAnsi" w:hAnsiTheme="majorHAnsi" w:cstheme="majorHAnsi"/>
+          <w:lang w:val="pt-BR"/>
+        </w:rPr>
+        <w:t xml:space="preserve"> intencional, negação pública da identidade de gênero, e exposição vexatória relacionada à transição.</w:t>
+      </w:r>
+    </w:p>
+    <w:p>
+      <w:pPr>
+        <w:pStyle w:val="Ttulo2"/>
+        <w:rPr>
+          <w:rFonts w:asciiTheme="majorHAnsi" w:hAnsiTheme="majorHAnsi" w:cstheme="majorHAnsi"/>
+          <w:b w:val="0"/>
+          <w:sz w:val="22"/>
+          <w:szCs w:val="22"/>
+          <w:lang w:val="pt-BR"/>
+        </w:rPr>
+      </w:pPr>
+      <w:r>
+        <w:rPr>
+          <w:rFonts w:asciiTheme="majorHAnsi" w:hAnsiTheme="majorHAnsi" w:cstheme="majorHAnsi"/>
+          <w:b w:val="0"/>
+          <w:sz w:val="22"/>
+          <w:szCs w:val="22"/>
+          <w:lang w:val="pt-BR"/>
+        </w:rPr>
+        <w:t>Lei 14.132/2021 — Crime de perseguição (</w:t>
+      </w:r>
+      <w:proofErr w:type="spellStart"/>
+      <w:r>
+        <w:rPr>
+          <w:rFonts w:asciiTheme="majorHAnsi" w:hAnsiTheme="majorHAnsi" w:cstheme="majorHAnsi"/>
+          <w:b w:val="0"/>
+          <w:sz w:val="22"/>
+          <w:szCs w:val="22"/>
+          <w:lang w:val="pt-BR"/>
+        </w:rPr>
+        <w:t>stalking</w:t>
+      </w:r>
+      <w:proofErr w:type="spellEnd"/>
+      <w:r>
+        <w:rPr>
+          <w:rFonts w:asciiTheme="majorHAnsi" w:hAnsiTheme="majorHAnsi" w:cstheme="majorHAnsi"/>
+          <w:b w:val="0"/>
+          <w:sz w:val="22"/>
+          <w:szCs w:val="22"/>
+          <w:lang w:val="pt-BR"/>
+        </w:rPr>
+        <w:t>)</w:t>
+      </w:r>
+    </w:p>
+    <w:p>
+      <w:pPr>
+        <w:spacing w:after="120"/>
+        <w:rPr>
+          <w:rFonts w:asciiTheme="majorHAnsi" w:hAnsiTheme="majorHAnsi" w:cstheme="majorHAnsi"/>
+          <w:lang w:val="pt-BR"/>
+        </w:rPr>
+      </w:pPr>
+      <w:r>
+        <w:rPr>
+          <w:rFonts w:asciiTheme="majorHAnsi" w:hAnsiTheme="majorHAnsi" w:cstheme="majorHAnsi"/>
+          <w:lang w:val="pt-BR"/>
+        </w:rPr>
+        <w:t>A Lei 14.132/2021 incluiu no Código Penal o artigo 147-A, que tipifica o crime de perseguição (</w:t>
+      </w:r>
+      <w:proofErr w:type="spellStart"/>
+      <w:r>
+        <w:rPr>
+          <w:rFonts w:asciiTheme="majorHAnsi" w:hAnsiTheme="majorHAnsi" w:cstheme="majorHAnsi"/>
+          <w:lang w:val="pt-BR"/>
+        </w:rPr>
+        <w:t>stalking</w:t>
+      </w:r>
+      <w:proofErr w:type="spellEnd"/>
+      <w:r>
+        <w:rPr>
+          <w:rFonts w:asciiTheme="majorHAnsi" w:hAnsiTheme="majorHAnsi" w:cstheme="majorHAnsi"/>
+          <w:lang w:val="pt-BR"/>
+        </w:rPr>
+        <w:t xml:space="preserve">). A conduta consiste em perseguir alguém, reiteradamente e por qualquer meio, ameaçando-lhe a integridade física ou psicológica, restringindo-lhe a capacidade de locomoção ou, de qualquer forma, invadindo ou perturbando sua esfera de liberdade ou privacidade. A pena é de reclusão de 6 meses a 2 anos e multa. A pena é aumentada de metade se o crime </w:t>
+      </w:r>
+      <w:proofErr w:type="spellStart"/>
+      <w:r>
+        <w:rPr>
+          <w:rFonts w:asciiTheme="majorHAnsi" w:hAnsiTheme="majorHAnsi" w:cstheme="majorHAnsi"/>
+          <w:lang w:val="pt-BR"/>
+        </w:rPr>
+        <w:t>é</w:t>
+      </w:r>
+      <w:proofErr w:type="spellEnd"/>
+      <w:r>
+        <w:rPr>
+          <w:rFonts w:asciiTheme="majorHAnsi" w:hAnsiTheme="majorHAnsi" w:cstheme="majorHAnsi"/>
+          <w:lang w:val="pt-BR"/>
+        </w:rPr>
+        <w:t xml:space="preserve"> cometido contra criança, adolescente ou idoso; contra mulher por razões da condição de sexo feminino; mediante concurso de duas ou mais pessoas; ou com emprego de arma. Para mulheres </w:t>
+      </w:r>
+      <w:proofErr w:type="spellStart"/>
+      <w:r>
+        <w:rPr>
+          <w:rFonts w:asciiTheme="majorHAnsi" w:hAnsiTheme="majorHAnsi" w:cstheme="majorHAnsi"/>
+          <w:lang w:val="pt-BR"/>
+        </w:rPr>
+        <w:t>trans</w:t>
+      </w:r>
+      <w:proofErr w:type="spellEnd"/>
+      <w:r>
+        <w:rPr>
+          <w:rFonts w:asciiTheme="majorHAnsi" w:hAnsiTheme="majorHAnsi" w:cstheme="majorHAnsi"/>
+          <w:lang w:val="pt-BR"/>
+        </w:rPr>
+        <w:t xml:space="preserve">, configura </w:t>
+      </w:r>
+      <w:proofErr w:type="spellStart"/>
+      <w:r>
+        <w:rPr>
+          <w:rFonts w:asciiTheme="majorHAnsi" w:hAnsiTheme="majorHAnsi" w:cstheme="majorHAnsi"/>
+          <w:lang w:val="pt-BR"/>
+        </w:rPr>
+        <w:t>stalking</w:t>
+      </w:r>
+      <w:proofErr w:type="spellEnd"/>
+      <w:r>
+        <w:rPr>
+          <w:rFonts w:asciiTheme="majorHAnsi" w:hAnsiTheme="majorHAnsi" w:cstheme="majorHAnsi"/>
+          <w:lang w:val="pt-BR"/>
+        </w:rPr>
+        <w:t xml:space="preserve"> qualificado a perseguição motivada por transfobia, incluindo vigilância digital, monitoramento de redes sociais, contato persistente após bloqueio, e ameaças de </w:t>
+      </w:r>
+      <w:proofErr w:type="spellStart"/>
+      <w:r>
+        <w:rPr>
+          <w:rFonts w:asciiTheme="majorHAnsi" w:hAnsiTheme="majorHAnsi" w:cstheme="majorHAnsi"/>
+          <w:lang w:val="pt-BR"/>
+        </w:rPr>
+        <w:t>outing</w:t>
+      </w:r>
+      <w:proofErr w:type="spellEnd"/>
+      <w:r>
+        <w:rPr>
+          <w:rFonts w:asciiTheme="majorHAnsi" w:hAnsiTheme="majorHAnsi" w:cstheme="majorHAnsi"/>
+          <w:lang w:val="pt-BR"/>
+        </w:rPr>
+        <w:t xml:space="preserve"> (exposição forçada da identidade </w:t>
+      </w:r>
+      <w:proofErr w:type="spellStart"/>
+      <w:r>
+        <w:rPr>
+          <w:rFonts w:asciiTheme="majorHAnsi" w:hAnsiTheme="majorHAnsi" w:cstheme="majorHAnsi"/>
+          <w:lang w:val="pt-BR"/>
+        </w:rPr>
+        <w:t>trans</w:t>
+      </w:r>
+      <w:proofErr w:type="spellEnd"/>
+      <w:r>
+        <w:rPr>
+          <w:rFonts w:asciiTheme="majorHAnsi" w:hAnsiTheme="majorHAnsi" w:cstheme="majorHAnsi"/>
+          <w:lang w:val="pt-BR"/>
+        </w:rPr>
+        <w:t>).</w:t>
+      </w:r>
+    </w:p>
+    <w:p>
+      <w:pPr>
+        <w:pStyle w:val="Ttulo2"/>
+        <w:rPr>
+          <w:rFonts w:asciiTheme="majorHAnsi" w:hAnsiTheme="majorHAnsi" w:cstheme="majorHAnsi"/>
+          <w:b w:val="0"/>
+          <w:sz w:val="22"/>
+          <w:szCs w:val="22"/>
+          <w:lang w:val="pt-BR"/>
+        </w:rPr>
+      </w:pPr>
+      <w:r>
+        <w:rPr>
+          <w:rFonts w:asciiTheme="majorHAnsi" w:hAnsiTheme="majorHAnsi" w:cstheme="majorHAnsi"/>
+          <w:b w:val="0"/>
+          <w:sz w:val="22"/>
+          <w:szCs w:val="22"/>
+          <w:lang w:val="pt-BR"/>
+        </w:rPr>
+        <w:t xml:space="preserve">Lei 15.384/2026 — Violência vicária e crime de </w:t>
+      </w:r>
+      <w:proofErr w:type="spellStart"/>
+      <w:r>
+        <w:rPr>
+          <w:rFonts w:asciiTheme="majorHAnsi" w:hAnsiTheme="majorHAnsi" w:cstheme="majorHAnsi"/>
+          <w:b w:val="0"/>
+          <w:sz w:val="22"/>
+          <w:szCs w:val="22"/>
+          <w:lang w:val="pt-BR"/>
+        </w:rPr>
+        <w:t>vicaricídio</w:t>
+      </w:r>
+      <w:proofErr w:type="spellEnd"/>
+    </w:p>
+    <w:p>
+      <w:pPr>
+        <w:spacing w:after="120"/>
+        <w:rPr>
+          <w:rFonts w:asciiTheme="majorHAnsi" w:hAnsiTheme="majorHAnsi" w:cstheme="majorHAnsi"/>
+          <w:lang w:val="pt-BR"/>
+        </w:rPr>
+      </w:pPr>
+      <w:r>
+        <w:rPr>
+          <w:rFonts w:asciiTheme="majorHAnsi" w:hAnsiTheme="majorHAnsi" w:cstheme="majorHAnsi"/>
+          <w:lang w:val="pt-BR"/>
+        </w:rPr>
+        <w:t xml:space="preserve">A Lei 15.384/2026, sancionada em 9 de abril de 2026, é a legislação mais recente sobre proteção da mulher. Ela reconhece formalmente a violência vicária como uma das formas de violência doméstica e familiar previstas na Lei Maria da Penha, alterando o artigo 7º. Define violência vicária como qualquer ato praticado contra pessoas do círculo afetivo da mulher — filhos, dependentes, ascendentes, enteados, parentes, pessoas sob guarda ou responsabilidade, e integrantes da rede de apoio — com a finalidade específica de atingi-la emocionalmente. A lei também criou o crime de </w:t>
+      </w:r>
+      <w:proofErr w:type="spellStart"/>
+      <w:r>
+        <w:rPr>
+          <w:rFonts w:asciiTheme="majorHAnsi" w:hAnsiTheme="majorHAnsi" w:cstheme="majorHAnsi"/>
+          <w:lang w:val="pt-BR"/>
+        </w:rPr>
+        <w:t>vicaricídio</w:t>
+      </w:r>
+      <w:proofErr w:type="spellEnd"/>
+      <w:r>
+        <w:rPr>
+          <w:rFonts w:asciiTheme="majorHAnsi" w:hAnsiTheme="majorHAnsi" w:cstheme="majorHAnsi"/>
+          <w:lang w:val="pt-BR"/>
+        </w:rPr>
+        <w:t xml:space="preserve">, novo artigo 121-B do Código Penal, com pena de 20 a 40 anos de reclusão, caracterizado pelo ato de matar pessoa próxima da mulher com o objetivo de causar sofrimento, punição ou controle. O conceito de violência vicária foi originalmente desenvolvido pela psicóloga espanhola Sônia </w:t>
+      </w:r>
+      <w:proofErr w:type="spellStart"/>
+      <w:r>
+        <w:rPr>
+          <w:rFonts w:asciiTheme="majorHAnsi" w:hAnsiTheme="majorHAnsi" w:cstheme="majorHAnsi"/>
+          <w:lang w:val="pt-BR"/>
+        </w:rPr>
+        <w:t>Vaccaro</w:t>
+      </w:r>
+      <w:proofErr w:type="spellEnd"/>
+      <w:r>
+        <w:rPr>
+          <w:rFonts w:asciiTheme="majorHAnsi" w:hAnsiTheme="majorHAnsi" w:cstheme="majorHAnsi"/>
+          <w:lang w:val="pt-BR"/>
+        </w:rPr>
+        <w:t xml:space="preserve"> e descreve a instrumentalização de terceiros — especialmente filhos — como meio de violência indireta contra a mulher.</w:t>
+      </w:r>
+    </w:p>
+    <w:p>
+      <w:pPr>
+        <w:pStyle w:val="Ttulo2"/>
+        <w:rPr>
+          <w:rFonts w:asciiTheme="majorHAnsi" w:hAnsiTheme="majorHAnsi" w:cstheme="majorHAnsi"/>
+          <w:b w:val="0"/>
+          <w:sz w:val="22"/>
+          <w:szCs w:val="22"/>
+          <w:lang w:val="pt-BR"/>
+        </w:rPr>
+      </w:pPr>
+      <w:r>
+        <w:rPr>
+          <w:rFonts w:asciiTheme="majorHAnsi" w:hAnsiTheme="majorHAnsi" w:cstheme="majorHAnsi"/>
+          <w:b w:val="0"/>
+          <w:sz w:val="22"/>
+          <w:szCs w:val="22"/>
+          <w:lang w:val="pt-BR"/>
+        </w:rPr>
+        <w:t>Decreto 8.727/2016 — Nome social na administração pública federal</w:t>
+      </w:r>
+    </w:p>
+    <w:p>
+      <w:pPr>
+        <w:spacing w:after="120"/>
+        <w:rPr>
+          <w:rFonts w:asciiTheme="majorHAnsi" w:hAnsiTheme="majorHAnsi" w:cstheme="majorHAnsi"/>
+          <w:lang w:val="pt-BR"/>
+        </w:rPr>
+      </w:pPr>
+      <w:r>
+        <w:rPr>
+          <w:rFonts w:asciiTheme="majorHAnsi" w:hAnsiTheme="majorHAnsi" w:cstheme="majorHAnsi"/>
+          <w:lang w:val="pt-BR"/>
+        </w:rPr>
+        <w:t xml:space="preserve">O Decreto 8.727/2016 dispõe sobre o uso do nome social e o reconhecimento da identidade de gênero de pessoas travestis e transexuais no âmbito da administração pública federal. Garante o direito ao uso do nome social em registros funcionais, prontuários, formulários, sistemas </w:t>
+      </w:r>
+      <w:r>
+        <w:rPr>
+          <w:rFonts w:asciiTheme="majorHAnsi" w:hAnsiTheme="majorHAnsi" w:cstheme="majorHAnsi"/>
+          <w:lang w:val="pt-BR"/>
+        </w:rPr>
+        <w:lastRenderedPageBreak/>
+        <w:t xml:space="preserve">eletrônicos e cadastros, independentemente de retificação no registro civil. Aplica-se a órgãos da União, autarquias, fundações públicas, empresas públicas e sociedades de economia mista. Embora seja federal, serve de referência para estados e municípios. Pessoas </w:t>
+      </w:r>
+      <w:proofErr w:type="spellStart"/>
+      <w:r>
+        <w:rPr>
+          <w:rFonts w:asciiTheme="majorHAnsi" w:hAnsiTheme="majorHAnsi" w:cstheme="majorHAnsi"/>
+          <w:lang w:val="pt-BR"/>
+        </w:rPr>
+        <w:t>trans</w:t>
+      </w:r>
+      <w:proofErr w:type="spellEnd"/>
+      <w:r>
+        <w:rPr>
+          <w:rFonts w:asciiTheme="majorHAnsi" w:hAnsiTheme="majorHAnsi" w:cstheme="majorHAnsi"/>
+          <w:lang w:val="pt-BR"/>
+        </w:rPr>
+        <w:t xml:space="preserve"> têm direito a ser chamadas pelo nome social em delegacias, hospitais públicos, escolas, repartições e atendimento da Defensoria Pública. A recusa em usar o nome social pode configurar discriminação.</w:t>
+      </w:r>
+    </w:p>
+    <w:p>
+      <w:pPr>
+        <w:pStyle w:val="Ttulo2"/>
+        <w:rPr>
+          <w:rFonts w:asciiTheme="majorHAnsi" w:hAnsiTheme="majorHAnsi" w:cstheme="majorHAnsi"/>
+          <w:b w:val="0"/>
+          <w:sz w:val="22"/>
+          <w:szCs w:val="22"/>
+          <w:lang w:val="pt-BR"/>
+        </w:rPr>
+      </w:pPr>
+      <w:r>
+        <w:rPr>
+          <w:rFonts w:asciiTheme="majorHAnsi" w:hAnsiTheme="majorHAnsi" w:cstheme="majorHAnsi"/>
+          <w:b w:val="0"/>
+          <w:sz w:val="22"/>
+          <w:szCs w:val="22"/>
+          <w:lang w:val="pt-BR"/>
+        </w:rPr>
+        <w:t>ADO 26/STF — Criminalização da homofobia e transfobia</w:t>
+      </w:r>
+    </w:p>
+    <w:p>
+      <w:pPr>
+        <w:spacing w:after="120"/>
+        <w:rPr>
+          <w:rFonts w:asciiTheme="majorHAnsi" w:hAnsiTheme="majorHAnsi" w:cstheme="majorHAnsi"/>
+          <w:lang w:val="pt-BR"/>
+        </w:rPr>
+      </w:pPr>
+      <w:r>
+        <w:rPr>
+          <w:rFonts w:asciiTheme="majorHAnsi" w:hAnsiTheme="majorHAnsi" w:cstheme="majorHAnsi"/>
+          <w:lang w:val="pt-BR"/>
+        </w:rPr>
+        <w:t xml:space="preserve">A Ação Direta de Inconstitucionalidade por Omissão 26 (ADO 26), julgada pelo Supremo Tribunal Federal em junho de 2019, reconheceu que a homofobia e a transfobia se enquadram no conceito penal de racismo, conforme a Lei 7.716/1989. Isso significa que atos discriminatórios contra pessoas LGBTQIA+ — incluindo mulheres </w:t>
+      </w:r>
+      <w:proofErr w:type="spellStart"/>
+      <w:r>
+        <w:rPr>
+          <w:rFonts w:asciiTheme="majorHAnsi" w:hAnsiTheme="majorHAnsi" w:cstheme="majorHAnsi"/>
+          <w:lang w:val="pt-BR"/>
+        </w:rPr>
+        <w:t>trans</w:t>
+      </w:r>
+      <w:proofErr w:type="spellEnd"/>
+      <w:r>
+        <w:rPr>
+          <w:rFonts w:asciiTheme="majorHAnsi" w:hAnsiTheme="majorHAnsi" w:cstheme="majorHAnsi"/>
+          <w:lang w:val="pt-BR"/>
+        </w:rPr>
+        <w:t xml:space="preserve">, travestis e homens </w:t>
+      </w:r>
+      <w:proofErr w:type="spellStart"/>
+      <w:r>
+        <w:rPr>
+          <w:rFonts w:asciiTheme="majorHAnsi" w:hAnsiTheme="majorHAnsi" w:cstheme="majorHAnsi"/>
+          <w:lang w:val="pt-BR"/>
+        </w:rPr>
+        <w:t>trans</w:t>
+      </w:r>
+      <w:proofErr w:type="spellEnd"/>
+      <w:r>
+        <w:rPr>
+          <w:rFonts w:asciiTheme="majorHAnsi" w:hAnsiTheme="majorHAnsi" w:cstheme="majorHAnsi"/>
+          <w:lang w:val="pt-BR"/>
+        </w:rPr>
+        <w:t xml:space="preserve"> — são crimes inafiançáveis e imprescritíveis, com penas que variam conforme a conduta. Insultos </w:t>
+      </w:r>
+      <w:proofErr w:type="spellStart"/>
+      <w:r>
+        <w:rPr>
+          <w:rFonts w:asciiTheme="majorHAnsi" w:hAnsiTheme="majorHAnsi" w:cstheme="majorHAnsi"/>
+          <w:lang w:val="pt-BR"/>
+        </w:rPr>
+        <w:t>transfóbicos</w:t>
+      </w:r>
+      <w:proofErr w:type="spellEnd"/>
+      <w:r>
+        <w:rPr>
+          <w:rFonts w:asciiTheme="majorHAnsi" w:hAnsiTheme="majorHAnsi" w:cstheme="majorHAnsi"/>
+          <w:lang w:val="pt-BR"/>
+        </w:rPr>
+        <w:t xml:space="preserve"> públicos, recusa de serviço por motivo de identidade de gênero, agressão física motivada por transfobia, e divulgação pública de identidade </w:t>
+      </w:r>
+      <w:proofErr w:type="spellStart"/>
+      <w:r>
+        <w:rPr>
+          <w:rFonts w:asciiTheme="majorHAnsi" w:hAnsiTheme="majorHAnsi" w:cstheme="majorHAnsi"/>
+          <w:lang w:val="pt-BR"/>
+        </w:rPr>
+        <w:t>trans</w:t>
+      </w:r>
+      <w:proofErr w:type="spellEnd"/>
+      <w:r>
+        <w:rPr>
+          <w:rFonts w:asciiTheme="majorHAnsi" w:hAnsiTheme="majorHAnsi" w:cstheme="majorHAnsi"/>
+          <w:lang w:val="pt-BR"/>
+        </w:rPr>
+        <w:t xml:space="preserve"> contra a vontade da pessoa (</w:t>
+      </w:r>
+      <w:proofErr w:type="spellStart"/>
+      <w:r>
+        <w:rPr>
+          <w:rFonts w:asciiTheme="majorHAnsi" w:hAnsiTheme="majorHAnsi" w:cstheme="majorHAnsi"/>
+          <w:lang w:val="pt-BR"/>
+        </w:rPr>
+        <w:t>outing</w:t>
+      </w:r>
+      <w:proofErr w:type="spellEnd"/>
+      <w:r>
+        <w:rPr>
+          <w:rFonts w:asciiTheme="majorHAnsi" w:hAnsiTheme="majorHAnsi" w:cstheme="majorHAnsi"/>
+          <w:lang w:val="pt-BR"/>
+        </w:rPr>
+        <w:t>) podem configurar crime de racismo. A decisão tem efeito vinculante até que o Congresso edite lei específica.</w:t>
+      </w:r>
+    </w:p>
+    <w:p>
+      <w:pPr>
+        <w:pStyle w:val="Ttulo2"/>
+        <w:rPr>
+          <w:rFonts w:asciiTheme="majorHAnsi" w:hAnsiTheme="majorHAnsi" w:cstheme="majorHAnsi"/>
+          <w:b w:val="0"/>
+          <w:sz w:val="22"/>
+          <w:szCs w:val="22"/>
+          <w:lang w:val="pt-BR"/>
+        </w:rPr>
+      </w:pPr>
+      <w:r>
+        <w:rPr>
+          <w:rFonts w:asciiTheme="majorHAnsi" w:hAnsiTheme="majorHAnsi" w:cstheme="majorHAnsi"/>
+          <w:b w:val="0"/>
+          <w:sz w:val="22"/>
+          <w:szCs w:val="22"/>
+          <w:lang w:val="pt-BR"/>
+        </w:rPr>
+        <w:t>Retificação de registro civil — Provimento 73/2018 do CNJ</w:t>
+      </w:r>
+    </w:p>
+    <w:p>
+      <w:pPr>
+        <w:spacing w:after="120"/>
+        <w:rPr>
+          <w:rFonts w:asciiTheme="majorHAnsi" w:hAnsiTheme="majorHAnsi" w:cstheme="majorHAnsi"/>
+          <w:lang w:val="pt-BR"/>
+        </w:rPr>
+      </w:pPr>
+      <w:r>
+        <w:rPr>
+          <w:rFonts w:asciiTheme="majorHAnsi" w:hAnsiTheme="majorHAnsi" w:cstheme="majorHAnsi"/>
+          <w:lang w:val="pt-BR"/>
+        </w:rPr>
+        <w:t xml:space="preserve">O Provimento 73/2018 do Conselho Nacional de Justiça (CNJ) permite que pessoas </w:t>
+      </w:r>
+      <w:proofErr w:type="spellStart"/>
+      <w:r>
+        <w:rPr>
+          <w:rFonts w:asciiTheme="majorHAnsi" w:hAnsiTheme="majorHAnsi" w:cstheme="majorHAnsi"/>
+          <w:lang w:val="pt-BR"/>
+        </w:rPr>
+        <w:t>trans</w:t>
+      </w:r>
+      <w:proofErr w:type="spellEnd"/>
+      <w:r>
+        <w:rPr>
+          <w:rFonts w:asciiTheme="majorHAnsi" w:hAnsiTheme="majorHAnsi" w:cstheme="majorHAnsi"/>
+          <w:lang w:val="pt-BR"/>
+        </w:rPr>
+        <w:t>, travestis e mulheres transexuais retifiquem o prenome e o gênero diretamente em cartório, sem necessidade de processo judicial, sem cirurgia de redesignação, sem laudo médico ou psicológico, e sem testemunhas. Basta apresentar documentos pessoais e fazer o pedido no cartório de registro civil. A retificação tem efeitos jurídicos plenos: novos documentos refletem o nome e gênero retificados. Não é obrigatória — o uso do nome social (Decreto 8.727/2016) garante respeito à identidade mesmo antes da retificação. A Defensoria Pública oferece orientação gratuita para esse procedimento.</w:t>
+      </w:r>
+    </w:p>
+    <w:p>
+      <w:pPr>
+        <w:pStyle w:val="Ttulo1"/>
+        <w:rPr>
+          <w:rFonts w:asciiTheme="majorHAnsi" w:hAnsiTheme="majorHAnsi" w:cstheme="majorHAnsi"/>
+          <w:b w:val="0"/>
+          <w:sz w:val="22"/>
+          <w:szCs w:val="22"/>
+          <w:lang w:val="pt-BR"/>
+        </w:rPr>
+      </w:pPr>
+      <w:r>
+        <w:rPr>
+          <w:rFonts w:asciiTheme="majorHAnsi" w:hAnsiTheme="majorHAnsi" w:cstheme="majorHAnsi"/>
+          <w:b w:val="0"/>
+          <w:sz w:val="22"/>
+          <w:szCs w:val="22"/>
+          <w:lang w:val="pt-BR"/>
+        </w:rPr>
+        <w:t>VIOLÊNCIA PATRIMONIAL</w:t>
+      </w:r>
+    </w:p>
+    <w:p>
+      <w:pPr>
+        <w:pStyle w:val="Ttulo2"/>
+        <w:rPr>
+          <w:rFonts w:asciiTheme="majorHAnsi" w:hAnsiTheme="majorHAnsi" w:cstheme="majorHAnsi"/>
+          <w:b w:val="0"/>
+          <w:sz w:val="22"/>
+          <w:szCs w:val="22"/>
+          <w:lang w:val="pt-BR"/>
+        </w:rPr>
+      </w:pPr>
+      <w:r>
+        <w:rPr>
+          <w:rFonts w:asciiTheme="majorHAnsi" w:hAnsiTheme="majorHAnsi" w:cstheme="majorHAnsi"/>
+          <w:b w:val="0"/>
+          <w:sz w:val="22"/>
+          <w:szCs w:val="22"/>
+          <w:lang w:val="pt-BR"/>
+        </w:rPr>
+        <w:t>O que é violência patrimonial</w:t>
+      </w:r>
+    </w:p>
+    <w:p>
+      <w:pPr>
+        <w:spacing w:after="120"/>
+        <w:rPr>
+          <w:rFonts w:asciiTheme="majorHAnsi" w:hAnsiTheme="majorHAnsi" w:cstheme="majorHAnsi"/>
+          <w:lang w:val="pt-BR"/>
+        </w:rPr>
+      </w:pPr>
+      <w:r>
+        <w:rPr>
+          <w:rFonts w:asciiTheme="majorHAnsi" w:hAnsiTheme="majorHAnsi" w:cstheme="majorHAnsi"/>
+          <w:lang w:val="pt-BR"/>
+        </w:rPr>
+        <w:t xml:space="preserve">A violência patrimonial está prevista no artigo 7º, inciso IV, da Lei Maria da Penha. Define-se como qualquer conduta que configure retenção, subtração, destruição parcial ou total de objetos, instrumentos de trabalho, documentos pessoais, bens, valores e direitos ou recursos econômicos, incluindo os destinados a satisfazer necessidades da mulher. É uma das formas mais </w:t>
+      </w:r>
+      <w:proofErr w:type="spellStart"/>
+      <w:r>
+        <w:rPr>
+          <w:rFonts w:asciiTheme="majorHAnsi" w:hAnsiTheme="majorHAnsi" w:cstheme="majorHAnsi"/>
+          <w:lang w:val="pt-BR"/>
+        </w:rPr>
+        <w:t>invisibilizadas</w:t>
+      </w:r>
+      <w:proofErr w:type="spellEnd"/>
+      <w:r>
+        <w:rPr>
+          <w:rFonts w:asciiTheme="majorHAnsi" w:hAnsiTheme="majorHAnsi" w:cstheme="majorHAnsi"/>
+          <w:lang w:val="pt-BR"/>
+        </w:rPr>
+        <w:t xml:space="preserve"> de violência doméstica porque muitas mulheres não reconhecem essas condutas como crime. A violência patrimonial é frequentemente usada como ferramenta de controle, mantendo a mulher em situação de dependência financeira e dificultando que ela rompa o relacionamento abusivo.</w:t>
+      </w:r>
+    </w:p>
+    <w:p>
+      <w:pPr>
+        <w:pStyle w:val="Ttulo2"/>
+        <w:rPr>
+          <w:rFonts w:asciiTheme="majorHAnsi" w:hAnsiTheme="majorHAnsi" w:cstheme="majorHAnsi"/>
+          <w:b w:val="0"/>
+          <w:sz w:val="22"/>
+          <w:szCs w:val="22"/>
+          <w:lang w:val="pt-BR"/>
+        </w:rPr>
+      </w:pPr>
+      <w:r>
+        <w:rPr>
+          <w:rFonts w:asciiTheme="majorHAnsi" w:hAnsiTheme="majorHAnsi" w:cstheme="majorHAnsi"/>
+          <w:b w:val="0"/>
+          <w:sz w:val="22"/>
+          <w:szCs w:val="22"/>
+          <w:lang w:val="pt-BR"/>
+        </w:rPr>
+        <w:t>Exemplos comuns de violência patrimonial</w:t>
+      </w:r>
+    </w:p>
+    <w:p>
+      <w:pPr>
+        <w:spacing w:after="120"/>
+        <w:rPr>
+          <w:rFonts w:asciiTheme="majorHAnsi" w:hAnsiTheme="majorHAnsi" w:cstheme="majorHAnsi"/>
+          <w:lang w:val="pt-BR"/>
+        </w:rPr>
+      </w:pPr>
+      <w:r>
+        <w:rPr>
+          <w:rFonts w:asciiTheme="majorHAnsi" w:hAnsiTheme="majorHAnsi" w:cstheme="majorHAnsi"/>
+          <w:lang w:val="pt-BR"/>
+        </w:rPr>
+        <w:lastRenderedPageBreak/>
+        <w:t xml:space="preserve">Reconhecer a violência patrimonial é o primeiro passo para enfrentá-la. </w:t>
+      </w:r>
+      <w:r>
+        <w:rPr>
+          <w:rFonts w:asciiTheme="majorHAnsi" w:hAnsiTheme="majorHAnsi" w:cstheme="majorHAnsi"/>
+          <w:lang w:val="pt-BR"/>
+        </w:rPr>
+        <w:t>São exemplos:</w:t>
+      </w:r>
+    </w:p>
+    <w:p>
+      <w:pPr>
+        <w:spacing w:after="80"/>
+        <w:rPr>
+          <w:rFonts w:asciiTheme="majorHAnsi" w:hAnsiTheme="majorHAnsi" w:cstheme="majorHAnsi"/>
+          <w:lang w:val="pt-BR"/>
+        </w:rPr>
+      </w:pPr>
+      <w:r>
+        <w:rPr>
+          <w:rFonts w:asciiTheme="majorHAnsi" w:hAnsiTheme="majorHAnsi" w:cstheme="majorHAnsi"/>
+          <w:lang w:val="pt-BR"/>
+        </w:rPr>
+        <w:t>Confisco ou retenção de documentos pessoais (RG, CPF, certidão de casamento, passaporte) para dificultar separação, divórcio ou independência.</w:t>
+      </w:r>
+    </w:p>
+    <w:p>
+      <w:pPr>
+        <w:spacing w:after="80"/>
+        <w:rPr>
+          <w:rFonts w:asciiTheme="majorHAnsi" w:hAnsiTheme="majorHAnsi" w:cstheme="majorHAnsi"/>
+          <w:lang w:val="pt-BR"/>
+        </w:rPr>
+      </w:pPr>
+      <w:r>
+        <w:rPr>
+          <w:rFonts w:asciiTheme="majorHAnsi" w:hAnsiTheme="majorHAnsi" w:cstheme="majorHAnsi"/>
+          <w:lang w:val="pt-BR"/>
+        </w:rPr>
+        <w:t>Controle abusivo do dinheiro da casa, impedindo a mulher de ter acesso à conta bancária conjunta ou recursos financeiros próprios.</w:t>
+      </w:r>
+    </w:p>
+    <w:p>
+      <w:pPr>
+        <w:spacing w:after="80"/>
+        <w:rPr>
+          <w:rFonts w:asciiTheme="majorHAnsi" w:hAnsiTheme="majorHAnsi" w:cstheme="majorHAnsi"/>
+          <w:lang w:val="pt-BR"/>
+        </w:rPr>
+      </w:pPr>
+      <w:r>
+        <w:rPr>
+          <w:rFonts w:asciiTheme="majorHAnsi" w:hAnsiTheme="majorHAnsi" w:cstheme="majorHAnsi"/>
+          <w:lang w:val="pt-BR"/>
+        </w:rPr>
+        <w:t>Destruição intencional de bens pessoais — celular, roupas, documentos, fotografias, instrumentos de trabalho.</w:t>
+      </w:r>
+    </w:p>
+    <w:p>
+      <w:pPr>
+        <w:spacing w:after="80"/>
+        <w:rPr>
+          <w:rFonts w:asciiTheme="majorHAnsi" w:hAnsiTheme="majorHAnsi" w:cstheme="majorHAnsi"/>
+          <w:lang w:val="pt-BR"/>
+        </w:rPr>
+      </w:pPr>
+      <w:r>
+        <w:rPr>
+          <w:rFonts w:asciiTheme="majorHAnsi" w:hAnsiTheme="majorHAnsi" w:cstheme="majorHAnsi"/>
+          <w:lang w:val="pt-BR"/>
+        </w:rPr>
+        <w:t>Recusa em pagar pensão alimentícia mesmo havendo condições financeiras.</w:t>
+      </w:r>
+    </w:p>
+    <w:p>
+      <w:pPr>
+        <w:spacing w:after="80"/>
+        <w:rPr>
+          <w:rFonts w:asciiTheme="majorHAnsi" w:hAnsiTheme="majorHAnsi" w:cstheme="majorHAnsi"/>
+          <w:lang w:val="pt-BR"/>
+        </w:rPr>
+      </w:pPr>
+      <w:r>
+        <w:rPr>
+          <w:rFonts w:asciiTheme="majorHAnsi" w:hAnsiTheme="majorHAnsi" w:cstheme="majorHAnsi"/>
+          <w:lang w:val="pt-BR"/>
+        </w:rPr>
+        <w:t>Contratação de empréstimos, financiamentos ou cartões de crédito em nome da mulher sem autorização, gerando dívidas indevidas.</w:t>
+      </w:r>
+    </w:p>
+    <w:p>
+      <w:pPr>
+        <w:spacing w:after="80"/>
+        <w:rPr>
+          <w:rFonts w:asciiTheme="majorHAnsi" w:hAnsiTheme="majorHAnsi" w:cstheme="majorHAnsi"/>
+          <w:lang w:val="pt-BR"/>
+        </w:rPr>
+      </w:pPr>
+      <w:r>
+        <w:rPr>
+          <w:rFonts w:asciiTheme="majorHAnsi" w:hAnsiTheme="majorHAnsi" w:cstheme="majorHAnsi"/>
+          <w:lang w:val="pt-BR"/>
+        </w:rPr>
+        <w:t>Apropriação indevida de salário, aposentadoria ou benefício social da mulher.</w:t>
+      </w:r>
+    </w:p>
+    <w:p>
+      <w:pPr>
+        <w:spacing w:after="80"/>
+        <w:rPr>
+          <w:rFonts w:asciiTheme="majorHAnsi" w:hAnsiTheme="majorHAnsi" w:cstheme="majorHAnsi"/>
+          <w:lang w:val="pt-BR"/>
+        </w:rPr>
+      </w:pPr>
+      <w:r>
+        <w:rPr>
+          <w:rFonts w:asciiTheme="majorHAnsi" w:hAnsiTheme="majorHAnsi" w:cstheme="majorHAnsi"/>
+          <w:lang w:val="pt-BR"/>
+        </w:rPr>
+        <w:t>Venda de bens comuns sem consentimento ou conhecimento da mulher.</w:t>
+      </w:r>
+    </w:p>
+    <w:p>
+      <w:pPr>
+        <w:spacing w:after="80"/>
+        <w:rPr>
+          <w:rFonts w:asciiTheme="majorHAnsi" w:hAnsiTheme="majorHAnsi" w:cstheme="majorHAnsi"/>
+          <w:lang w:val="pt-BR"/>
+        </w:rPr>
+      </w:pPr>
+      <w:r>
+        <w:rPr>
+          <w:rFonts w:asciiTheme="majorHAnsi" w:hAnsiTheme="majorHAnsi" w:cstheme="majorHAnsi"/>
+          <w:lang w:val="pt-BR"/>
+        </w:rPr>
+        <w:t>Quebra de celular para impedir comunicação com rede de apoio.</w:t>
+      </w:r>
+    </w:p>
+    <w:p>
+      <w:pPr>
+        <w:spacing w:after="80"/>
+        <w:rPr>
+          <w:rFonts w:asciiTheme="majorHAnsi" w:hAnsiTheme="majorHAnsi" w:cstheme="majorHAnsi"/>
+          <w:lang w:val="pt-BR"/>
+        </w:rPr>
+      </w:pPr>
+      <w:r>
+        <w:rPr>
+          <w:rFonts w:asciiTheme="majorHAnsi" w:hAnsiTheme="majorHAnsi" w:cstheme="majorHAnsi"/>
+          <w:lang w:val="pt-BR"/>
+        </w:rPr>
+        <w:t>Retenção de cartões bancários, senhas ou meios de pagamento.</w:t>
+      </w:r>
+    </w:p>
+    <w:p>
+      <w:pPr>
+        <w:pStyle w:val="Ttulo2"/>
+        <w:rPr>
+          <w:rFonts w:asciiTheme="majorHAnsi" w:hAnsiTheme="majorHAnsi" w:cstheme="majorHAnsi"/>
+          <w:b w:val="0"/>
+          <w:sz w:val="22"/>
+          <w:szCs w:val="22"/>
+          <w:lang w:val="pt-BR"/>
+        </w:rPr>
+      </w:pPr>
+      <w:r>
+        <w:rPr>
+          <w:rFonts w:asciiTheme="majorHAnsi" w:hAnsiTheme="majorHAnsi" w:cstheme="majorHAnsi"/>
+          <w:b w:val="0"/>
+          <w:sz w:val="22"/>
+          <w:szCs w:val="22"/>
+          <w:lang w:val="pt-BR"/>
+        </w:rPr>
+        <w:t xml:space="preserve">Violência patrimonial e mulheres </w:t>
+      </w:r>
+      <w:proofErr w:type="spellStart"/>
+      <w:r>
+        <w:rPr>
+          <w:rFonts w:asciiTheme="majorHAnsi" w:hAnsiTheme="majorHAnsi" w:cstheme="majorHAnsi"/>
+          <w:b w:val="0"/>
+          <w:sz w:val="22"/>
+          <w:szCs w:val="22"/>
+          <w:lang w:val="pt-BR"/>
+        </w:rPr>
+        <w:t>trans</w:t>
+      </w:r>
+      <w:proofErr w:type="spellEnd"/>
+    </w:p>
+    <w:p>
+      <w:pPr>
+        <w:spacing w:after="120"/>
+        <w:rPr>
+          <w:rFonts w:asciiTheme="majorHAnsi" w:hAnsiTheme="majorHAnsi" w:cstheme="majorHAnsi"/>
+          <w:lang w:val="pt-BR"/>
+        </w:rPr>
+      </w:pPr>
+      <w:r>
+        <w:rPr>
+          <w:rFonts w:asciiTheme="majorHAnsi" w:hAnsiTheme="majorHAnsi" w:cstheme="majorHAnsi"/>
+          <w:lang w:val="pt-BR"/>
+        </w:rPr>
+        <w:t xml:space="preserve">Mulheres </w:t>
+      </w:r>
+      <w:proofErr w:type="spellStart"/>
+      <w:r>
+        <w:rPr>
+          <w:rFonts w:asciiTheme="majorHAnsi" w:hAnsiTheme="majorHAnsi" w:cstheme="majorHAnsi"/>
+          <w:lang w:val="pt-BR"/>
+        </w:rPr>
+        <w:t>trans</w:t>
+      </w:r>
+      <w:proofErr w:type="spellEnd"/>
+      <w:r>
+        <w:rPr>
+          <w:rFonts w:asciiTheme="majorHAnsi" w:hAnsiTheme="majorHAnsi" w:cstheme="majorHAnsi"/>
+          <w:lang w:val="pt-BR"/>
+        </w:rPr>
+        <w:t xml:space="preserve">, travestis e mulheres transexuais enfrentam formas específicas de violência patrimonial. Inclui retenção de documentos com nome social ou nome retificado para forçar uso do nome morto, controle de despesas relacionadas à transição (hormonioterapia, cirurgias, vestuário), recusa do parceiro em registrar relação afetiva oficial para excluir a mulher de direitos sucessórios, e uso da dependência econômica para obrigar a mulher a esconder a identidade </w:t>
+      </w:r>
+      <w:proofErr w:type="spellStart"/>
+      <w:r>
+        <w:rPr>
+          <w:rFonts w:asciiTheme="majorHAnsi" w:hAnsiTheme="majorHAnsi" w:cstheme="majorHAnsi"/>
+          <w:lang w:val="pt-BR"/>
+        </w:rPr>
+        <w:t>trans</w:t>
+      </w:r>
+      <w:proofErr w:type="spellEnd"/>
+      <w:r>
+        <w:rPr>
+          <w:rFonts w:asciiTheme="majorHAnsi" w:hAnsiTheme="majorHAnsi" w:cstheme="majorHAnsi"/>
+          <w:lang w:val="pt-BR"/>
+        </w:rPr>
+        <w:t xml:space="preserve"> em público. A Defensoria Pública pode orientar sobre como reaver documentos, comprovar relacionamento estável e proteger patrimônio.</w:t>
+      </w:r>
+    </w:p>
+    <w:p>
+      <w:pPr>
+        <w:pStyle w:val="Ttulo2"/>
+        <w:rPr>
+          <w:rFonts w:asciiTheme="majorHAnsi" w:hAnsiTheme="majorHAnsi" w:cstheme="majorHAnsi"/>
+          <w:b w:val="0"/>
+          <w:sz w:val="22"/>
+          <w:szCs w:val="22"/>
+          <w:lang w:val="pt-BR"/>
+        </w:rPr>
+      </w:pPr>
+      <w:r>
+        <w:rPr>
+          <w:rFonts w:asciiTheme="majorHAnsi" w:hAnsiTheme="majorHAnsi" w:cstheme="majorHAnsi"/>
+          <w:b w:val="0"/>
+          <w:sz w:val="22"/>
+          <w:szCs w:val="22"/>
+          <w:lang w:val="pt-BR"/>
+        </w:rPr>
+        <w:t>Medidas legais contra violência patrimonial</w:t>
+      </w:r>
+    </w:p>
+    <w:p>
+      <w:pPr>
+        <w:spacing w:after="120"/>
+        <w:rPr>
+          <w:rFonts w:asciiTheme="majorHAnsi" w:hAnsiTheme="majorHAnsi" w:cstheme="majorHAnsi"/>
+          <w:lang w:val="pt-BR"/>
+        </w:rPr>
+      </w:pPr>
+      <w:r>
+        <w:rPr>
+          <w:rFonts w:asciiTheme="majorHAnsi" w:hAnsiTheme="majorHAnsi" w:cstheme="majorHAnsi"/>
+          <w:lang w:val="pt-BR"/>
+        </w:rPr>
+        <w:t>Quando há violência patrimonial, a mulher pode pedir medidas protetivas de urgência previstas no artigo 24 da Lei Maria da Penha, que incluem: restituição de bens indevidamente subtraídos pelo agressor; proibição temporária de celebração de atos e contratos de compra, venda e locação de propriedade em comum; suspensão de procurações conferidas ao agressor; e prestação de caução provisória pelos prejuízos materiais. Essas medidas podem ser pedidas na Defensoria Pública, na delegacia, ou diretamente ao Juizado de Violência Doméstica. A urgência é reconhecida e o pedido pode ser concedido em até 48 horas. Mesmo quando o casal tem bens em comum, a mulher tem direito à proteção patrimonial enquanto durar a situação de violência.</w:t>
+      </w:r>
+    </w:p>
+    <w:p>
+      <w:pPr>
+        <w:pStyle w:val="Ttulo1"/>
+        <w:rPr>
+          <w:rFonts w:asciiTheme="majorHAnsi" w:hAnsiTheme="majorHAnsi" w:cstheme="majorHAnsi"/>
+          <w:b w:val="0"/>
+          <w:sz w:val="22"/>
+          <w:szCs w:val="22"/>
+          <w:lang w:val="pt-BR"/>
+        </w:rPr>
+      </w:pPr>
+      <w:r>
+        <w:rPr>
+          <w:rFonts w:asciiTheme="majorHAnsi" w:hAnsiTheme="majorHAnsi" w:cstheme="majorHAnsi"/>
+          <w:b w:val="0"/>
+          <w:sz w:val="22"/>
+          <w:szCs w:val="22"/>
+          <w:lang w:val="pt-BR"/>
+        </w:rPr>
+        <w:t>VIOLÊNCIA VICÁRIA</w:t>
+      </w:r>
+    </w:p>
+    <w:p>
+      <w:pPr>
+        <w:pStyle w:val="Ttulo2"/>
+        <w:rPr>
+          <w:rFonts w:asciiTheme="majorHAnsi" w:hAnsiTheme="majorHAnsi" w:cstheme="majorHAnsi"/>
+          <w:b w:val="0"/>
+          <w:sz w:val="22"/>
+          <w:szCs w:val="22"/>
+          <w:lang w:val="pt-BR"/>
+        </w:rPr>
+      </w:pPr>
+      <w:r>
+        <w:rPr>
+          <w:rFonts w:asciiTheme="majorHAnsi" w:hAnsiTheme="majorHAnsi" w:cstheme="majorHAnsi"/>
+          <w:b w:val="0"/>
+          <w:sz w:val="22"/>
+          <w:szCs w:val="22"/>
+          <w:lang w:val="pt-BR"/>
+        </w:rPr>
+        <w:t>O que é violência vicária</w:t>
+      </w:r>
+    </w:p>
+    <w:p>
+      <w:pPr>
+        <w:spacing w:after="120"/>
+        <w:rPr>
+          <w:rFonts w:asciiTheme="majorHAnsi" w:hAnsiTheme="majorHAnsi" w:cstheme="majorHAnsi"/>
+          <w:lang w:val="pt-BR"/>
+        </w:rPr>
+      </w:pPr>
+      <w:r>
+        <w:rPr>
+          <w:rFonts w:asciiTheme="majorHAnsi" w:hAnsiTheme="majorHAnsi" w:cstheme="majorHAnsi"/>
+          <w:lang w:val="pt-BR"/>
+        </w:rPr>
+        <w:t xml:space="preserve">Violência vicária é toda forma de agressão dirigida a terceiros do círculo afetivo da mulher com a finalidade específica de atingi-la emocionalmente. O agressor instrumentaliza filhos, </w:t>
+      </w:r>
+      <w:r>
+        <w:rPr>
+          <w:rFonts w:asciiTheme="majorHAnsi" w:hAnsiTheme="majorHAnsi" w:cstheme="majorHAnsi"/>
+          <w:lang w:val="pt-BR"/>
+        </w:rPr>
+        <w:lastRenderedPageBreak/>
+        <w:t xml:space="preserve">dependentes, familiares ou pessoas da rede de apoio para causar sofrimento à mulher, sabendo que ferir essas pessoas a fere indiretamente. O conceito foi desenvolvido pela psicóloga espanhola Sônia </w:t>
+      </w:r>
+      <w:proofErr w:type="spellStart"/>
+      <w:r>
+        <w:rPr>
+          <w:rFonts w:asciiTheme="majorHAnsi" w:hAnsiTheme="majorHAnsi" w:cstheme="majorHAnsi"/>
+          <w:lang w:val="pt-BR"/>
+        </w:rPr>
+        <w:t>Vaccaro</w:t>
+      </w:r>
+      <w:proofErr w:type="spellEnd"/>
+      <w:r>
+        <w:rPr>
+          <w:rFonts w:asciiTheme="majorHAnsi" w:hAnsiTheme="majorHAnsi" w:cstheme="majorHAnsi"/>
+          <w:lang w:val="pt-BR"/>
+        </w:rPr>
+        <w:t xml:space="preserve"> na obra Violência Vicária — golpear onde mais dói. No Brasil, foi formalmente incluído na Lei Maria da Penha pela Lei 15.384/2026, sancionada em 9 de abril de 2026. Antes dessa lei, condutas vicárias eram enquadradas como violência psicológica, mas agora têm </w:t>
+      </w:r>
+      <w:proofErr w:type="gramStart"/>
+      <w:r>
+        <w:rPr>
+          <w:rFonts w:asciiTheme="majorHAnsi" w:hAnsiTheme="majorHAnsi" w:cstheme="majorHAnsi"/>
+          <w:lang w:val="pt-BR"/>
+        </w:rPr>
+        <w:t>nome e tipificação próprias</w:t>
+      </w:r>
+      <w:proofErr w:type="gramEnd"/>
+      <w:r>
+        <w:rPr>
+          <w:rFonts w:asciiTheme="majorHAnsi" w:hAnsiTheme="majorHAnsi" w:cstheme="majorHAnsi"/>
+          <w:lang w:val="pt-BR"/>
+        </w:rPr>
+        <w:t>.</w:t>
+      </w:r>
+    </w:p>
+    <w:p>
+      <w:pPr>
+        <w:pStyle w:val="Ttulo2"/>
+        <w:rPr>
+          <w:rFonts w:asciiTheme="majorHAnsi" w:hAnsiTheme="majorHAnsi" w:cstheme="majorHAnsi"/>
+          <w:b w:val="0"/>
+          <w:sz w:val="22"/>
+          <w:szCs w:val="22"/>
+          <w:lang w:val="pt-BR"/>
+        </w:rPr>
+      </w:pPr>
+      <w:r>
+        <w:rPr>
+          <w:rFonts w:asciiTheme="majorHAnsi" w:hAnsiTheme="majorHAnsi" w:cstheme="majorHAnsi"/>
+          <w:b w:val="0"/>
+          <w:sz w:val="22"/>
+          <w:szCs w:val="22"/>
+          <w:lang w:val="pt-BR"/>
+        </w:rPr>
+        <w:t>Formas comuns de violência vicária</w:t>
+      </w:r>
+    </w:p>
+    <w:p>
+      <w:pPr>
+        <w:spacing w:after="80"/>
+        <w:rPr>
+          <w:rFonts w:asciiTheme="majorHAnsi" w:hAnsiTheme="majorHAnsi" w:cstheme="majorHAnsi"/>
+          <w:lang w:val="pt-BR"/>
+        </w:rPr>
+      </w:pPr>
+      <w:r>
+        <w:rPr>
+          <w:rFonts w:asciiTheme="majorHAnsi" w:hAnsiTheme="majorHAnsi" w:cstheme="majorHAnsi"/>
+          <w:lang w:val="pt-BR"/>
+        </w:rPr>
+        <w:t>Ameaças contra a integridade dos filhos para pressionar a mulher a permanecer no relacionamento.</w:t>
+      </w:r>
+    </w:p>
+    <w:p>
+      <w:pPr>
+        <w:spacing w:after="80"/>
+        <w:rPr>
+          <w:rFonts w:asciiTheme="majorHAnsi" w:hAnsiTheme="majorHAnsi" w:cstheme="majorHAnsi"/>
+          <w:lang w:val="pt-BR"/>
+        </w:rPr>
+      </w:pPr>
+      <w:r>
+        <w:rPr>
+          <w:rFonts w:asciiTheme="majorHAnsi" w:hAnsiTheme="majorHAnsi" w:cstheme="majorHAnsi"/>
+          <w:lang w:val="pt-BR"/>
+        </w:rPr>
+        <w:t>Alienação parental — manipular as crianças para que rejeitem a mãe ou tenham medo dela.</w:t>
+      </w:r>
+    </w:p>
+    <w:p>
+      <w:pPr>
+        <w:spacing w:after="80"/>
+        <w:rPr>
+          <w:rFonts w:asciiTheme="majorHAnsi" w:hAnsiTheme="majorHAnsi" w:cstheme="majorHAnsi"/>
+          <w:lang w:val="pt-BR"/>
+        </w:rPr>
+      </w:pPr>
+      <w:r>
+        <w:rPr>
+          <w:rFonts w:asciiTheme="majorHAnsi" w:hAnsiTheme="majorHAnsi" w:cstheme="majorHAnsi"/>
+          <w:lang w:val="pt-BR"/>
+        </w:rPr>
+        <w:t>Uso da convivência com filhos como instrumento de chantagem ("se você sair, não vê mais as crianças").</w:t>
+      </w:r>
+    </w:p>
+    <w:p>
+      <w:pPr>
+        <w:spacing w:after="80"/>
+        <w:rPr>
+          <w:rFonts w:asciiTheme="majorHAnsi" w:hAnsiTheme="majorHAnsi" w:cstheme="majorHAnsi"/>
+          <w:lang w:val="pt-BR"/>
+        </w:rPr>
+      </w:pPr>
+      <w:r>
+        <w:rPr>
+          <w:rFonts w:asciiTheme="majorHAnsi" w:hAnsiTheme="majorHAnsi" w:cstheme="majorHAnsi"/>
+          <w:lang w:val="pt-BR"/>
+        </w:rPr>
+        <w:t>Agressão psicológica ou física a filhos com o objetivo de atingir a mãe.</w:t>
+      </w:r>
+    </w:p>
+    <w:p>
+      <w:pPr>
+        <w:spacing w:after="80"/>
+        <w:rPr>
+          <w:rFonts w:asciiTheme="majorHAnsi" w:hAnsiTheme="majorHAnsi" w:cstheme="majorHAnsi"/>
+          <w:lang w:val="pt-BR"/>
+        </w:rPr>
+      </w:pPr>
+      <w:r>
+        <w:rPr>
+          <w:rFonts w:asciiTheme="majorHAnsi" w:hAnsiTheme="majorHAnsi" w:cstheme="majorHAnsi"/>
+          <w:lang w:val="pt-BR"/>
+        </w:rPr>
+        <w:t>Sequestro de filhos, mudança de domicílio sem comunicar a mãe, retenção indevida após visita.</w:t>
+      </w:r>
+    </w:p>
+    <w:p>
+      <w:pPr>
+        <w:spacing w:after="80"/>
+        <w:rPr>
+          <w:rFonts w:asciiTheme="majorHAnsi" w:hAnsiTheme="majorHAnsi" w:cstheme="majorHAnsi"/>
+          <w:lang w:val="pt-BR"/>
+        </w:rPr>
+      </w:pPr>
+      <w:r>
+        <w:rPr>
+          <w:rFonts w:asciiTheme="majorHAnsi" w:hAnsiTheme="majorHAnsi" w:cstheme="majorHAnsi"/>
+          <w:lang w:val="pt-BR"/>
+        </w:rPr>
+        <w:t>Maus-tratos a animais de estimação da mulher.</w:t>
+      </w:r>
+    </w:p>
+    <w:p>
+      <w:pPr>
+        <w:spacing w:after="80"/>
+        <w:rPr>
+          <w:rFonts w:asciiTheme="majorHAnsi" w:hAnsiTheme="majorHAnsi" w:cstheme="majorHAnsi"/>
+          <w:lang w:val="pt-BR"/>
+        </w:rPr>
+      </w:pPr>
+      <w:r>
+        <w:rPr>
+          <w:rFonts w:asciiTheme="majorHAnsi" w:hAnsiTheme="majorHAnsi" w:cstheme="majorHAnsi"/>
+          <w:lang w:val="pt-BR"/>
+        </w:rPr>
+        <w:t>Ameaças e ataques a familiares próximos, especialmente mãe, irmãs e amigas próximas.</w:t>
+      </w:r>
+    </w:p>
+    <w:p>
+      <w:pPr>
+        <w:spacing w:after="80"/>
+        <w:rPr>
+          <w:rFonts w:asciiTheme="majorHAnsi" w:hAnsiTheme="majorHAnsi" w:cstheme="majorHAnsi"/>
+          <w:lang w:val="pt-BR"/>
+        </w:rPr>
+      </w:pPr>
+      <w:r>
+        <w:rPr>
+          <w:rFonts w:asciiTheme="majorHAnsi" w:hAnsiTheme="majorHAnsi" w:cstheme="majorHAnsi"/>
+          <w:lang w:val="pt-BR"/>
+        </w:rPr>
+        <w:t xml:space="preserve">Em casos extremos, </w:t>
+      </w:r>
+      <w:proofErr w:type="spellStart"/>
+      <w:r>
+        <w:rPr>
+          <w:rFonts w:asciiTheme="majorHAnsi" w:hAnsiTheme="majorHAnsi" w:cstheme="majorHAnsi"/>
+          <w:lang w:val="pt-BR"/>
+        </w:rPr>
+        <w:t>vicaricídio</w:t>
+      </w:r>
+      <w:proofErr w:type="spellEnd"/>
+      <w:r>
+        <w:rPr>
+          <w:rFonts w:asciiTheme="majorHAnsi" w:hAnsiTheme="majorHAnsi" w:cstheme="majorHAnsi"/>
+          <w:lang w:val="pt-BR"/>
+        </w:rPr>
+        <w:t xml:space="preserve"> — assassinato dos filhos ou pessoas próximas como punição final.</w:t>
+      </w:r>
+    </w:p>
+    <w:p>
+      <w:pPr>
+        <w:pStyle w:val="Ttulo2"/>
+        <w:rPr>
+          <w:rFonts w:asciiTheme="majorHAnsi" w:hAnsiTheme="majorHAnsi" w:cstheme="majorHAnsi"/>
+          <w:b w:val="0"/>
+          <w:sz w:val="22"/>
+          <w:szCs w:val="22"/>
+          <w:lang w:val="pt-BR"/>
+        </w:rPr>
+      </w:pPr>
+      <w:r>
+        <w:rPr>
+          <w:rFonts w:asciiTheme="majorHAnsi" w:hAnsiTheme="majorHAnsi" w:cstheme="majorHAnsi"/>
+          <w:b w:val="0"/>
+          <w:sz w:val="22"/>
+          <w:szCs w:val="22"/>
+          <w:lang w:val="pt-BR"/>
+        </w:rPr>
+        <w:t xml:space="preserve">Crime de </w:t>
+      </w:r>
+      <w:proofErr w:type="spellStart"/>
+      <w:r>
+        <w:rPr>
+          <w:rFonts w:asciiTheme="majorHAnsi" w:hAnsiTheme="majorHAnsi" w:cstheme="majorHAnsi"/>
+          <w:b w:val="0"/>
+          <w:sz w:val="22"/>
+          <w:szCs w:val="22"/>
+          <w:lang w:val="pt-BR"/>
+        </w:rPr>
+        <w:t>vicaricídio</w:t>
+      </w:r>
+      <w:proofErr w:type="spellEnd"/>
+      <w:r>
+        <w:rPr>
+          <w:rFonts w:asciiTheme="majorHAnsi" w:hAnsiTheme="majorHAnsi" w:cstheme="majorHAnsi"/>
+          <w:b w:val="0"/>
+          <w:sz w:val="22"/>
+          <w:szCs w:val="22"/>
+          <w:lang w:val="pt-BR"/>
+        </w:rPr>
+        <w:t xml:space="preserve"> — Artigo 121-B do Código Penal</w:t>
+      </w:r>
+    </w:p>
+    <w:p>
+      <w:pPr>
+        <w:spacing w:after="120"/>
+        <w:rPr>
+          <w:rFonts w:asciiTheme="majorHAnsi" w:hAnsiTheme="majorHAnsi" w:cstheme="majorHAnsi"/>
+          <w:lang w:val="pt-BR"/>
+        </w:rPr>
+      </w:pPr>
+      <w:r>
+        <w:rPr>
+          <w:rFonts w:asciiTheme="majorHAnsi" w:hAnsiTheme="majorHAnsi" w:cstheme="majorHAnsi"/>
+          <w:lang w:val="pt-BR"/>
+        </w:rPr>
+        <w:t xml:space="preserve">A Lei 15.384/2026 criou o crime de </w:t>
+      </w:r>
+      <w:proofErr w:type="spellStart"/>
+      <w:r>
+        <w:rPr>
+          <w:rFonts w:asciiTheme="majorHAnsi" w:hAnsiTheme="majorHAnsi" w:cstheme="majorHAnsi"/>
+          <w:lang w:val="pt-BR"/>
+        </w:rPr>
+        <w:t>vicaricídio</w:t>
+      </w:r>
+      <w:proofErr w:type="spellEnd"/>
+      <w:r>
+        <w:rPr>
+          <w:rFonts w:asciiTheme="majorHAnsi" w:hAnsiTheme="majorHAnsi" w:cstheme="majorHAnsi"/>
+          <w:lang w:val="pt-BR"/>
+        </w:rPr>
+        <w:t xml:space="preserve"> no artigo 121-B do Código Penal. Caracteriza-se pelo ato de matar pessoa próxima da mulher — filhos, dependentes, ascendentes ou outros familiares — com o objetivo específico de causar sofrimento, punição ou controle. A pena é de reclusão de 20 a 40 anos, com qualificadoras que podem aumentar a pena em até metade. O </w:t>
+      </w:r>
+      <w:proofErr w:type="spellStart"/>
+      <w:r>
+        <w:rPr>
+          <w:rFonts w:asciiTheme="majorHAnsi" w:hAnsiTheme="majorHAnsi" w:cstheme="majorHAnsi"/>
+          <w:lang w:val="pt-BR"/>
+        </w:rPr>
+        <w:t>vicaricídio</w:t>
+      </w:r>
+      <w:proofErr w:type="spellEnd"/>
+      <w:r>
+        <w:rPr>
+          <w:rFonts w:asciiTheme="majorHAnsi" w:hAnsiTheme="majorHAnsi" w:cstheme="majorHAnsi"/>
+          <w:lang w:val="pt-BR"/>
+        </w:rPr>
+        <w:t xml:space="preserve"> foi incluído no rol de crimes hediondos, equiparando-se ao feminicídio em gravidade. Embora seja a forma mais extrema, é importante reconhecer que condutas que antecedem o </w:t>
+      </w:r>
+      <w:proofErr w:type="spellStart"/>
+      <w:r>
+        <w:rPr>
+          <w:rFonts w:asciiTheme="majorHAnsi" w:hAnsiTheme="majorHAnsi" w:cstheme="majorHAnsi"/>
+          <w:lang w:val="pt-BR"/>
+        </w:rPr>
+        <w:t>vicaricídio</w:t>
+      </w:r>
+      <w:proofErr w:type="spellEnd"/>
+      <w:r>
+        <w:rPr>
+          <w:rFonts w:asciiTheme="majorHAnsi" w:hAnsiTheme="majorHAnsi" w:cstheme="majorHAnsi"/>
+          <w:lang w:val="pt-BR"/>
+        </w:rPr>
+        <w:t xml:space="preserve"> — ameaças, alienação, isolamento — já configuram violência vicária e justificam medidas protetivas urgentes.</w:t>
+      </w:r>
+    </w:p>
+    <w:p>
+      <w:pPr>
+        <w:pStyle w:val="Ttulo2"/>
+        <w:rPr>
+          <w:rFonts w:asciiTheme="majorHAnsi" w:hAnsiTheme="majorHAnsi" w:cstheme="majorHAnsi"/>
+          <w:b w:val="0"/>
+          <w:sz w:val="22"/>
+          <w:szCs w:val="22"/>
+          <w:lang w:val="pt-BR"/>
+        </w:rPr>
+      </w:pPr>
+      <w:r>
+        <w:rPr>
+          <w:rFonts w:asciiTheme="majorHAnsi" w:hAnsiTheme="majorHAnsi" w:cstheme="majorHAnsi"/>
+          <w:b w:val="0"/>
+          <w:sz w:val="22"/>
+          <w:szCs w:val="22"/>
+          <w:lang w:val="pt-BR"/>
+        </w:rPr>
+        <w:t>Proteção contra violência vicária</w:t>
+      </w:r>
+    </w:p>
+    <w:p>
+      <w:pPr>
+        <w:spacing w:after="120"/>
+        <w:rPr>
+          <w:rFonts w:asciiTheme="majorHAnsi" w:hAnsiTheme="majorHAnsi" w:cstheme="majorHAnsi"/>
+          <w:lang w:val="pt-BR"/>
+        </w:rPr>
+      </w:pPr>
+      <w:r>
+        <w:rPr>
+          <w:rFonts w:asciiTheme="majorHAnsi" w:hAnsiTheme="majorHAnsi" w:cstheme="majorHAnsi"/>
+          <w:lang w:val="pt-BR"/>
+        </w:rPr>
+        <w:t>Quando há violência vicária ou risco de que ela ocorra, a Defensoria Pública e a Justiça podem aplicar medidas protetivas específicas: restrição ou suspensão do convívio do agressor com os filhos, regulamentação de visitas assistidas em local supervisionado, proibição de aproximação dos filhos da mulher, e providências cautelares para preservar a integridade das crianças. A Lei 15.384/2026 reforçou a possibilidade de medidas urgentes nesses casos. Se há indícios de alienação parental, manipulação ou ameaças envolvendo filhos, é fundamental documentar (mensagens, áudios, prints) e procurar a Defensoria Pública. O Conselho Tutelar também deve ser acionado quando houver criança ou adolescente em risco.</w:t>
+      </w:r>
+    </w:p>
+    <w:p>
+      <w:pPr>
+        <w:pStyle w:val="Ttulo1"/>
+        <w:rPr>
+          <w:rFonts w:asciiTheme="majorHAnsi" w:hAnsiTheme="majorHAnsi" w:cstheme="majorHAnsi"/>
+          <w:b w:val="0"/>
+          <w:sz w:val="22"/>
+          <w:szCs w:val="22"/>
+          <w:lang w:val="pt-BR"/>
+        </w:rPr>
+      </w:pPr>
+      <w:r>
+        <w:rPr>
+          <w:rFonts w:asciiTheme="majorHAnsi" w:hAnsiTheme="majorHAnsi" w:cstheme="majorHAnsi"/>
+          <w:b w:val="0"/>
+          <w:sz w:val="22"/>
+          <w:szCs w:val="22"/>
+          <w:lang w:val="pt-BR"/>
+        </w:rPr>
+        <w:t>PROCEDIMENTOS</w:t>
+      </w:r>
+    </w:p>
+    <w:p>
+      <w:pPr>
+        <w:pStyle w:val="Ttulo2"/>
+        <w:rPr>
+          <w:rFonts w:asciiTheme="majorHAnsi" w:hAnsiTheme="majorHAnsi" w:cstheme="majorHAnsi"/>
+          <w:b w:val="0"/>
+          <w:sz w:val="22"/>
+          <w:szCs w:val="22"/>
+          <w:lang w:val="pt-BR"/>
+        </w:rPr>
+      </w:pPr>
+      <w:r>
+        <w:rPr>
+          <w:rFonts w:asciiTheme="majorHAnsi" w:hAnsiTheme="majorHAnsi" w:cstheme="majorHAnsi"/>
+          <w:b w:val="0"/>
+          <w:sz w:val="22"/>
+          <w:szCs w:val="22"/>
+          <w:lang w:val="pt-BR"/>
+        </w:rPr>
+        <w:lastRenderedPageBreak/>
+        <w:t>Como pedir medida protetiva de urgência</w:t>
+      </w:r>
+    </w:p>
+    <w:p>
+      <w:pPr>
+        <w:spacing w:after="120"/>
+        <w:rPr>
+          <w:rFonts w:asciiTheme="majorHAnsi" w:hAnsiTheme="majorHAnsi" w:cstheme="majorHAnsi"/>
+          <w:lang w:val="pt-BR"/>
+        </w:rPr>
+      </w:pPr>
+      <w:r>
+        <w:rPr>
+          <w:rFonts w:asciiTheme="majorHAnsi" w:hAnsiTheme="majorHAnsi" w:cstheme="majorHAnsi"/>
+          <w:lang w:val="pt-BR"/>
+        </w:rPr>
+        <w:t>A medida protetiva de urgência é um instrumento previsto na Lei Maria da Penha (artigos 22 a 24) para proteger a mulher imediatamente, mesmo antes do processo criminal. Pode ser pedida na delegacia, na Defensoria Pública ou diretamente no Juizado de Violência Doméstica. Não precisa de advogado particular. O juiz deve decidir em até 48 horas. As medidas mais comuns são: afastamento do agressor do lar; proibição de aproximação da mulher, dos filhos e de familiares; proibição de contato por qualquer meio (telefone, mensagem, redes sociais, terceiros); suspensão de porte de arma; restrição ou suspensão de visitas aos filhos; prestação de alimentos provisórios. Não é necessário registrar boletim de ocorrência antes — a medida protetiva é autônoma.</w:t>
+      </w:r>
+    </w:p>
+    <w:p>
+      <w:pPr>
+        <w:pStyle w:val="Ttulo2"/>
+        <w:rPr>
+          <w:rFonts w:asciiTheme="majorHAnsi" w:hAnsiTheme="majorHAnsi" w:cstheme="majorHAnsi"/>
+          <w:b w:val="0"/>
+          <w:sz w:val="22"/>
+          <w:szCs w:val="22"/>
+          <w:lang w:val="pt-BR"/>
+        </w:rPr>
+      </w:pPr>
+      <w:r>
+        <w:rPr>
+          <w:rFonts w:asciiTheme="majorHAnsi" w:hAnsiTheme="majorHAnsi" w:cstheme="majorHAnsi"/>
+          <w:b w:val="0"/>
+          <w:sz w:val="22"/>
+          <w:szCs w:val="22"/>
+          <w:lang w:val="pt-BR"/>
+        </w:rPr>
+        <w:t>Documentos para pedir medida protetiva</w:t>
+      </w:r>
+    </w:p>
+    <w:p>
+      <w:pPr>
+        <w:spacing w:after="120"/>
+        <w:rPr>
+          <w:rFonts w:asciiTheme="majorHAnsi" w:hAnsiTheme="majorHAnsi" w:cstheme="majorHAnsi"/>
+          <w:lang w:val="pt-BR"/>
+        </w:rPr>
+      </w:pPr>
+      <w:r>
+        <w:rPr>
+          <w:rFonts w:asciiTheme="majorHAnsi" w:hAnsiTheme="majorHAnsi" w:cstheme="majorHAnsi"/>
+          <w:lang w:val="pt-BR"/>
+        </w:rPr>
+        <w:t>Para pedir medida protetiva, leve o que tiver disponível. Nada é absolutamente obrigatório, mas ajuda na análise do juiz:</w:t>
+      </w:r>
+    </w:p>
+    <w:p>
+      <w:pPr>
+        <w:spacing w:after="80"/>
+        <w:rPr>
+          <w:rFonts w:asciiTheme="majorHAnsi" w:hAnsiTheme="majorHAnsi" w:cstheme="majorHAnsi"/>
+          <w:lang w:val="pt-BR"/>
+        </w:rPr>
+      </w:pPr>
+      <w:r>
+        <w:rPr>
+          <w:rFonts w:asciiTheme="majorHAnsi" w:hAnsiTheme="majorHAnsi" w:cstheme="majorHAnsi"/>
+          <w:lang w:val="pt-BR"/>
+        </w:rPr>
+        <w:t>Documento de identidade (RG, CNH ou outro com foto).</w:t>
+      </w:r>
+    </w:p>
+    <w:p>
+      <w:pPr>
+        <w:spacing w:after="80"/>
+        <w:rPr>
+          <w:rFonts w:asciiTheme="majorHAnsi" w:hAnsiTheme="majorHAnsi" w:cstheme="majorHAnsi"/>
+          <w:lang w:val="pt-BR"/>
+        </w:rPr>
+      </w:pPr>
+      <w:r>
+        <w:rPr>
+          <w:rFonts w:asciiTheme="majorHAnsi" w:hAnsiTheme="majorHAnsi" w:cstheme="majorHAnsi"/>
+          <w:lang w:val="pt-BR"/>
+        </w:rPr>
+        <w:t>CPF.</w:t>
+      </w:r>
+    </w:p>
+    <w:p>
+      <w:pPr>
+        <w:spacing w:after="80"/>
+        <w:rPr>
+          <w:rFonts w:asciiTheme="majorHAnsi" w:hAnsiTheme="majorHAnsi" w:cstheme="majorHAnsi"/>
+          <w:lang w:val="pt-BR"/>
+        </w:rPr>
+      </w:pPr>
+      <w:r>
+        <w:rPr>
+          <w:rFonts w:asciiTheme="majorHAnsi" w:hAnsiTheme="majorHAnsi" w:cstheme="majorHAnsi"/>
+          <w:lang w:val="pt-BR"/>
+        </w:rPr>
+        <w:t>Comprovante de residência.</w:t>
+      </w:r>
+    </w:p>
+    <w:p>
+      <w:pPr>
+        <w:spacing w:after="80"/>
+        <w:rPr>
+          <w:rFonts w:asciiTheme="majorHAnsi" w:hAnsiTheme="majorHAnsi" w:cstheme="majorHAnsi"/>
+          <w:lang w:val="pt-BR"/>
+        </w:rPr>
+      </w:pPr>
+      <w:r>
+        <w:rPr>
+          <w:rFonts w:asciiTheme="majorHAnsi" w:hAnsiTheme="majorHAnsi" w:cstheme="majorHAnsi"/>
+          <w:lang w:val="pt-BR"/>
+        </w:rPr>
+        <w:t>Provas da violência: prints de mensagens, áudios, fotos de lesões, vídeos, e-mails.</w:t>
+      </w:r>
+    </w:p>
+    <w:p>
+      <w:pPr>
+        <w:spacing w:after="80"/>
+        <w:rPr>
+          <w:rFonts w:asciiTheme="majorHAnsi" w:hAnsiTheme="majorHAnsi" w:cstheme="majorHAnsi"/>
+          <w:lang w:val="pt-BR"/>
+        </w:rPr>
+      </w:pPr>
+      <w:r>
+        <w:rPr>
+          <w:rFonts w:asciiTheme="majorHAnsi" w:hAnsiTheme="majorHAnsi" w:cstheme="majorHAnsi"/>
+          <w:lang w:val="pt-BR"/>
+        </w:rPr>
+        <w:t>Boletim de ocorrência, se já tiver feito (não é obrigatório para pedir medida protetiva).</w:t>
+      </w:r>
+    </w:p>
+    <w:p>
+      <w:pPr>
+        <w:spacing w:after="80"/>
+        <w:rPr>
+          <w:rFonts w:asciiTheme="majorHAnsi" w:hAnsiTheme="majorHAnsi" w:cstheme="majorHAnsi"/>
+          <w:lang w:val="pt-BR"/>
+        </w:rPr>
+      </w:pPr>
+      <w:r>
+        <w:rPr>
+          <w:rFonts w:asciiTheme="majorHAnsi" w:hAnsiTheme="majorHAnsi" w:cstheme="majorHAnsi"/>
+          <w:lang w:val="pt-BR"/>
+        </w:rPr>
+        <w:t>Nomes e contatos de testemunhas, se houver.</w:t>
+      </w:r>
+    </w:p>
+    <w:p>
+      <w:pPr>
+        <w:spacing w:after="80"/>
+        <w:rPr>
+          <w:rFonts w:asciiTheme="majorHAnsi" w:hAnsiTheme="majorHAnsi" w:cstheme="majorHAnsi"/>
+          <w:lang w:val="pt-BR"/>
+        </w:rPr>
+      </w:pPr>
+      <w:r>
+        <w:rPr>
+          <w:rFonts w:asciiTheme="majorHAnsi" w:hAnsiTheme="majorHAnsi" w:cstheme="majorHAnsi"/>
+          <w:lang w:val="pt-BR"/>
+        </w:rPr>
+        <w:t>Documentos dos filhos, se a medida envolver convivência ou guarda.</w:t>
+      </w:r>
+    </w:p>
+    <w:p>
+      <w:pPr>
+        <w:pStyle w:val="Ttulo2"/>
+        <w:rPr>
+          <w:rFonts w:asciiTheme="majorHAnsi" w:hAnsiTheme="majorHAnsi" w:cstheme="majorHAnsi"/>
+          <w:b w:val="0"/>
+          <w:sz w:val="22"/>
+          <w:szCs w:val="22"/>
+          <w:lang w:val="pt-BR"/>
+        </w:rPr>
+      </w:pPr>
+      <w:r>
+        <w:rPr>
+          <w:rFonts w:asciiTheme="majorHAnsi" w:hAnsiTheme="majorHAnsi" w:cstheme="majorHAnsi"/>
+          <w:b w:val="0"/>
+          <w:sz w:val="22"/>
+          <w:szCs w:val="22"/>
+          <w:lang w:val="pt-BR"/>
+        </w:rPr>
+        <w:t>Como fazer boletim de ocorrência (BO) eletrônico no Ceará</w:t>
+      </w:r>
+    </w:p>
+    <w:p>
+      <w:pPr>
+        <w:spacing w:after="120"/>
+        <w:rPr>
+          <w:rFonts w:asciiTheme="majorHAnsi" w:hAnsiTheme="majorHAnsi" w:cstheme="majorHAnsi"/>
+          <w:lang w:val="pt-BR"/>
+        </w:rPr>
+      </w:pPr>
+      <w:r>
+        <w:rPr>
+          <w:rFonts w:asciiTheme="majorHAnsi" w:hAnsiTheme="majorHAnsi" w:cstheme="majorHAnsi"/>
+          <w:lang w:val="pt-BR"/>
+        </w:rPr>
+        <w:t>O Ceará oferece registro de boletim de ocorrência eletrônico pelo site da Polícia Civil. O BO eletrônico pode ser feito a qualquer hora, sem precisar ir à delegacia, e tem o mesmo valor jurídico do boletim presencial para a maioria dos casos. Acesse o portal da Polícia Civil do Ceará, escolha a natureza da ocorrência (violência doméstica, ameaça, lesão corporal, perseguição, dano patrimonial, descumprimento de medida protetiva), preencha os dados e relate detalhadamente o ocorrido. Ao final, você recebe o número do BO e cópia eletrônica. Para crimes de violência sexual ou casos com risco imediato, é recomendado ir presencialmente à delegacia ou ligar 190. O BO é um documento importante para pedir medida protetiva e abrir processo criminal.</w:t>
+      </w:r>
+    </w:p>
+    <w:p>
+      <w:pPr>
+        <w:pStyle w:val="Ttulo2"/>
+        <w:rPr>
+          <w:rFonts w:asciiTheme="majorHAnsi" w:hAnsiTheme="majorHAnsi" w:cstheme="majorHAnsi"/>
+          <w:b w:val="0"/>
+          <w:sz w:val="22"/>
+          <w:szCs w:val="22"/>
+          <w:lang w:val="pt-BR"/>
+        </w:rPr>
+      </w:pPr>
+      <w:r>
+        <w:rPr>
+          <w:rFonts w:asciiTheme="majorHAnsi" w:hAnsiTheme="majorHAnsi" w:cstheme="majorHAnsi"/>
+          <w:b w:val="0"/>
+          <w:sz w:val="22"/>
+          <w:szCs w:val="22"/>
+          <w:lang w:val="pt-BR"/>
+        </w:rPr>
+        <w:t>O que levar à Defensoria Pública</w:t>
+      </w:r>
+    </w:p>
+    <w:p>
+      <w:pPr>
+        <w:spacing w:after="120"/>
+        <w:rPr>
+          <w:rFonts w:asciiTheme="majorHAnsi" w:hAnsiTheme="majorHAnsi" w:cstheme="majorHAnsi"/>
+          <w:lang w:val="pt-BR"/>
+        </w:rPr>
+      </w:pPr>
+      <w:r>
+        <w:rPr>
+          <w:rFonts w:asciiTheme="majorHAnsi" w:hAnsiTheme="majorHAnsi" w:cstheme="majorHAnsi"/>
+          <w:lang w:val="pt-BR"/>
+        </w:rPr>
+        <w:t xml:space="preserve">Para o primeiro atendimento na Defensoria Pública de Horizonte, leve: documento de identidade com foto e CPF; comprovante de residência atualizado; comprovante de renda ou declaração de hipossuficiência (a Defensoria atende gratuitamente quem não pode pagar advogado); qualquer documento que comprove a situação de violência (BO, prints, fotos, mensagens, áudios); documentos dos filhos se a questão envolver guarda, pensão ou convivência; certidão de casamento ou união estável, se aplicável. Mesmo sem todos esses documentos, vá ao </w:t>
+      </w:r>
+      <w:r>
+        <w:rPr>
+          <w:rFonts w:asciiTheme="majorHAnsi" w:hAnsiTheme="majorHAnsi" w:cstheme="majorHAnsi"/>
+          <w:lang w:val="pt-BR"/>
+        </w:rPr>
+        <w:lastRenderedPageBreak/>
+        <w:t>atendimento — a Defensoria pode orientar como obter o que falta. O atendimento é gratuito e sigiloso.</w:t>
+      </w:r>
+    </w:p>
+    <w:p>
+      <w:pPr>
+        <w:pStyle w:val="Ttulo1"/>
+        <w:rPr>
+          <w:rFonts w:asciiTheme="majorHAnsi" w:hAnsiTheme="majorHAnsi" w:cstheme="majorHAnsi"/>
+          <w:b w:val="0"/>
+          <w:sz w:val="22"/>
+          <w:szCs w:val="22"/>
+          <w:lang w:val="pt-BR"/>
+        </w:rPr>
+      </w:pPr>
+      <w:r>
+        <w:rPr>
+          <w:rFonts w:asciiTheme="majorHAnsi" w:hAnsiTheme="majorHAnsi" w:cstheme="majorHAnsi"/>
+          <w:b w:val="0"/>
+          <w:sz w:val="22"/>
+          <w:szCs w:val="22"/>
+          <w:lang w:val="pt-BR"/>
+        </w:rPr>
+        <w:t>ACOLHIMENTO E SEGURANÇA</w:t>
+      </w:r>
+    </w:p>
+    <w:p>
+      <w:pPr>
+        <w:pStyle w:val="Ttulo2"/>
+        <w:rPr>
+          <w:rFonts w:asciiTheme="majorHAnsi" w:hAnsiTheme="majorHAnsi" w:cstheme="majorHAnsi"/>
+          <w:b w:val="0"/>
+          <w:sz w:val="22"/>
+          <w:szCs w:val="22"/>
+          <w:lang w:val="pt-BR"/>
+        </w:rPr>
+      </w:pPr>
+      <w:r>
+        <w:rPr>
+          <w:rFonts w:asciiTheme="majorHAnsi" w:hAnsiTheme="majorHAnsi" w:cstheme="majorHAnsi"/>
+          <w:b w:val="0"/>
+          <w:sz w:val="22"/>
+          <w:szCs w:val="22"/>
+          <w:lang w:val="pt-BR"/>
+        </w:rPr>
+        <w:t>Plano de segurança</w:t>
+      </w:r>
+    </w:p>
+    <w:p>
+      <w:pPr>
+        <w:spacing w:after="120"/>
+        <w:rPr>
+          <w:rFonts w:asciiTheme="majorHAnsi" w:hAnsiTheme="majorHAnsi" w:cstheme="majorHAnsi"/>
+          <w:lang w:val="pt-BR"/>
+        </w:rPr>
+      </w:pPr>
+      <w:r>
+        <w:rPr>
+          <w:rFonts w:asciiTheme="majorHAnsi" w:hAnsiTheme="majorHAnsi" w:cstheme="majorHAnsi"/>
+          <w:lang w:val="pt-BR"/>
+        </w:rPr>
+        <w:t xml:space="preserve">Quando há risco de violência ou a mulher considera sair de casa, um plano de segurança ajuda a reduzir perigos. Não é necessário sair agora — o plano serve para estar preparada caso precise sair rapidamente. </w:t>
+      </w:r>
+      <w:r>
+        <w:rPr>
+          <w:rFonts w:asciiTheme="majorHAnsi" w:hAnsiTheme="majorHAnsi" w:cstheme="majorHAnsi"/>
+          <w:lang w:val="pt-BR"/>
+        </w:rPr>
+        <w:t>Elementos importantes do plano:</w:t>
+      </w:r>
+    </w:p>
+    <w:p>
+      <w:pPr>
+        <w:spacing w:after="80"/>
+        <w:rPr>
+          <w:rFonts w:asciiTheme="majorHAnsi" w:hAnsiTheme="majorHAnsi" w:cstheme="majorHAnsi"/>
+          <w:lang w:val="pt-BR"/>
+        </w:rPr>
+      </w:pPr>
+      <w:r>
+        <w:rPr>
+          <w:rFonts w:asciiTheme="majorHAnsi" w:hAnsiTheme="majorHAnsi" w:cstheme="majorHAnsi"/>
+          <w:lang w:val="pt-BR"/>
+        </w:rPr>
+        <w:t>Identifique um lugar seguro para onde ir — casa de parente, amiga, ou abrigo público. Casa da Mulher Brasileira e abrigos sigilosos são opções para casos de risco alto.</w:t>
+      </w:r>
+    </w:p>
+    <w:p>
+      <w:pPr>
+        <w:spacing w:after="80"/>
+        <w:rPr>
+          <w:rFonts w:asciiTheme="majorHAnsi" w:hAnsiTheme="majorHAnsi" w:cstheme="majorHAnsi"/>
+          <w:lang w:val="pt-BR"/>
+        </w:rPr>
+      </w:pPr>
+      <w:r>
+        <w:rPr>
+          <w:rFonts w:asciiTheme="majorHAnsi" w:hAnsiTheme="majorHAnsi" w:cstheme="majorHAnsi"/>
+          <w:lang w:val="pt-BR"/>
+        </w:rPr>
+        <w:t>Tenha uma bolsa de emergência pronta, escondida em local de fácil acesso, com documentos (originais ou cópias), medicamentos, dinheiro, chaves extras, roupa para os filhos, carregador de celular.</w:t>
+      </w:r>
+    </w:p>
+    <w:p>
+      <w:pPr>
+        <w:spacing w:after="80"/>
+        <w:rPr>
+          <w:rFonts w:asciiTheme="majorHAnsi" w:hAnsiTheme="majorHAnsi" w:cstheme="majorHAnsi"/>
+          <w:lang w:val="pt-BR"/>
+        </w:rPr>
+      </w:pPr>
+      <w:r>
+        <w:rPr>
+          <w:rFonts w:asciiTheme="majorHAnsi" w:hAnsiTheme="majorHAnsi" w:cstheme="majorHAnsi"/>
+          <w:lang w:val="pt-BR"/>
+        </w:rPr>
+        <w:t>Memorize números importantes: 190 (Polícia Militar, emergência), 180 (Central de Atendimento à Mulher), 100 (Disque Direitos Humanos), e o telefone de uma pessoa de confiança.</w:t>
+      </w:r>
+    </w:p>
+    <w:p>
+      <w:pPr>
+        <w:spacing w:after="80"/>
+        <w:rPr>
+          <w:rFonts w:asciiTheme="majorHAnsi" w:hAnsiTheme="majorHAnsi" w:cstheme="majorHAnsi"/>
+          <w:lang w:val="pt-BR"/>
+        </w:rPr>
+      </w:pPr>
+      <w:r>
+        <w:rPr>
+          <w:rFonts w:asciiTheme="majorHAnsi" w:hAnsiTheme="majorHAnsi" w:cstheme="majorHAnsi"/>
+          <w:lang w:val="pt-BR"/>
+        </w:rPr>
+        <w:t>Combine uma palavra-código com pessoa de confiança que signifique "estou em perigo, chame ajuda".</w:t>
+      </w:r>
+    </w:p>
+    <w:p>
+      <w:pPr>
+        <w:spacing w:after="80"/>
+        <w:rPr>
+          <w:rFonts w:asciiTheme="majorHAnsi" w:hAnsiTheme="majorHAnsi" w:cstheme="majorHAnsi"/>
+          <w:lang w:val="pt-BR"/>
+        </w:rPr>
+      </w:pPr>
+      <w:r>
+        <w:rPr>
+          <w:rFonts w:asciiTheme="majorHAnsi" w:hAnsiTheme="majorHAnsi" w:cstheme="majorHAnsi"/>
+          <w:lang w:val="pt-BR"/>
+        </w:rPr>
+        <w:t>Se possível, fale com vizinhos de confiança e combine sinais para que possam chamar a polícia se ouvirem barulho.</w:t>
+      </w:r>
+    </w:p>
+    <w:p>
+      <w:pPr>
+        <w:spacing w:after="80"/>
+        <w:rPr>
+          <w:rFonts w:asciiTheme="majorHAnsi" w:hAnsiTheme="majorHAnsi" w:cstheme="majorHAnsi"/>
+          <w:lang w:val="pt-BR"/>
+        </w:rPr>
+      </w:pPr>
+      <w:r>
+        <w:rPr>
+          <w:rFonts w:asciiTheme="majorHAnsi" w:hAnsiTheme="majorHAnsi" w:cstheme="majorHAnsi"/>
+          <w:lang w:val="pt-BR"/>
+        </w:rPr>
+        <w:t>Planeje a rota de saída de casa — qual porta usar, onde estão as chaves do carro, qual ônibus passa mais perto.</w:t>
+      </w:r>
+    </w:p>
+    <w:p>
+      <w:pPr>
+        <w:pStyle w:val="Ttulo2"/>
+        <w:rPr>
+          <w:rFonts w:asciiTheme="majorHAnsi" w:hAnsiTheme="majorHAnsi" w:cstheme="majorHAnsi"/>
+          <w:b w:val="0"/>
+          <w:sz w:val="22"/>
+          <w:szCs w:val="22"/>
+          <w:lang w:val="pt-BR"/>
+        </w:rPr>
+      </w:pPr>
+      <w:r>
+        <w:rPr>
+          <w:rFonts w:asciiTheme="majorHAnsi" w:hAnsiTheme="majorHAnsi" w:cstheme="majorHAnsi"/>
+          <w:b w:val="0"/>
+          <w:sz w:val="22"/>
+          <w:szCs w:val="22"/>
+          <w:lang w:val="pt-BR"/>
+        </w:rPr>
+        <w:t>Segurança digital</w:t>
+      </w:r>
+    </w:p>
+    <w:p>
+      <w:pPr>
+        <w:spacing w:after="120"/>
+        <w:rPr>
+          <w:rFonts w:asciiTheme="majorHAnsi" w:hAnsiTheme="majorHAnsi" w:cstheme="majorHAnsi"/>
+          <w:lang w:val="pt-BR"/>
+        </w:rPr>
+      </w:pPr>
+      <w:r>
+        <w:rPr>
+          <w:rFonts w:asciiTheme="majorHAnsi" w:hAnsiTheme="majorHAnsi" w:cstheme="majorHAnsi"/>
+          <w:lang w:val="pt-BR"/>
+        </w:rPr>
+        <w:t xml:space="preserve">Em situações de violência, o celular e a internet podem ser usados para monitorar e controlar a mulher. </w:t>
+      </w:r>
+      <w:r>
+        <w:rPr>
+          <w:rFonts w:asciiTheme="majorHAnsi" w:hAnsiTheme="majorHAnsi" w:cstheme="majorHAnsi"/>
+          <w:lang w:val="pt-BR"/>
+        </w:rPr>
+        <w:t>Cuidados de segurança digital:</w:t>
+      </w:r>
+    </w:p>
+    <w:p>
+      <w:pPr>
+        <w:spacing w:after="80"/>
+        <w:rPr>
+          <w:rFonts w:asciiTheme="majorHAnsi" w:hAnsiTheme="majorHAnsi" w:cstheme="majorHAnsi"/>
+          <w:lang w:val="pt-BR"/>
+        </w:rPr>
+      </w:pPr>
+      <w:r>
+        <w:rPr>
+          <w:rFonts w:asciiTheme="majorHAnsi" w:hAnsiTheme="majorHAnsi" w:cstheme="majorHAnsi"/>
+          <w:lang w:val="pt-BR"/>
+        </w:rPr>
+        <w:t>Verifique se há aplicativos espiões instalados no celular sem seu conhecimento — sintomas: bateria descarregando rápido, celular esquentando à toa, consumo de dados alto. Em caso de dúvida, restaure o aparelho às configurações de fábrica.</w:t>
+      </w:r>
+    </w:p>
+    <w:p>
+      <w:pPr>
+        <w:spacing w:after="80"/>
+        <w:rPr>
+          <w:rFonts w:asciiTheme="majorHAnsi" w:hAnsiTheme="majorHAnsi" w:cstheme="majorHAnsi"/>
+          <w:lang w:val="pt-BR"/>
+        </w:rPr>
+      </w:pPr>
+      <w:r>
+        <w:rPr>
+          <w:rFonts w:asciiTheme="majorHAnsi" w:hAnsiTheme="majorHAnsi" w:cstheme="majorHAnsi"/>
+          <w:lang w:val="pt-BR"/>
+        </w:rPr>
+        <w:t>Mude senhas de e-mail, redes sociais e aplicativos bancários a partir de um aparelho que o agressor não tenha acesso (computador da biblioteca pública, celular de pessoa de confiança).</w:t>
+      </w:r>
+    </w:p>
+    <w:p>
+      <w:pPr>
+        <w:spacing w:after="80"/>
+        <w:rPr>
+          <w:rFonts w:asciiTheme="majorHAnsi" w:hAnsiTheme="majorHAnsi" w:cstheme="majorHAnsi"/>
+          <w:lang w:val="pt-BR"/>
+        </w:rPr>
+      </w:pPr>
+      <w:r>
+        <w:rPr>
+          <w:rFonts w:asciiTheme="majorHAnsi" w:hAnsiTheme="majorHAnsi" w:cstheme="majorHAnsi"/>
+          <w:lang w:val="pt-BR"/>
+        </w:rPr>
+        <w:t>Ative verificação em duas etapas em todas as contas importantes.</w:t>
+      </w:r>
+    </w:p>
+    <w:p>
+      <w:pPr>
+        <w:spacing w:after="80"/>
+        <w:rPr>
+          <w:rFonts w:asciiTheme="majorHAnsi" w:hAnsiTheme="majorHAnsi" w:cstheme="majorHAnsi"/>
+          <w:lang w:val="pt-BR"/>
+        </w:rPr>
+      </w:pPr>
+      <w:r>
+        <w:rPr>
+          <w:rFonts w:asciiTheme="majorHAnsi" w:hAnsiTheme="majorHAnsi" w:cstheme="majorHAnsi"/>
+          <w:lang w:val="pt-BR"/>
+        </w:rPr>
+        <w:t xml:space="preserve">Desative compartilhamento de localização em aplicativos como WhatsApp, Instagram, Google Maps e </w:t>
+      </w:r>
+      <w:proofErr w:type="spellStart"/>
+      <w:r>
+        <w:rPr>
+          <w:rFonts w:asciiTheme="majorHAnsi" w:hAnsiTheme="majorHAnsi" w:cstheme="majorHAnsi"/>
+          <w:lang w:val="pt-BR"/>
+        </w:rPr>
+        <w:t>Find</w:t>
+      </w:r>
+      <w:proofErr w:type="spellEnd"/>
+      <w:r>
+        <w:rPr>
+          <w:rFonts w:asciiTheme="majorHAnsi" w:hAnsiTheme="majorHAnsi" w:cstheme="majorHAnsi"/>
+          <w:lang w:val="pt-BR"/>
+        </w:rPr>
+        <w:t xml:space="preserve"> </w:t>
+      </w:r>
+      <w:proofErr w:type="spellStart"/>
+      <w:r>
+        <w:rPr>
+          <w:rFonts w:asciiTheme="majorHAnsi" w:hAnsiTheme="majorHAnsi" w:cstheme="majorHAnsi"/>
+          <w:lang w:val="pt-BR"/>
+        </w:rPr>
+        <w:t>My</w:t>
+      </w:r>
+      <w:proofErr w:type="spellEnd"/>
+      <w:r>
+        <w:rPr>
+          <w:rFonts w:asciiTheme="majorHAnsi" w:hAnsiTheme="majorHAnsi" w:cstheme="majorHAnsi"/>
+          <w:lang w:val="pt-BR"/>
+        </w:rPr>
+        <w:t xml:space="preserve"> iPhone, se o agressor tem acesso aos seus dispositivos.</w:t>
+      </w:r>
+    </w:p>
+    <w:p>
+      <w:pPr>
+        <w:spacing w:after="80"/>
+        <w:rPr>
+          <w:rFonts w:asciiTheme="majorHAnsi" w:hAnsiTheme="majorHAnsi" w:cstheme="majorHAnsi"/>
+          <w:lang w:val="pt-BR"/>
+        </w:rPr>
+      </w:pPr>
+      <w:r>
+        <w:rPr>
+          <w:rFonts w:asciiTheme="majorHAnsi" w:hAnsiTheme="majorHAnsi" w:cstheme="majorHAnsi"/>
+          <w:lang w:val="pt-BR"/>
+        </w:rPr>
+        <w:t>Saia de contas conectadas em dispositivos do agressor — Netflix, e-mail, redes sociais para impedir monitoramento.</w:t>
+      </w:r>
+    </w:p>
+    <w:p>
+      <w:pPr>
+        <w:spacing w:after="80"/>
+        <w:rPr>
+          <w:rFonts w:asciiTheme="majorHAnsi" w:hAnsiTheme="majorHAnsi" w:cstheme="majorHAnsi"/>
+          <w:lang w:val="pt-BR"/>
+        </w:rPr>
+      </w:pPr>
+      <w:r>
+        <w:rPr>
+          <w:rFonts w:asciiTheme="majorHAnsi" w:hAnsiTheme="majorHAnsi" w:cstheme="majorHAnsi"/>
+          <w:lang w:val="pt-BR"/>
+        </w:rPr>
+        <w:t>Apague conversas sensíveis (com a Bruna, com a Defensoria, com pessoas de confiança) se o agressor revisa seu celular. Use o modo apagar e o aplicativo em modo discreto.</w:t>
+      </w:r>
+    </w:p>
+    <w:p>
+      <w:pPr>
+        <w:spacing w:after="80"/>
+        <w:rPr>
+          <w:rFonts w:asciiTheme="majorHAnsi" w:hAnsiTheme="majorHAnsi" w:cstheme="majorHAnsi"/>
+          <w:lang w:val="pt-BR"/>
+        </w:rPr>
+      </w:pPr>
+      <w:r>
+        <w:rPr>
+          <w:rFonts w:asciiTheme="majorHAnsi" w:hAnsiTheme="majorHAnsi" w:cstheme="majorHAnsi"/>
+          <w:lang w:val="pt-BR"/>
+        </w:rPr>
+        <w:lastRenderedPageBreak/>
+        <w:t>Se possível, tenha um celular antigo simples como backup, com chip diferente, escondido do agressor.</w:t>
+      </w:r>
+    </w:p>
+    <w:p>
+      <w:pPr>
+        <w:pStyle w:val="Ttulo2"/>
+        <w:rPr>
+          <w:rFonts w:asciiTheme="majorHAnsi" w:hAnsiTheme="majorHAnsi" w:cstheme="majorHAnsi"/>
+          <w:b w:val="0"/>
+          <w:sz w:val="22"/>
+          <w:szCs w:val="22"/>
+          <w:lang w:val="pt-BR"/>
+        </w:rPr>
+      </w:pPr>
+      <w:r>
+        <w:rPr>
+          <w:rFonts w:asciiTheme="majorHAnsi" w:hAnsiTheme="majorHAnsi" w:cstheme="majorHAnsi"/>
+          <w:b w:val="0"/>
+          <w:sz w:val="22"/>
+          <w:szCs w:val="22"/>
+          <w:lang w:val="pt-BR"/>
+        </w:rPr>
+        <w:t>Quando há risco imediato</w:t>
+      </w:r>
+    </w:p>
+    <w:p>
+      <w:pPr>
+        <w:spacing w:after="120"/>
+        <w:rPr>
+          <w:rFonts w:asciiTheme="majorHAnsi" w:hAnsiTheme="majorHAnsi" w:cstheme="majorHAnsi"/>
+          <w:lang w:val="pt-BR"/>
+        </w:rPr>
+      </w:pPr>
+      <w:r>
+        <w:rPr>
+          <w:rFonts w:asciiTheme="majorHAnsi" w:hAnsiTheme="majorHAnsi" w:cstheme="majorHAnsi"/>
+          <w:lang w:val="pt-BR"/>
+        </w:rPr>
+        <w:t xml:space="preserve">Risco imediato é quando há perigo agora — agressor está em casa, armado, agressivo, ameaçando matar, ou já agredindo. </w:t>
+      </w:r>
+      <w:r>
+        <w:rPr>
+          <w:rFonts w:asciiTheme="majorHAnsi" w:hAnsiTheme="majorHAnsi" w:cstheme="majorHAnsi"/>
+          <w:lang w:val="pt-BR"/>
+        </w:rPr>
+        <w:t>Nesses casos:</w:t>
+      </w:r>
+    </w:p>
+    <w:p>
+      <w:pPr>
+        <w:spacing w:after="80"/>
+        <w:rPr>
+          <w:rFonts w:asciiTheme="majorHAnsi" w:hAnsiTheme="majorHAnsi" w:cstheme="majorHAnsi"/>
+          <w:lang w:val="pt-BR"/>
+        </w:rPr>
+      </w:pPr>
+      <w:r>
+        <w:rPr>
+          <w:rFonts w:asciiTheme="majorHAnsi" w:hAnsiTheme="majorHAnsi" w:cstheme="majorHAnsi"/>
+          <w:lang w:val="pt-BR"/>
+        </w:rPr>
+        <w:t>Ligue 190 (Polícia Militar). É emergência, atendimento 24 horas, gratuito de qualquer telefone.</w:t>
+      </w:r>
+    </w:p>
+    <w:p>
+      <w:pPr>
+        <w:spacing w:after="80"/>
+        <w:rPr>
+          <w:rFonts w:asciiTheme="majorHAnsi" w:hAnsiTheme="majorHAnsi" w:cstheme="majorHAnsi"/>
+          <w:lang w:val="pt-BR"/>
+        </w:rPr>
+      </w:pPr>
+      <w:r>
+        <w:rPr>
+          <w:rFonts w:asciiTheme="majorHAnsi" w:hAnsiTheme="majorHAnsi" w:cstheme="majorHAnsi"/>
+          <w:lang w:val="pt-BR"/>
+        </w:rPr>
+        <w:t>Se não puder falar, mande mensagem de texto para 190 (em muitas cidades do Ceará isso já funciona) ou para pessoa de confiança que possa ligar por você.</w:t>
+      </w:r>
+    </w:p>
+    <w:p>
+      <w:pPr>
+        <w:spacing w:after="80"/>
+        <w:rPr>
+          <w:rFonts w:asciiTheme="majorHAnsi" w:hAnsiTheme="majorHAnsi" w:cstheme="majorHAnsi"/>
+          <w:lang w:val="pt-BR"/>
+        </w:rPr>
+      </w:pPr>
+      <w:r>
+        <w:rPr>
+          <w:rFonts w:asciiTheme="majorHAnsi" w:hAnsiTheme="majorHAnsi" w:cstheme="majorHAnsi"/>
+          <w:lang w:val="pt-BR"/>
+        </w:rPr>
+        <w:t>Se conseguir, saia de casa imediatamente e vá para um lugar público — vizinho, padaria, farmácia, posto de gasolina, qualquer lugar com outras pessoas.</w:t>
+      </w:r>
+    </w:p>
+    <w:p>
+      <w:pPr>
+        <w:spacing w:after="80"/>
+        <w:rPr>
+          <w:rFonts w:asciiTheme="majorHAnsi" w:hAnsiTheme="majorHAnsi" w:cstheme="majorHAnsi"/>
+          <w:lang w:val="pt-BR"/>
+        </w:rPr>
+      </w:pPr>
+      <w:r>
+        <w:rPr>
+          <w:rFonts w:asciiTheme="majorHAnsi" w:hAnsiTheme="majorHAnsi" w:cstheme="majorHAnsi"/>
+          <w:lang w:val="pt-BR"/>
+        </w:rPr>
+        <w:t>Se não puder sair, tranque-se em um cômodo com porta sólida, leve o celular, e ligue 190.</w:t>
+      </w:r>
+    </w:p>
+    <w:p>
+      <w:pPr>
+        <w:spacing w:after="80"/>
+        <w:rPr>
+          <w:rFonts w:asciiTheme="majorHAnsi" w:hAnsiTheme="majorHAnsi" w:cstheme="majorHAnsi"/>
+          <w:lang w:val="pt-BR"/>
+        </w:rPr>
+      </w:pPr>
+      <w:r>
+        <w:rPr>
+          <w:rFonts w:asciiTheme="majorHAnsi" w:hAnsiTheme="majorHAnsi" w:cstheme="majorHAnsi"/>
+          <w:lang w:val="pt-BR"/>
+        </w:rPr>
+        <w:t>Não tente raciocinar com o agressor armado ou bêbado — apenas ganhe tempo até a polícia chegar.</w:t>
+      </w:r>
+    </w:p>
+    <w:p>
+      <w:pPr>
+        <w:spacing w:after="80"/>
+        <w:rPr>
+          <w:rFonts w:asciiTheme="majorHAnsi" w:hAnsiTheme="majorHAnsi" w:cstheme="majorHAnsi"/>
+          <w:lang w:val="pt-BR"/>
+        </w:rPr>
+      </w:pPr>
+      <w:r>
+        <w:rPr>
+          <w:rFonts w:asciiTheme="majorHAnsi" w:hAnsiTheme="majorHAnsi" w:cstheme="majorHAnsi"/>
+          <w:lang w:val="pt-BR"/>
+        </w:rPr>
+        <w:t>Depois que a polícia chegar e a situação imediata estiver controlada, peça medida protetiva no mesmo dia — pode ser feita na delegacia para onde a polícia te levar.</w:t>
+      </w:r>
+    </w:p>
+    <w:p>
+      <w:pPr>
+        <w:pStyle w:val="Ttulo2"/>
+        <w:rPr>
+          <w:rFonts w:asciiTheme="majorHAnsi" w:hAnsiTheme="majorHAnsi" w:cstheme="majorHAnsi"/>
+          <w:b w:val="0"/>
+          <w:sz w:val="22"/>
+          <w:szCs w:val="22"/>
+          <w:lang w:val="pt-BR"/>
+        </w:rPr>
+      </w:pPr>
+      <w:r>
+        <w:rPr>
+          <w:rFonts w:asciiTheme="majorHAnsi" w:hAnsiTheme="majorHAnsi" w:cstheme="majorHAnsi"/>
+          <w:b w:val="0"/>
+          <w:sz w:val="22"/>
+          <w:szCs w:val="22"/>
+          <w:lang w:val="pt-BR"/>
+        </w:rPr>
+        <w:t>Acolhimento emocional</w:t>
+      </w:r>
+    </w:p>
+    <w:p>
+      <w:pPr>
+        <w:spacing w:after="120"/>
+        <w:rPr>
+          <w:rFonts w:asciiTheme="majorHAnsi" w:hAnsiTheme="majorHAnsi" w:cstheme="majorHAnsi"/>
+          <w:lang w:val="pt-BR"/>
+        </w:rPr>
+      </w:pPr>
+      <w:r>
+        <w:rPr>
+          <w:rFonts w:asciiTheme="majorHAnsi" w:hAnsiTheme="majorHAnsi" w:cstheme="majorHAnsi"/>
+          <w:lang w:val="pt-BR"/>
+        </w:rPr>
+        <w:t>Sair de uma situação de violência é um processo, não um momento único. Muitas mulheres tentam várias vezes antes de conseguir romper definitivamente — isso não é fracasso, é parte do caminho. Sentir medo, culpa, vergonha, dúvida, e até saudade do agressor é comum e não significa que você esteja errada. A violência doméstica afeta a autoestima, a clareza de pensamento e a capacidade de planejar — e isso é efeito da violência, não falha sua. Buscar apoio de outras mulheres que passaram por situações parecidas, grupos de acolhimento, e atendimento psicológico (gratuito pelo SUS ou em CRAS e CREAS) faz diferença real. Você não precisa decidir tudo agora. Você não precisa denunciar agora. Conversar e entender suas opções já é um passo importante.</w:t>
+      </w:r>
+    </w:p>
+    <w:p>
+      <w:pPr>
+        <w:pStyle w:val="Ttulo2"/>
+        <w:rPr>
+          <w:rFonts w:asciiTheme="majorHAnsi" w:hAnsiTheme="majorHAnsi" w:cstheme="majorHAnsi"/>
+          <w:b w:val="0"/>
+          <w:sz w:val="22"/>
+          <w:szCs w:val="22"/>
+          <w:lang w:val="pt-BR"/>
+        </w:rPr>
+      </w:pPr>
+      <w:r>
+        <w:rPr>
+          <w:rFonts w:asciiTheme="majorHAnsi" w:hAnsiTheme="majorHAnsi" w:cstheme="majorHAnsi"/>
+          <w:b w:val="0"/>
+          <w:sz w:val="22"/>
+          <w:szCs w:val="22"/>
+          <w:lang w:val="pt-BR"/>
+        </w:rPr>
+        <w:t xml:space="preserve">Acolhimento específico para mulheres </w:t>
+      </w:r>
+      <w:proofErr w:type="spellStart"/>
+      <w:r>
+        <w:rPr>
+          <w:rFonts w:asciiTheme="majorHAnsi" w:hAnsiTheme="majorHAnsi" w:cstheme="majorHAnsi"/>
+          <w:b w:val="0"/>
+          <w:sz w:val="22"/>
+          <w:szCs w:val="22"/>
+          <w:lang w:val="pt-BR"/>
+        </w:rPr>
+        <w:t>trans</w:t>
+      </w:r>
+      <w:proofErr w:type="spellEnd"/>
+    </w:p>
+    <w:p>
+      <w:pPr>
+        <w:spacing w:after="120"/>
+        <w:rPr>
+          <w:rFonts w:asciiTheme="majorHAnsi" w:hAnsiTheme="majorHAnsi" w:cstheme="majorHAnsi"/>
+          <w:lang w:val="pt-BR"/>
+        </w:rPr>
+      </w:pPr>
+      <w:r>
+        <w:rPr>
+          <w:rFonts w:asciiTheme="majorHAnsi" w:hAnsiTheme="majorHAnsi" w:cstheme="majorHAnsi"/>
+          <w:lang w:val="pt-BR"/>
+        </w:rPr>
+        <w:t xml:space="preserve">Mulheres </w:t>
+      </w:r>
+      <w:proofErr w:type="spellStart"/>
+      <w:r>
+        <w:rPr>
+          <w:rFonts w:asciiTheme="majorHAnsi" w:hAnsiTheme="majorHAnsi" w:cstheme="majorHAnsi"/>
+          <w:lang w:val="pt-BR"/>
+        </w:rPr>
+        <w:t>trans</w:t>
+      </w:r>
+      <w:proofErr w:type="spellEnd"/>
+      <w:r>
+        <w:rPr>
+          <w:rFonts w:asciiTheme="majorHAnsi" w:hAnsiTheme="majorHAnsi" w:cstheme="majorHAnsi"/>
+          <w:lang w:val="pt-BR"/>
+        </w:rPr>
+        <w:t xml:space="preserve">, travestis e mulheres transexuais enfrentam camadas adicionais de violência e barreiras específicas para buscar ajuda. Há receio frequente de não ser reconhecida como mulher na delegacia, de ter o nome social desrespeitado, de ser exposta como pessoa </w:t>
+      </w:r>
+      <w:proofErr w:type="spellStart"/>
+      <w:r>
+        <w:rPr>
+          <w:rFonts w:asciiTheme="majorHAnsi" w:hAnsiTheme="majorHAnsi" w:cstheme="majorHAnsi"/>
+          <w:lang w:val="pt-BR"/>
+        </w:rPr>
+        <w:t>trans</w:t>
+      </w:r>
+      <w:proofErr w:type="spellEnd"/>
+      <w:r>
+        <w:rPr>
+          <w:rFonts w:asciiTheme="majorHAnsi" w:hAnsiTheme="majorHAnsi" w:cstheme="majorHAnsi"/>
+          <w:lang w:val="pt-BR"/>
+        </w:rPr>
+        <w:t xml:space="preserve"> (</w:t>
+      </w:r>
+      <w:proofErr w:type="spellStart"/>
+      <w:r>
+        <w:rPr>
+          <w:rFonts w:asciiTheme="majorHAnsi" w:hAnsiTheme="majorHAnsi" w:cstheme="majorHAnsi"/>
+          <w:lang w:val="pt-BR"/>
+        </w:rPr>
+        <w:t>outing</w:t>
+      </w:r>
+      <w:proofErr w:type="spellEnd"/>
+      <w:r>
+        <w:rPr>
+          <w:rFonts w:asciiTheme="majorHAnsi" w:hAnsiTheme="majorHAnsi" w:cstheme="majorHAnsi"/>
+          <w:lang w:val="pt-BR"/>
+        </w:rPr>
+        <w:t xml:space="preserve"> forçado), ou de não ser levada a sério em casos de violência doméstica. Esses receios são legítimos, mas o cenário tem mudado: o STJ firmou que a Lei Maria da Penha se aplica a mulheres </w:t>
+      </w:r>
+      <w:proofErr w:type="spellStart"/>
+      <w:r>
+        <w:rPr>
+          <w:rFonts w:asciiTheme="majorHAnsi" w:hAnsiTheme="majorHAnsi" w:cstheme="majorHAnsi"/>
+          <w:lang w:val="pt-BR"/>
+        </w:rPr>
+        <w:t>trans</w:t>
+      </w:r>
+      <w:proofErr w:type="spellEnd"/>
+      <w:r>
+        <w:rPr>
+          <w:rFonts w:asciiTheme="majorHAnsi" w:hAnsiTheme="majorHAnsi" w:cstheme="majorHAnsi"/>
+          <w:lang w:val="pt-BR"/>
+        </w:rPr>
+        <w:t xml:space="preserve"> (</w:t>
+      </w:r>
+      <w:proofErr w:type="spellStart"/>
+      <w:r>
+        <w:rPr>
+          <w:rFonts w:asciiTheme="majorHAnsi" w:hAnsiTheme="majorHAnsi" w:cstheme="majorHAnsi"/>
+          <w:lang w:val="pt-BR"/>
+        </w:rPr>
+        <w:t>REsp</w:t>
+      </w:r>
+      <w:proofErr w:type="spellEnd"/>
+      <w:r>
+        <w:rPr>
+          <w:rFonts w:asciiTheme="majorHAnsi" w:hAnsiTheme="majorHAnsi" w:cstheme="majorHAnsi"/>
+          <w:lang w:val="pt-BR"/>
+        </w:rPr>
+        <w:t xml:space="preserve"> 1.977.124), o Decreto 8.727/2016 garante o nome social no atendimento público, e a ADO 26 do STF criminaliza a transfobia. A Defensoria Pública de Horizonte tem dever de atender com respeito à identidade de gênero. Em caso de desrespeito, é possível registrar reclamação na Ouvidoria da Defensoria. Para suporte específico, o Disque 100 atende violações de direitos humanos contra a população LGBTQIA+, e organizações como ANTRA (Associação Nacional de Travestis e Transexuais) oferecem orientação e rede de apoio.</w:t>
+      </w:r>
+    </w:p>
+    <w:p>
+      <w:pPr>
+        <w:spacing w:after="120"/>
+        <w:rPr>
+          <w:rFonts w:asciiTheme="majorHAnsi" w:hAnsiTheme="majorHAnsi" w:cstheme="majorHAnsi"/>
+          <w:lang w:val="pt-BR"/>
+        </w:rPr>
+      </w:pPr>
     </w:p>
     <w:p>
       <w:pPr>
@@ -4677,6 +7077,60 @@
     </w:lvl>
   </w:abstractNum>
   <w:abstractNum w:abstractNumId="5" w15:restartNumberingAfterBreak="0">
+    <w:nsid w:val="71B460FC"/>
+    <w:multiLevelType w:val="hybridMultilevel"/>
+    <w:tmpl w:val="BC2C87D4"/>
+    <w:lvl w:ilvl="0" w:tplc="713222EA">
+      <w:start w:val="1"/>
+      <w:numFmt w:val="bullet"/>
+      <w:lvlText w:val="•"/>
+      <w:lvlJc w:val="left"/>
+      <w:pPr>
+        <w:ind w:left="720" w:hanging="360"/>
+      </w:pPr>
+    </w:lvl>
+    <w:lvl w:ilvl="1" w:tplc="AE7C4BAC">
+      <w:numFmt w:val="decimal"/>
+      <w:lvlText w:val=""/>
+      <w:lvlJc w:val="left"/>
+    </w:lvl>
+    <w:lvl w:ilvl="2" w:tplc="8AC8ABD0">
+      <w:numFmt w:val="decimal"/>
+      <w:lvlText w:val=""/>
+      <w:lvlJc w:val="left"/>
+    </w:lvl>
+    <w:lvl w:ilvl="3" w:tplc="C5B40A16">
+      <w:numFmt w:val="decimal"/>
+      <w:lvlText w:val=""/>
+      <w:lvlJc w:val="left"/>
+    </w:lvl>
+    <w:lvl w:ilvl="4" w:tplc="64487452">
+      <w:numFmt w:val="decimal"/>
+      <w:lvlText w:val=""/>
+      <w:lvlJc w:val="left"/>
+    </w:lvl>
+    <w:lvl w:ilvl="5" w:tplc="0C88254E">
+      <w:numFmt w:val="decimal"/>
+      <w:lvlText w:val=""/>
+      <w:lvlJc w:val="left"/>
+    </w:lvl>
+    <w:lvl w:ilvl="6" w:tplc="7EAAB7EC">
+      <w:numFmt w:val="decimal"/>
+      <w:lvlText w:val=""/>
+      <w:lvlJc w:val="left"/>
+    </w:lvl>
+    <w:lvl w:ilvl="7" w:tplc="8DBCF110">
+      <w:numFmt w:val="decimal"/>
+      <w:lvlText w:val=""/>
+      <w:lvlJc w:val="left"/>
+    </w:lvl>
+    <w:lvl w:ilvl="8" w:tplc="B65C6B90">
+      <w:numFmt w:val="decimal"/>
+      <w:lvlText w:val=""/>
+      <w:lvlJc w:val="left"/>
+    </w:lvl>
+  </w:abstractNum>
+  <w:abstractNum w:abstractNumId="6" w15:restartNumberingAfterBreak="0">
     <w:nsid w:val="72D114DA"/>
     <w:multiLevelType w:val="multilevel"/>
     <w:tmpl w:val="3DB2658E"/>
@@ -4790,7 +7244,7 @@
     </w:lvl>
   </w:abstractNum>
   <w:num w:numId="1">
-    <w:abstractNumId w:val="5"/>
+    <w:abstractNumId w:val="6"/>
   </w:num>
   <w:num w:numId="2">
     <w:abstractNumId w:val="1"/>
@@ -4806,15 +7260,12 @@
   </w:num>
   <w:num w:numId="6">
     <w:abstractNumId w:val="3"/>
-    <w:lvlOverride w:ilvl="0"/>
-    <w:lvlOverride w:ilvl="1"/>
-    <w:lvlOverride w:ilvl="2"/>
-    <w:lvlOverride w:ilvl="3"/>
-    <w:lvlOverride w:ilvl="4"/>
-    <w:lvlOverride w:ilvl="5"/>
-    <w:lvlOverride w:ilvl="6"/>
-    <w:lvlOverride w:ilvl="7"/>
-    <w:lvlOverride w:ilvl="8"/>
+  </w:num>
+  <w:num w:numId="7">
+    <w:abstractNumId w:val="5"/>
+    <w:lvlOverride w:ilvl="0">
+      <w:startOverride w:val="1"/>
+    </w:lvlOverride>
   </w:num>
 </w:numbering>
 </file>
@@ -5421,6 +7872,39 @@
       <w:lang w:eastAsia="es-ES"/>
     </w:rPr>
   </w:style>
+  <w:style w:type="paragraph" w:styleId="Ttulo">
+    <w:name w:val="Title"/>
+    <w:link w:val="TtuloChar"/>
+    <w:uiPriority w:val="10"/>
+    <w:qFormat/>
+    <w:rsid w:val="008712CE"/>
+    <w:pPr>
+      <w:spacing w:before="240" w:after="240" w:line="240" w:lineRule="auto"/>
+    </w:pPr>
+    <w:rPr>
+      <w:rFonts w:ascii="Arial" w:eastAsia="Arial" w:hAnsi="Arial" w:cs="Arial"/>
+      <w:b/>
+      <w:bCs/>
+      <w:sz w:val="40"/>
+      <w:szCs w:val="40"/>
+      <w:lang w:eastAsia="es-ES"/>
+    </w:rPr>
+  </w:style>
+  <w:style w:type="character" w:customStyle="1" w:styleId="TtuloChar">
+    <w:name w:val="Título Char"/>
+    <w:basedOn w:val="Fontepargpadro"/>
+    <w:link w:val="Ttulo"/>
+    <w:uiPriority w:val="10"/>
+    <w:rsid w:val="008712CE"/>
+    <w:rPr>
+      <w:rFonts w:ascii="Arial" w:eastAsia="Arial" w:hAnsi="Arial" w:cs="Arial"/>
+      <w:b/>
+      <w:bCs/>
+      <w:sz w:val="40"/>
+      <w:szCs w:val="40"/>
+      <w:lang w:eastAsia="es-ES"/>
+    </w:rPr>
+  </w:style>
 </w:styles>
 </file>
 
@@ -5717,4 +8201,16 @@
     </a:ext>
   </a:extLst>
 </a:theme>
+</file>
+
+<file path=customXml/item1.xml><?xml version="1.0" encoding="utf-8"?>
+<b:Sources xmlns:b="http://schemas.openxmlformats.org/officeDocument/2006/bibliography" xmlns="http://schemas.openxmlformats.org/officeDocument/2006/bibliography" SelectedStyle="\APASixthEditionOfficeOnline.xsl" StyleName="APA" Version="6"/>
+</file>
+
+<file path=customXml/itemProps1.xml><?xml version="1.0" encoding="utf-8"?>
+<ds:datastoreItem xmlns:ds="http://schemas.openxmlformats.org/officeDocument/2006/customXml" ds:itemID="{E475F3B7-E670-4135-9938-72CCBF73913B}">
+  <ds:schemaRefs>
+    <ds:schemaRef ds:uri="http://schemas.openxmlformats.org/officeDocument/2006/bibliography"/>
+  </ds:schemaRefs>
+</ds:datastoreItem>
 </file>
</xml_diff>